<commit_message>
fix: update daily inspection template fields for better clarity and consistency
</commit_message>
<xml_diff>
--- a/storage/app/templates/Qalab-daily-inspection.docx
+++ b/storage/app/templates/Qalab-daily-inspection.docx
@@ -17,18 +17,18 @@
         <w:tblLook w:val="0000" w:firstRow="0" w:lastRow="0" w:firstColumn="0" w:lastColumn="0" w:noHBand="0" w:noVBand="0"/>
       </w:tblPr>
       <w:tblGrid>
-        <w:gridCol w:w="941"/>
-        <w:gridCol w:w="914"/>
-        <w:gridCol w:w="967"/>
-        <w:gridCol w:w="1005"/>
-        <w:gridCol w:w="825"/>
-        <w:gridCol w:w="964"/>
-        <w:gridCol w:w="1137"/>
-        <w:gridCol w:w="156"/>
-        <w:gridCol w:w="1140"/>
-        <w:gridCol w:w="241"/>
-        <w:gridCol w:w="883"/>
-        <w:gridCol w:w="1863"/>
+        <w:gridCol w:w="862"/>
+        <w:gridCol w:w="863"/>
+        <w:gridCol w:w="894"/>
+        <w:gridCol w:w="970"/>
+        <w:gridCol w:w="793"/>
+        <w:gridCol w:w="939"/>
+        <w:gridCol w:w="1122"/>
+        <w:gridCol w:w="144"/>
+        <w:gridCol w:w="1094"/>
+        <w:gridCol w:w="228"/>
+        <w:gridCol w:w="770"/>
+        <w:gridCol w:w="2357"/>
       </w:tblGrid>
       <w:tr>
         <w:trPr>
@@ -838,18 +838,38 @@
               <w:rPr>
                 <w:b/>
                 <w:bCs/>
-                <w:sz w:val="20"/>
-                <w:szCs w:val="20"/>
-              </w:rPr>
-            </w:pPr>
-            <w:r>
-              <w:rPr>
-                <w:b/>
-                <w:bCs/>
-                <w:sz w:val="20"/>
-                <w:szCs w:val="20"/>
-              </w:rPr>
-              <w:t>${equipment_code}</w:t>
+                <w:sz w:val="26"/>
+                <w:szCs w:val="26"/>
+              </w:rPr>
+            </w:pPr>
+            <w:r>
+              <w:rPr>
+                <w:b/>
+                <w:bCs/>
+                <w:sz w:val="26"/>
+                <w:szCs w:val="26"/>
+              </w:rPr>
+              <w:t>${</w:t>
+            </w:r>
+            <w:proofErr w:type="spellStart"/>
+            <w:r>
+              <w:rPr>
+                <w:b/>
+                <w:bCs/>
+                <w:sz w:val="26"/>
+                <w:szCs w:val="26"/>
+              </w:rPr>
+              <w:t>equipment_code</w:t>
+            </w:r>
+            <w:proofErr w:type="spellEnd"/>
+            <w:r>
+              <w:rPr>
+                <w:b/>
+                <w:bCs/>
+                <w:sz w:val="26"/>
+                <w:szCs w:val="26"/>
+              </w:rPr>
+              <w:t>}</w:t>
             </w:r>
           </w:p>
         </w:tc>
@@ -877,14 +897,14 @@
         <w:tblLook w:val="0000" w:firstRow="0" w:lastRow="0" w:firstColumn="0" w:lastColumn="0" w:noHBand="0" w:noVBand="0"/>
       </w:tblPr>
       <w:tblGrid>
-        <w:gridCol w:w="1254"/>
+        <w:gridCol w:w="1251"/>
         <w:gridCol w:w="1286"/>
         <w:gridCol w:w="1341"/>
         <w:gridCol w:w="1263"/>
         <w:gridCol w:w="1374"/>
         <w:gridCol w:w="1297"/>
         <w:gridCol w:w="1241"/>
-        <w:gridCol w:w="2079"/>
+        <w:gridCol w:w="2082"/>
       </w:tblGrid>
       <w:tr>
         <w:trPr>
@@ -1221,8 +1241,64 @@
               <w:rPr>
                 <w:b/>
                 <w:bCs/>
+                <w:sz w:val="26"/>
+                <w:szCs w:val="26"/>
+              </w:rPr>
+            </w:pPr>
+            <w:r>
+              <w:rPr>
+                <w:b/>
+                <w:bCs/>
+                <w:sz w:val="26"/>
+                <w:szCs w:val="26"/>
+              </w:rPr>
+              <w:t>${</w:t>
+            </w:r>
+            <w:proofErr w:type="spellStart"/>
+            <w:r>
+              <w:rPr>
+                <w:b/>
+                <w:bCs/>
+                <w:sz w:val="26"/>
+                <w:szCs w:val="26"/>
+              </w:rPr>
+              <w:t>equipment_</w:t>
+            </w:r>
+            <w:r>
+              <w:rPr>
+                <w:b/>
+                <w:bCs/>
+                <w:sz w:val="26"/>
+                <w:szCs w:val="26"/>
+              </w:rPr>
+              <w:t>number</w:t>
+            </w:r>
+            <w:proofErr w:type="spellEnd"/>
+            <w:r>
+              <w:rPr>
+                <w:b/>
+                <w:bCs/>
+                <w:sz w:val="26"/>
+                <w:szCs w:val="26"/>
+              </w:rPr>
+              <w:t>}</w:t>
+            </w:r>
+          </w:p>
+        </w:tc>
+        <w:tc>
+          <w:tcPr>
+            <w:tcW w:w="3026" w:type="dxa"/>
+          </w:tcPr>
+          <w:p>
+            <w:pPr>
+              <w:spacing w:after="0" w:line="240" w:lineRule="auto"/>
+              <w:jc w:val="center"/>
+              <w:rPr>
+                <w:b/>
+                <w:bCs/>
                 <w:sz w:val="20"/>
                 <w:szCs w:val="20"/>
+                <w:rtl/>
               </w:rPr>
             </w:pPr>
             <w:r>
@@ -1231,18 +1307,22 @@
                 <w:bCs/>
                 <w:sz w:val="20"/>
                 <w:szCs w:val="20"/>
-              </w:rPr>
-              <w:t>${equipment_</w:t>
-            </w:r>
-            <w:r>
+                <w:rtl/>
+              </w:rPr>
+              <w:t>اسم سائق الشاحنه القلاب</w:t>
+            </w:r>
+          </w:p>
+          <w:p>
+            <w:pPr>
+              <w:spacing w:after="0" w:line="240" w:lineRule="auto"/>
+              <w:jc w:val="center"/>
               <w:rPr>
                 <w:b/>
                 <w:bCs/>
                 <w:sz w:val="20"/>
                 <w:szCs w:val="20"/>
               </w:rPr>
-              <w:t>number</w:t>
-            </w:r>
+            </w:pPr>
             <w:r>
               <w:rPr>
                 <w:b/>
@@ -1250,14 +1330,9 @@
                 <w:sz w:val="20"/>
                 <w:szCs w:val="20"/>
               </w:rPr>
-              <w:t>}</w:t>
-            </w:r>
-          </w:p>
-        </w:tc>
-        <w:tc>
-          <w:tcPr>
-            <w:tcW w:w="3026" w:type="dxa"/>
-          </w:tcPr>
+              <w:t xml:space="preserve"> Name Operator</w:t>
+            </w:r>
+          </w:p>
           <w:p>
             <w:pPr>
               <w:spacing w:after="0" w:line="240" w:lineRule="auto"/>
@@ -1267,90 +1342,28 @@
                 <w:bCs/>
                 <w:sz w:val="20"/>
                 <w:szCs w:val="20"/>
-                <w:rtl/>
-              </w:rPr>
-            </w:pPr>
-            <w:r>
-              <w:rPr>
-                <w:b/>
-                <w:bCs/>
-                <w:sz w:val="20"/>
-                <w:szCs w:val="20"/>
-                <w:rtl/>
-              </w:rPr>
-              <w:t>اسم سائق الشاحنه القلاب</w:t>
-            </w:r>
-          </w:p>
-          <w:p>
-            <w:pPr>
-              <w:spacing w:after="0" w:line="240" w:lineRule="auto"/>
-              <w:jc w:val="center"/>
-              <w:rPr>
-                <w:b/>
-                <w:bCs/>
-                <w:sz w:val="20"/>
-                <w:szCs w:val="20"/>
-              </w:rPr>
-            </w:pPr>
-            <w:r>
-              <w:rPr>
-                <w:b/>
-                <w:bCs/>
-                <w:sz w:val="20"/>
-                <w:szCs w:val="20"/>
-              </w:rPr>
-              <w:t xml:space="preserve"> Name Operator</w:t>
-            </w:r>
-          </w:p>
-          <w:p>
-            <w:pPr>
-              <w:spacing w:after="0" w:line="240" w:lineRule="auto"/>
-              <w:jc w:val="center"/>
-              <w:rPr>
-                <w:b/>
-                <w:bCs/>
-                <w:sz w:val="20"/>
-                <w:szCs w:val="20"/>
-              </w:rPr>
-            </w:pPr>
-          </w:p>
-          <w:p>
-            <w:pPr>
-              <w:spacing w:after="0" w:line="240" w:lineRule="auto"/>
-              <w:jc w:val="center"/>
-              <w:rPr>
-                <w:b/>
-                <w:bCs/>
-                <w:sz w:val="20"/>
-                <w:szCs w:val="20"/>
-              </w:rPr>
-            </w:pPr>
-            <w:r>
-              <w:rPr>
-                <w:b/>
-                <w:bCs/>
-                <w:sz w:val="20"/>
-                <w:szCs w:val="20"/>
-              </w:rPr>
-              <w:t>${</w:t>
-            </w:r>
-            <w:r>
-              <w:rPr>
-                <w:b/>
-                <w:bCs/>
-                <w:sz w:val="20"/>
-                <w:szCs w:val="20"/>
-              </w:rPr>
-              <w:t>driver</w:t>
-            </w:r>
-            <w:r>
-              <w:rPr>
-                <w:b/>
-                <w:bCs/>
-                <w:sz w:val="20"/>
-                <w:szCs w:val="20"/>
-              </w:rPr>
-              <w:t>}</w:t>
+              </w:rPr>
+            </w:pPr>
+          </w:p>
+          <w:p>
+            <w:pPr>
+              <w:spacing w:after="0" w:line="240" w:lineRule="auto"/>
+              <w:jc w:val="center"/>
+              <w:rPr>
+                <w:b/>
+                <w:bCs/>
+                <w:sz w:val="26"/>
+                <w:szCs w:val="26"/>
+              </w:rPr>
+            </w:pPr>
+            <w:r>
+              <w:rPr>
+                <w:b/>
+                <w:bCs/>
+                <w:sz w:val="26"/>
+                <w:szCs w:val="26"/>
+              </w:rPr>
+              <w:t>${driver}</w:t>
             </w:r>
           </w:p>
         </w:tc>
@@ -1406,7 +1419,31 @@
                 <w:szCs w:val="18"/>
                 <w:rtl/>
               </w:rPr>
-              <w:t>) اذا كانت نتيجة الفحص (نعم)، أو علامة (</w:t>
+              <w:t xml:space="preserve">) </w:t>
+            </w:r>
+            <w:proofErr w:type="gramStart"/>
+            <w:r>
+              <w:rPr>
+                <w:rFonts w:hint="cs"/>
+                <w:b/>
+                <w:bCs/>
+                <w:sz w:val="18"/>
+                <w:szCs w:val="18"/>
+                <w:rtl/>
+              </w:rPr>
+              <w:t>اذا</w:t>
+            </w:r>
+            <w:proofErr w:type="gramEnd"/>
+            <w:r>
+              <w:rPr>
+                <w:rFonts w:hint="cs"/>
+                <w:b/>
+                <w:bCs/>
+                <w:sz w:val="18"/>
+                <w:szCs w:val="18"/>
+                <w:rtl/>
+              </w:rPr>
+              <w:t xml:space="preserve"> كانت نتيجة الفحص (نعم)، أو علامة (</w:t>
             </w:r>
             <w:r>
               <w:rPr>
@@ -1427,29 +1464,9 @@
                 <w:szCs w:val="18"/>
                 <w:rtl/>
               </w:rPr>
-              <w:t>) اذا كانت نتيجة الفحص (لا)</w:t>
-            </w:r>
-          </w:p>
-          <w:p>
-            <w:pPr>
-              <w:spacing w:after="0" w:line="240" w:lineRule="auto"/>
-              <w:jc w:val="center"/>
-              <w:rPr>
-                <w:b/>
-                <w:bCs/>
-                <w:sz w:val="18"/>
-                <w:szCs w:val="18"/>
-              </w:rPr>
-            </w:pPr>
-            <w:r>
-              <w:rPr>
-                <w:b/>
-                <w:bCs/>
-                <w:sz w:val="18"/>
-                <w:szCs w:val="18"/>
-              </w:rPr>
-              <w:t>mark (√) if Check is positive and (×)</w:t>
-            </w:r>
+              <w:t xml:space="preserve">) </w:t>
+            </w:r>
+            <w:proofErr w:type="gramStart"/>
             <w:r>
               <w:rPr>
                 <w:rFonts w:hint="cs"/>
@@ -1459,6 +1476,60 @@
                 <w:szCs w:val="18"/>
                 <w:rtl/>
               </w:rPr>
+              <w:t>اذا</w:t>
+            </w:r>
+            <w:proofErr w:type="gramEnd"/>
+            <w:r>
+              <w:rPr>
+                <w:rFonts w:hint="cs"/>
+                <w:b/>
+                <w:bCs/>
+                <w:sz w:val="18"/>
+                <w:szCs w:val="18"/>
+                <w:rtl/>
+              </w:rPr>
+              <w:t xml:space="preserve"> كانت نتيجة الفحص (لا)</w:t>
+            </w:r>
+          </w:p>
+          <w:p>
+            <w:pPr>
+              <w:spacing w:after="0" w:line="240" w:lineRule="auto"/>
+              <w:jc w:val="center"/>
+              <w:rPr>
+                <w:b/>
+                <w:bCs/>
+                <w:sz w:val="18"/>
+                <w:szCs w:val="18"/>
+              </w:rPr>
+            </w:pPr>
+            <w:r>
+              <w:rPr>
+                <w:b/>
+                <w:bCs/>
+                <w:sz w:val="18"/>
+                <w:szCs w:val="18"/>
+              </w:rPr>
+              <w:t>mark (√) if Check is positive and (</w:t>
+            </w:r>
+            <w:proofErr w:type="gramStart"/>
+            <w:r>
+              <w:rPr>
+                <w:b/>
+                <w:bCs/>
+                <w:sz w:val="18"/>
+                <w:szCs w:val="18"/>
+              </w:rPr>
+              <w:t>×)</w:t>
+            </w:r>
+            <w:r>
+              <w:rPr>
+                <w:rFonts w:hint="cs"/>
+                <w:b/>
+                <w:bCs/>
+                <w:sz w:val="18"/>
+                <w:szCs w:val="18"/>
+                <w:rtl/>
+              </w:rPr>
               <w:t xml:space="preserve"> </w:t>
             </w:r>
             <w:r>
@@ -1468,7 +1539,17 @@
                 <w:sz w:val="18"/>
                 <w:szCs w:val="18"/>
               </w:rPr>
-              <w:t xml:space="preserve"> if Check is negative</w:t>
+              <w:t xml:space="preserve"> if</w:t>
+            </w:r>
+            <w:proofErr w:type="gramEnd"/>
+            <w:r>
+              <w:rPr>
+                <w:b/>
+                <w:bCs/>
+                <w:sz w:val="18"/>
+                <w:szCs w:val="18"/>
+              </w:rPr>
+              <w:t xml:space="preserve"> Check is negative</w:t>
             </w:r>
           </w:p>
         </w:tc>
@@ -1899,7 +1980,29 @@
                 <w:sz w:val="14"/>
                 <w:szCs w:val="16"/>
               </w:rPr>
-              <w:t>${fri_date}</w:t>
+              <w:t>${</w:t>
+            </w:r>
+            <w:proofErr w:type="spellStart"/>
+            <w:r>
+              <w:rPr>
+                <w:rFonts w:ascii="Times New Roman"/>
+                <w:b/>
+                <w:bCs/>
+                <w:sz w:val="14"/>
+                <w:szCs w:val="16"/>
+              </w:rPr>
+              <w:t>fri_date</w:t>
+            </w:r>
+            <w:proofErr w:type="spellEnd"/>
+            <w:r>
+              <w:rPr>
+                <w:rFonts w:ascii="Times New Roman"/>
+                <w:b/>
+                <w:bCs/>
+                <w:sz w:val="14"/>
+                <w:szCs w:val="16"/>
+              </w:rPr>
+              <w:t>}</w:t>
             </w:r>
           </w:p>
         </w:tc>
@@ -1926,7 +2029,18 @@
                 <w:sz w:val="14"/>
                 <w:szCs w:val="16"/>
               </w:rPr>
-              <w:t>${thu_dat</w:t>
+              <w:t>${</w:t>
+            </w:r>
+            <w:proofErr w:type="spellStart"/>
+            <w:r>
+              <w:rPr>
+                <w:rFonts w:ascii="Times New Roman"/>
+                <w:b/>
+                <w:bCs/>
+                <w:sz w:val="14"/>
+                <w:szCs w:val="16"/>
+              </w:rPr>
+              <w:t>thu_dat</w:t>
             </w:r>
             <w:r>
               <w:rPr>
@@ -1936,7 +2050,18 @@
                 <w:sz w:val="14"/>
                 <w:szCs w:val="14"/>
               </w:rPr>
-              <w:t>e}</w:t>
+              <w:t>e</w:t>
+            </w:r>
+            <w:proofErr w:type="spellEnd"/>
+            <w:r>
+              <w:rPr>
+                <w:rFonts w:ascii="Times New Roman"/>
+                <w:b/>
+                <w:bCs/>
+                <w:sz w:val="14"/>
+                <w:szCs w:val="14"/>
+              </w:rPr>
+              <w:t>}</w:t>
             </w:r>
           </w:p>
         </w:tc>
@@ -1962,7 +2087,29 @@
                 <w:sz w:val="14"/>
                 <w:szCs w:val="16"/>
               </w:rPr>
-              <w:t>${wed_date}</w:t>
+              <w:t>${</w:t>
+            </w:r>
+            <w:proofErr w:type="spellStart"/>
+            <w:r>
+              <w:rPr>
+                <w:rFonts w:ascii="Times New Roman"/>
+                <w:b/>
+                <w:bCs/>
+                <w:sz w:val="14"/>
+                <w:szCs w:val="16"/>
+              </w:rPr>
+              <w:t>wed_date</w:t>
+            </w:r>
+            <w:proofErr w:type="spellEnd"/>
+            <w:r>
+              <w:rPr>
+                <w:rFonts w:ascii="Times New Roman"/>
+                <w:b/>
+                <w:bCs/>
+                <w:sz w:val="14"/>
+                <w:szCs w:val="16"/>
+              </w:rPr>
+              <w:t>}</w:t>
             </w:r>
           </w:p>
         </w:tc>
@@ -1989,7 +2136,29 @@
                 <w:sz w:val="14"/>
                 <w:szCs w:val="16"/>
               </w:rPr>
-              <w:t>${tue_date}</w:t>
+              <w:t>${</w:t>
+            </w:r>
+            <w:proofErr w:type="spellStart"/>
+            <w:r>
+              <w:rPr>
+                <w:rFonts w:ascii="Times New Roman"/>
+                <w:b/>
+                <w:bCs/>
+                <w:sz w:val="14"/>
+                <w:szCs w:val="16"/>
+              </w:rPr>
+              <w:t>tue_date</w:t>
+            </w:r>
+            <w:proofErr w:type="spellEnd"/>
+            <w:r>
+              <w:rPr>
+                <w:rFonts w:ascii="Times New Roman"/>
+                <w:b/>
+                <w:bCs/>
+                <w:sz w:val="14"/>
+                <w:szCs w:val="16"/>
+              </w:rPr>
+              <w:t>}</w:t>
             </w:r>
           </w:p>
         </w:tc>
@@ -2016,7 +2185,29 @@
                 <w:sz w:val="14"/>
                 <w:szCs w:val="16"/>
               </w:rPr>
-              <w:t>${mon_date}</w:t>
+              <w:t>${</w:t>
+            </w:r>
+            <w:proofErr w:type="spellStart"/>
+            <w:r>
+              <w:rPr>
+                <w:rFonts w:ascii="Times New Roman"/>
+                <w:b/>
+                <w:bCs/>
+                <w:sz w:val="14"/>
+                <w:szCs w:val="16"/>
+              </w:rPr>
+              <w:t>mon_date</w:t>
+            </w:r>
+            <w:proofErr w:type="spellEnd"/>
+            <w:r>
+              <w:rPr>
+                <w:rFonts w:ascii="Times New Roman"/>
+                <w:b/>
+                <w:bCs/>
+                <w:sz w:val="14"/>
+                <w:szCs w:val="16"/>
+              </w:rPr>
+              <w:t>}</w:t>
             </w:r>
           </w:p>
         </w:tc>
@@ -2043,7 +2234,29 @@
                 <w:sz w:val="14"/>
                 <w:szCs w:val="16"/>
               </w:rPr>
-              <w:t>${sun_date}</w:t>
+              <w:t>${</w:t>
+            </w:r>
+            <w:proofErr w:type="spellStart"/>
+            <w:r>
+              <w:rPr>
+                <w:rFonts w:ascii="Times New Roman"/>
+                <w:b/>
+                <w:bCs/>
+                <w:sz w:val="14"/>
+                <w:szCs w:val="16"/>
+              </w:rPr>
+              <w:t>sun_date</w:t>
+            </w:r>
+            <w:proofErr w:type="spellEnd"/>
+            <w:r>
+              <w:rPr>
+                <w:rFonts w:ascii="Times New Roman"/>
+                <w:b/>
+                <w:bCs/>
+                <w:sz w:val="14"/>
+                <w:szCs w:val="16"/>
+              </w:rPr>
+              <w:t>}</w:t>
             </w:r>
           </w:p>
         </w:tc>
@@ -2070,7 +2283,29 @@
                 <w:sz w:val="14"/>
                 <w:szCs w:val="16"/>
               </w:rPr>
-              <w:t>${sat_date}</w:t>
+              <w:t>${</w:t>
+            </w:r>
+            <w:proofErr w:type="spellStart"/>
+            <w:r>
+              <w:rPr>
+                <w:rFonts w:ascii="Times New Roman"/>
+                <w:b/>
+                <w:bCs/>
+                <w:sz w:val="14"/>
+                <w:szCs w:val="16"/>
+              </w:rPr>
+              <w:t>sat_date</w:t>
+            </w:r>
+            <w:proofErr w:type="spellEnd"/>
+            <w:r>
+              <w:rPr>
+                <w:rFonts w:ascii="Times New Roman"/>
+                <w:b/>
+                <w:bCs/>
+                <w:sz w:val="14"/>
+                <w:szCs w:val="16"/>
+              </w:rPr>
+              <w:t>}</w:t>
             </w:r>
           </w:p>
         </w:tc>
@@ -2166,6 +2401,7 @@
               </w:rPr>
               <w:t>${</w:t>
             </w:r>
+            <w:proofErr w:type="spellStart"/>
             <w:r>
               <w:rPr>
                 <w:rFonts w:ascii="Times New Roman"/>
@@ -2186,18 +2422,10 @@
                 <w:szCs w:val="22"/>
                 <w:lang w:bidi="ar-EG"/>
               </w:rPr>
-              <w:t>daily}</w:t>
-            </w:r>
-          </w:p>
-        </w:tc>
-        <w:tc>
-          <w:tcPr>
-            <w:tcW w:w="1183" w:type="dxa"/>
-          </w:tcPr>
-          <w:p>
-            <w:pPr>
-              <w:spacing w:line="240" w:lineRule="auto"/>
-              <w:jc w:val="center"/>
+              <w:t>daily</w:t>
+            </w:r>
+            <w:proofErr w:type="spellEnd"/>
+            <w:r>
               <w:rPr>
                 <w:rFonts w:ascii="Times New Roman"/>
                 <w:b/>
@@ -2206,8 +2434,18 @@
                 <w:szCs w:val="22"/>
                 <w:lang w:bidi="ar-EG"/>
               </w:rPr>
-            </w:pPr>
-            <w:r>
+              <w:t>}</w:t>
+            </w:r>
+          </w:p>
+        </w:tc>
+        <w:tc>
+          <w:tcPr>
+            <w:tcW w:w="1183" w:type="dxa"/>
+          </w:tcPr>
+          <w:p>
+            <w:pPr>
+              <w:spacing w:line="240" w:lineRule="auto"/>
+              <w:jc w:val="center"/>
               <w:rPr>
                 <w:rFonts w:ascii="Times New Roman"/>
                 <w:b/>
@@ -2216,8 +2454,7 @@
                 <w:szCs w:val="22"/>
                 <w:lang w:bidi="ar-EG"/>
               </w:rPr>
-              <w:t>${</w:t>
-            </w:r>
+            </w:pPr>
             <w:r>
               <w:rPr>
                 <w:rFonts w:ascii="Times New Roman"/>
@@ -2227,8 +2464,9 @@
                 <w:szCs w:val="22"/>
                 <w:lang w:bidi="ar-EG"/>
               </w:rPr>
-              <w:t>thu_</w:t>
-            </w:r>
+              <w:t>${</w:t>
+            </w:r>
+            <w:proofErr w:type="spellStart"/>
             <w:r>
               <w:rPr>
                 <w:rFonts w:ascii="Times New Roman"/>
@@ -2238,18 +2476,9 @@
                 <w:szCs w:val="22"/>
                 <w:lang w:bidi="ar-EG"/>
               </w:rPr>
-              <w:t>daily}</w:t>
-            </w:r>
-          </w:p>
-        </w:tc>
-        <w:tc>
-          <w:tcPr>
-            <w:tcW w:w="1110" w:type="dxa"/>
-          </w:tcPr>
-          <w:p>
-            <w:pPr>
-              <w:spacing w:line="240" w:lineRule="auto"/>
-              <w:jc w:val="center"/>
+              <w:t>thu_</w:t>
+            </w:r>
+            <w:r>
               <w:rPr>
                 <w:rFonts w:ascii="Times New Roman"/>
                 <w:b/>
@@ -2258,7 +2487,9 @@
                 <w:szCs w:val="22"/>
                 <w:lang w:bidi="ar-EG"/>
               </w:rPr>
-            </w:pPr>
+              <w:t>daily</w:t>
+            </w:r>
+            <w:proofErr w:type="spellEnd"/>
             <w:r>
               <w:rPr>
                 <w:rFonts w:ascii="Times New Roman"/>
@@ -2268,9 +2499,18 @@
                 <w:szCs w:val="22"/>
                 <w:lang w:bidi="ar-EG"/>
               </w:rPr>
-              <w:t>${</w:t>
-            </w:r>
-            <w:r>
+              <w:t>}</w:t>
+            </w:r>
+          </w:p>
+        </w:tc>
+        <w:tc>
+          <w:tcPr>
+            <w:tcW w:w="1110" w:type="dxa"/>
+          </w:tcPr>
+          <w:p>
+            <w:pPr>
+              <w:spacing w:line="240" w:lineRule="auto"/>
+              <w:jc w:val="center"/>
               <w:rPr>
                 <w:rFonts w:ascii="Times New Roman"/>
                 <w:b/>
@@ -2279,8 +2519,7 @@
                 <w:szCs w:val="22"/>
                 <w:lang w:bidi="ar-EG"/>
               </w:rPr>
-              <w:t>wed_</w:t>
-            </w:r>
+            </w:pPr>
             <w:r>
               <w:rPr>
                 <w:rFonts w:ascii="Times New Roman"/>
@@ -2290,18 +2529,10 @@
                 <w:szCs w:val="22"/>
                 <w:lang w:bidi="ar-EG"/>
               </w:rPr>
-              <w:t>daily}</w:t>
-            </w:r>
-          </w:p>
-        </w:tc>
-        <w:tc>
-          <w:tcPr>
-            <w:tcW w:w="1112" w:type="dxa"/>
-          </w:tcPr>
-          <w:p>
-            <w:pPr>
-              <w:spacing w:line="240" w:lineRule="auto"/>
-              <w:jc w:val="center"/>
+              <w:t>${</w:t>
+            </w:r>
+            <w:proofErr w:type="spellStart"/>
+            <w:r>
               <w:rPr>
                 <w:rFonts w:ascii="Times New Roman"/>
                 <w:b/>
@@ -2310,7 +2541,8 @@
                 <w:szCs w:val="22"/>
                 <w:lang w:bidi="ar-EG"/>
               </w:rPr>
-            </w:pPr>
+              <w:t>wed_</w:t>
+            </w:r>
             <w:r>
               <w:rPr>
                 <w:rFonts w:ascii="Times New Roman"/>
@@ -2320,8 +2552,9 @@
                 <w:szCs w:val="22"/>
                 <w:lang w:bidi="ar-EG"/>
               </w:rPr>
-              <w:t>${</w:t>
-            </w:r>
+              <w:t>daily</w:t>
+            </w:r>
+            <w:proofErr w:type="spellEnd"/>
             <w:r>
               <w:rPr>
                 <w:rFonts w:ascii="Times New Roman"/>
@@ -2331,9 +2564,18 @@
                 <w:szCs w:val="22"/>
                 <w:lang w:bidi="ar-EG"/>
               </w:rPr>
-              <w:t>tue_</w:t>
-            </w:r>
-            <w:r>
+              <w:t>}</w:t>
+            </w:r>
+          </w:p>
+        </w:tc>
+        <w:tc>
+          <w:tcPr>
+            <w:tcW w:w="1112" w:type="dxa"/>
+          </w:tcPr>
+          <w:p>
+            <w:pPr>
+              <w:spacing w:line="240" w:lineRule="auto"/>
+              <w:jc w:val="center"/>
               <w:rPr>
                 <w:rFonts w:ascii="Times New Roman"/>
                 <w:b/>
@@ -2342,18 +2584,8 @@
                 <w:szCs w:val="22"/>
                 <w:lang w:bidi="ar-EG"/>
               </w:rPr>
-              <w:t>daily}</w:t>
-            </w:r>
-          </w:p>
-        </w:tc>
-        <w:tc>
-          <w:tcPr>
-            <w:tcW w:w="1065" w:type="dxa"/>
-          </w:tcPr>
-          <w:p>
-            <w:pPr>
-              <w:spacing w:line="240" w:lineRule="auto"/>
-              <w:jc w:val="center"/>
+            </w:pPr>
+            <w:r>
               <w:rPr>
                 <w:rFonts w:ascii="Times New Roman"/>
                 <w:b/>
@@ -2362,7 +2594,9 @@
                 <w:szCs w:val="22"/>
                 <w:lang w:bidi="ar-EG"/>
               </w:rPr>
-            </w:pPr>
+              <w:t>${</w:t>
+            </w:r>
+            <w:proofErr w:type="spellStart"/>
             <w:r>
               <w:rPr>
                 <w:rFonts w:ascii="Times New Roman"/>
@@ -2372,7 +2606,7 @@
                 <w:szCs w:val="22"/>
                 <w:lang w:bidi="ar-EG"/>
               </w:rPr>
-              <w:t>${</w:t>
+              <w:t>tue_</w:t>
             </w:r>
             <w:r>
               <w:rPr>
@@ -2383,8 +2617,9 @@
                 <w:szCs w:val="22"/>
                 <w:lang w:bidi="ar-EG"/>
               </w:rPr>
-              <w:t>mon_</w:t>
-            </w:r>
+              <w:t>daily</w:t>
+            </w:r>
+            <w:proofErr w:type="spellEnd"/>
             <w:r>
               <w:rPr>
                 <w:rFonts w:ascii="Times New Roman"/>
@@ -2394,13 +2629,13 @@
                 <w:szCs w:val="22"/>
                 <w:lang w:bidi="ar-EG"/>
               </w:rPr>
-              <w:t>daily}</w:t>
-            </w:r>
-          </w:p>
-        </w:tc>
-        <w:tc>
-          <w:tcPr>
-            <w:tcW w:w="1126" w:type="dxa"/>
+              <w:t>}</w:t>
+            </w:r>
+          </w:p>
+        </w:tc>
+        <w:tc>
+          <w:tcPr>
+            <w:tcW w:w="1065" w:type="dxa"/>
           </w:tcPr>
           <w:p>
             <w:pPr>
@@ -2426,6 +2661,7 @@
               </w:rPr>
               <w:t>${</w:t>
             </w:r>
+            <w:proofErr w:type="spellStart"/>
             <w:r>
               <w:rPr>
                 <w:rFonts w:ascii="Times New Roman"/>
@@ -2435,7 +2671,7 @@
                 <w:szCs w:val="22"/>
                 <w:lang w:bidi="ar-EG"/>
               </w:rPr>
-              <w:t>sun_</w:t>
+              <w:t>mon_</w:t>
             </w:r>
             <w:r>
               <w:rPr>
@@ -2446,18 +2682,10 @@
                 <w:szCs w:val="22"/>
                 <w:lang w:bidi="ar-EG"/>
               </w:rPr>
-              <w:t>daily}</w:t>
-            </w:r>
-          </w:p>
-        </w:tc>
-        <w:tc>
-          <w:tcPr>
-            <w:tcW w:w="1216" w:type="dxa"/>
-          </w:tcPr>
-          <w:p>
-            <w:pPr>
-              <w:spacing w:line="240" w:lineRule="auto"/>
-              <w:jc w:val="center"/>
+              <w:t>daily</w:t>
+            </w:r>
+            <w:proofErr w:type="spellEnd"/>
+            <w:r>
               <w:rPr>
                 <w:rFonts w:ascii="Times New Roman"/>
                 <w:b/>
@@ -2466,8 +2694,18 @@
                 <w:szCs w:val="22"/>
                 <w:lang w:bidi="ar-EG"/>
               </w:rPr>
-            </w:pPr>
-            <w:r>
+              <w:t>}</w:t>
+            </w:r>
+          </w:p>
+        </w:tc>
+        <w:tc>
+          <w:tcPr>
+            <w:tcW w:w="1126" w:type="dxa"/>
+          </w:tcPr>
+          <w:p>
+            <w:pPr>
+              <w:spacing w:line="240" w:lineRule="auto"/>
+              <w:jc w:val="center"/>
               <w:rPr>
                 <w:rFonts w:ascii="Times New Roman"/>
                 <w:b/>
@@ -2476,8 +2714,7 @@
                 <w:szCs w:val="22"/>
                 <w:lang w:bidi="ar-EG"/>
               </w:rPr>
-              <w:t>${</w:t>
-            </w:r>
+            </w:pPr>
             <w:r>
               <w:rPr>
                 <w:rFonts w:ascii="Times New Roman"/>
@@ -2487,8 +2724,9 @@
                 <w:szCs w:val="22"/>
                 <w:lang w:bidi="ar-EG"/>
               </w:rPr>
-              <w:t>sat_</w:t>
-            </w:r>
+              <w:t>${</w:t>
+            </w:r>
+            <w:proofErr w:type="spellStart"/>
             <w:r>
               <w:rPr>
                 <w:rFonts w:ascii="Times New Roman"/>
@@ -2498,7 +2736,95 @@
                 <w:szCs w:val="22"/>
                 <w:lang w:bidi="ar-EG"/>
               </w:rPr>
-              <w:t>daily}</w:t>
+              <w:t>sun_</w:t>
+            </w:r>
+            <w:r>
+              <w:rPr>
+                <w:rFonts w:ascii="Times New Roman"/>
+                <w:b/>
+                <w:bCs/>
+                <w:sz w:val="20"/>
+                <w:szCs w:val="22"/>
+                <w:lang w:bidi="ar-EG"/>
+              </w:rPr>
+              <w:t>daily</w:t>
+            </w:r>
+            <w:proofErr w:type="spellEnd"/>
+            <w:r>
+              <w:rPr>
+                <w:rFonts w:ascii="Times New Roman"/>
+                <w:b/>
+                <w:bCs/>
+                <w:sz w:val="20"/>
+                <w:szCs w:val="22"/>
+                <w:lang w:bidi="ar-EG"/>
+              </w:rPr>
+              <w:t>}</w:t>
+            </w:r>
+          </w:p>
+        </w:tc>
+        <w:tc>
+          <w:tcPr>
+            <w:tcW w:w="1216" w:type="dxa"/>
+          </w:tcPr>
+          <w:p>
+            <w:pPr>
+              <w:spacing w:line="240" w:lineRule="auto"/>
+              <w:jc w:val="center"/>
+              <w:rPr>
+                <w:rFonts w:ascii="Times New Roman"/>
+                <w:b/>
+                <w:bCs/>
+                <w:sz w:val="20"/>
+                <w:szCs w:val="22"/>
+                <w:lang w:bidi="ar-EG"/>
+              </w:rPr>
+            </w:pPr>
+            <w:r>
+              <w:rPr>
+                <w:rFonts w:ascii="Times New Roman"/>
+                <w:b/>
+                <w:bCs/>
+                <w:sz w:val="20"/>
+                <w:szCs w:val="22"/>
+                <w:lang w:bidi="ar-EG"/>
+              </w:rPr>
+              <w:t>${</w:t>
+            </w:r>
+            <w:proofErr w:type="spellStart"/>
+            <w:r>
+              <w:rPr>
+                <w:rFonts w:ascii="Times New Roman"/>
+                <w:b/>
+                <w:bCs/>
+                <w:sz w:val="20"/>
+                <w:szCs w:val="22"/>
+                <w:lang w:bidi="ar-EG"/>
+              </w:rPr>
+              <w:t>sat_</w:t>
+            </w:r>
+            <w:r>
+              <w:rPr>
+                <w:rFonts w:ascii="Times New Roman"/>
+                <w:b/>
+                <w:bCs/>
+                <w:sz w:val="20"/>
+                <w:szCs w:val="22"/>
+                <w:lang w:bidi="ar-EG"/>
+              </w:rPr>
+              <w:t>daily</w:t>
+            </w:r>
+            <w:proofErr w:type="spellEnd"/>
+            <w:r>
+              <w:rPr>
+                <w:rFonts w:ascii="Times New Roman"/>
+                <w:b/>
+                <w:bCs/>
+                <w:sz w:val="20"/>
+                <w:szCs w:val="22"/>
+                <w:lang w:bidi="ar-EG"/>
+              </w:rPr>
+              <w:t>}</w:t>
             </w:r>
           </w:p>
         </w:tc>
@@ -2567,7 +2893,25 @@
                 <w:sz w:val="6"/>
                 <w:szCs w:val="8"/>
               </w:rPr>
-              <w:t>${fri_check_column}</w:t>
+              <w:t>${</w:t>
+            </w:r>
+            <w:proofErr w:type="spellStart"/>
+            <w:r>
+              <w:rPr>
+                <w:rFonts w:ascii="Times New Roman"/>
+                <w:sz w:val="6"/>
+                <w:szCs w:val="8"/>
+              </w:rPr>
+              <w:t>fri_check_column</w:t>
+            </w:r>
+            <w:proofErr w:type="spellEnd"/>
+            <w:r>
+              <w:rPr>
+                <w:rFonts w:ascii="Times New Roman"/>
+                <w:sz w:val="6"/>
+                <w:szCs w:val="8"/>
+              </w:rPr>
+              <w:t>}</w:t>
             </w:r>
           </w:p>
         </w:tc>
@@ -2582,7 +2926,25 @@
                 <w:sz w:val="6"/>
                 <w:szCs w:val="8"/>
               </w:rPr>
-              <w:t>${thu_check_column}</w:t>
+              <w:t>${</w:t>
+            </w:r>
+            <w:proofErr w:type="spellStart"/>
+            <w:r>
+              <w:rPr>
+                <w:rFonts w:ascii="Times New Roman"/>
+                <w:sz w:val="6"/>
+                <w:szCs w:val="8"/>
+              </w:rPr>
+              <w:t>thu_check_column</w:t>
+            </w:r>
+            <w:proofErr w:type="spellEnd"/>
+            <w:r>
+              <w:rPr>
+                <w:rFonts w:ascii="Times New Roman"/>
+                <w:sz w:val="6"/>
+                <w:szCs w:val="8"/>
+              </w:rPr>
+              <w:t>}</w:t>
             </w:r>
           </w:p>
         </w:tc>
@@ -2597,7 +2959,25 @@
                 <w:sz w:val="6"/>
                 <w:szCs w:val="8"/>
               </w:rPr>
-              <w:t>${wed_check_column}</w:t>
+              <w:t>${</w:t>
+            </w:r>
+            <w:proofErr w:type="spellStart"/>
+            <w:r>
+              <w:rPr>
+                <w:rFonts w:ascii="Times New Roman"/>
+                <w:sz w:val="6"/>
+                <w:szCs w:val="8"/>
+              </w:rPr>
+              <w:t>wed_check_column</w:t>
+            </w:r>
+            <w:proofErr w:type="spellEnd"/>
+            <w:r>
+              <w:rPr>
+                <w:rFonts w:ascii="Times New Roman"/>
+                <w:sz w:val="6"/>
+                <w:szCs w:val="8"/>
+              </w:rPr>
+              <w:t>}</w:t>
             </w:r>
           </w:p>
         </w:tc>
@@ -2612,7 +2992,25 @@
                 <w:sz w:val="6"/>
                 <w:szCs w:val="8"/>
               </w:rPr>
-              <w:t>${tue_check_column}</w:t>
+              <w:t>${</w:t>
+            </w:r>
+            <w:proofErr w:type="spellStart"/>
+            <w:r>
+              <w:rPr>
+                <w:rFonts w:ascii="Times New Roman"/>
+                <w:sz w:val="6"/>
+                <w:szCs w:val="8"/>
+              </w:rPr>
+              <w:t>tue_check_column</w:t>
+            </w:r>
+            <w:proofErr w:type="spellEnd"/>
+            <w:r>
+              <w:rPr>
+                <w:rFonts w:ascii="Times New Roman"/>
+                <w:sz w:val="6"/>
+                <w:szCs w:val="8"/>
+              </w:rPr>
+              <w:t>}</w:t>
             </w:r>
           </w:p>
         </w:tc>
@@ -2627,7 +3025,25 @@
                 <w:sz w:val="6"/>
                 <w:szCs w:val="8"/>
               </w:rPr>
-              <w:t>${mon_check_column}</w:t>
+              <w:t>${</w:t>
+            </w:r>
+            <w:proofErr w:type="spellStart"/>
+            <w:r>
+              <w:rPr>
+                <w:rFonts w:ascii="Times New Roman"/>
+                <w:sz w:val="6"/>
+                <w:szCs w:val="8"/>
+              </w:rPr>
+              <w:t>mon_check_column</w:t>
+            </w:r>
+            <w:proofErr w:type="spellEnd"/>
+            <w:r>
+              <w:rPr>
+                <w:rFonts w:ascii="Times New Roman"/>
+                <w:sz w:val="6"/>
+                <w:szCs w:val="8"/>
+              </w:rPr>
+              <w:t>}</w:t>
             </w:r>
           </w:p>
         </w:tc>
@@ -2642,7 +3058,25 @@
                 <w:sz w:val="6"/>
                 <w:szCs w:val="8"/>
               </w:rPr>
-              <w:t>${sun_check_column}</w:t>
+              <w:t>${</w:t>
+            </w:r>
+            <w:proofErr w:type="spellStart"/>
+            <w:r>
+              <w:rPr>
+                <w:rFonts w:ascii="Times New Roman"/>
+                <w:sz w:val="6"/>
+                <w:szCs w:val="8"/>
+              </w:rPr>
+              <w:t>sun_check_column</w:t>
+            </w:r>
+            <w:proofErr w:type="spellEnd"/>
+            <w:r>
+              <w:rPr>
+                <w:rFonts w:ascii="Times New Roman"/>
+                <w:sz w:val="6"/>
+                <w:szCs w:val="8"/>
+              </w:rPr>
+              <w:t>}</w:t>
             </w:r>
           </w:p>
         </w:tc>
@@ -2657,7 +3091,25 @@
                 <w:sz w:val="6"/>
                 <w:szCs w:val="8"/>
               </w:rPr>
-              <w:t>${sat_check_column}</w:t>
+              <w:t>${</w:t>
+            </w:r>
+            <w:proofErr w:type="spellStart"/>
+            <w:r>
+              <w:rPr>
+                <w:rFonts w:ascii="Times New Roman"/>
+                <w:sz w:val="6"/>
+                <w:szCs w:val="8"/>
+              </w:rPr>
+              <w:t>sat_check_column</w:t>
+            </w:r>
+            <w:proofErr w:type="spellEnd"/>
+            <w:r>
+              <w:rPr>
+                <w:rFonts w:ascii="Times New Roman"/>
+                <w:sz w:val="6"/>
+                <w:szCs w:val="8"/>
+              </w:rPr>
+              <w:t>}</w:t>
             </w:r>
           </w:p>
         </w:tc>
@@ -2748,7 +3200,25 @@
                 <w:sz w:val="6"/>
                 <w:szCs w:val="8"/>
               </w:rPr>
-              <w:t>${fri_check_column}</w:t>
+              <w:t>${</w:t>
+            </w:r>
+            <w:proofErr w:type="spellStart"/>
+            <w:r>
+              <w:rPr>
+                <w:rFonts w:ascii="Times New Roman"/>
+                <w:sz w:val="6"/>
+                <w:szCs w:val="8"/>
+              </w:rPr>
+              <w:t>fri_check_column</w:t>
+            </w:r>
+            <w:proofErr w:type="spellEnd"/>
+            <w:r>
+              <w:rPr>
+                <w:rFonts w:ascii="Times New Roman"/>
+                <w:sz w:val="6"/>
+                <w:szCs w:val="8"/>
+              </w:rPr>
+              <w:t>}</w:t>
             </w:r>
           </w:p>
         </w:tc>
@@ -2763,7 +3233,25 @@
                 <w:sz w:val="6"/>
                 <w:szCs w:val="8"/>
               </w:rPr>
-              <w:t>${thu_check_column}</w:t>
+              <w:t>${</w:t>
+            </w:r>
+            <w:proofErr w:type="spellStart"/>
+            <w:r>
+              <w:rPr>
+                <w:rFonts w:ascii="Times New Roman"/>
+                <w:sz w:val="6"/>
+                <w:szCs w:val="8"/>
+              </w:rPr>
+              <w:t>thu_check_column</w:t>
+            </w:r>
+            <w:proofErr w:type="spellEnd"/>
+            <w:r>
+              <w:rPr>
+                <w:rFonts w:ascii="Times New Roman"/>
+                <w:sz w:val="6"/>
+                <w:szCs w:val="8"/>
+              </w:rPr>
+              <w:t>}</w:t>
             </w:r>
           </w:p>
         </w:tc>
@@ -2778,7 +3266,25 @@
                 <w:sz w:val="6"/>
                 <w:szCs w:val="8"/>
               </w:rPr>
-              <w:t>${wed_check_column}</w:t>
+              <w:t>${</w:t>
+            </w:r>
+            <w:proofErr w:type="spellStart"/>
+            <w:r>
+              <w:rPr>
+                <w:rFonts w:ascii="Times New Roman"/>
+                <w:sz w:val="6"/>
+                <w:szCs w:val="8"/>
+              </w:rPr>
+              <w:t>wed_check_column</w:t>
+            </w:r>
+            <w:proofErr w:type="spellEnd"/>
+            <w:r>
+              <w:rPr>
+                <w:rFonts w:ascii="Times New Roman"/>
+                <w:sz w:val="6"/>
+                <w:szCs w:val="8"/>
+              </w:rPr>
+              <w:t>}</w:t>
             </w:r>
           </w:p>
         </w:tc>
@@ -2793,7 +3299,25 @@
                 <w:sz w:val="6"/>
                 <w:szCs w:val="8"/>
               </w:rPr>
-              <w:t>${tue_check_column}</w:t>
+              <w:t>${</w:t>
+            </w:r>
+            <w:proofErr w:type="spellStart"/>
+            <w:r>
+              <w:rPr>
+                <w:rFonts w:ascii="Times New Roman"/>
+                <w:sz w:val="6"/>
+                <w:szCs w:val="8"/>
+              </w:rPr>
+              <w:t>tue_check_column</w:t>
+            </w:r>
+            <w:proofErr w:type="spellEnd"/>
+            <w:r>
+              <w:rPr>
+                <w:rFonts w:ascii="Times New Roman"/>
+                <w:sz w:val="6"/>
+                <w:szCs w:val="8"/>
+              </w:rPr>
+              <w:t>}</w:t>
             </w:r>
           </w:p>
         </w:tc>
@@ -2808,7 +3332,25 @@
                 <w:sz w:val="6"/>
                 <w:szCs w:val="8"/>
               </w:rPr>
-              <w:t>${mon_check_column}</w:t>
+              <w:t>${</w:t>
+            </w:r>
+            <w:proofErr w:type="spellStart"/>
+            <w:r>
+              <w:rPr>
+                <w:rFonts w:ascii="Times New Roman"/>
+                <w:sz w:val="6"/>
+                <w:szCs w:val="8"/>
+              </w:rPr>
+              <w:t>mon_check_column</w:t>
+            </w:r>
+            <w:proofErr w:type="spellEnd"/>
+            <w:r>
+              <w:rPr>
+                <w:rFonts w:ascii="Times New Roman"/>
+                <w:sz w:val="6"/>
+                <w:szCs w:val="8"/>
+              </w:rPr>
+              <w:t>}</w:t>
             </w:r>
           </w:p>
         </w:tc>
@@ -2823,7 +3365,25 @@
                 <w:sz w:val="6"/>
                 <w:szCs w:val="8"/>
               </w:rPr>
-              <w:t>${sun_check_column}</w:t>
+              <w:t>${</w:t>
+            </w:r>
+            <w:proofErr w:type="spellStart"/>
+            <w:r>
+              <w:rPr>
+                <w:rFonts w:ascii="Times New Roman"/>
+                <w:sz w:val="6"/>
+                <w:szCs w:val="8"/>
+              </w:rPr>
+              <w:t>sun_check_column</w:t>
+            </w:r>
+            <w:proofErr w:type="spellEnd"/>
+            <w:r>
+              <w:rPr>
+                <w:rFonts w:ascii="Times New Roman"/>
+                <w:sz w:val="6"/>
+                <w:szCs w:val="8"/>
+              </w:rPr>
+              <w:t>}</w:t>
             </w:r>
           </w:p>
         </w:tc>
@@ -2838,7 +3398,25 @@
                 <w:sz w:val="6"/>
                 <w:szCs w:val="8"/>
               </w:rPr>
-              <w:t>${sat_check_column}</w:t>
+              <w:t>${</w:t>
+            </w:r>
+            <w:proofErr w:type="spellStart"/>
+            <w:r>
+              <w:rPr>
+                <w:rFonts w:ascii="Times New Roman"/>
+                <w:sz w:val="6"/>
+                <w:szCs w:val="8"/>
+              </w:rPr>
+              <w:t>sat_check_column</w:t>
+            </w:r>
+            <w:proofErr w:type="spellEnd"/>
+            <w:r>
+              <w:rPr>
+                <w:rFonts w:ascii="Times New Roman"/>
+                <w:sz w:val="6"/>
+                <w:szCs w:val="8"/>
+              </w:rPr>
+              <w:t>}</w:t>
             </w:r>
           </w:p>
         </w:tc>
@@ -2948,7 +3526,25 @@
                 <w:sz w:val="6"/>
                 <w:szCs w:val="8"/>
               </w:rPr>
-              <w:t>${fri_check_column}</w:t>
+              <w:t>${</w:t>
+            </w:r>
+            <w:proofErr w:type="spellStart"/>
+            <w:r>
+              <w:rPr>
+                <w:rFonts w:ascii="Times New Roman"/>
+                <w:sz w:val="6"/>
+                <w:szCs w:val="8"/>
+              </w:rPr>
+              <w:t>fri_check_column</w:t>
+            </w:r>
+            <w:proofErr w:type="spellEnd"/>
+            <w:r>
+              <w:rPr>
+                <w:rFonts w:ascii="Times New Roman"/>
+                <w:sz w:val="6"/>
+                <w:szCs w:val="8"/>
+              </w:rPr>
+              <w:t>}</w:t>
             </w:r>
           </w:p>
         </w:tc>
@@ -2963,7 +3559,25 @@
                 <w:sz w:val="6"/>
                 <w:szCs w:val="8"/>
               </w:rPr>
-              <w:t>${thu_check_column}</w:t>
+              <w:t>${</w:t>
+            </w:r>
+            <w:proofErr w:type="spellStart"/>
+            <w:r>
+              <w:rPr>
+                <w:rFonts w:ascii="Times New Roman"/>
+                <w:sz w:val="6"/>
+                <w:szCs w:val="8"/>
+              </w:rPr>
+              <w:t>thu_check_column</w:t>
+            </w:r>
+            <w:proofErr w:type="spellEnd"/>
+            <w:r>
+              <w:rPr>
+                <w:rFonts w:ascii="Times New Roman"/>
+                <w:sz w:val="6"/>
+                <w:szCs w:val="8"/>
+              </w:rPr>
+              <w:t>}</w:t>
             </w:r>
           </w:p>
         </w:tc>
@@ -2978,7 +3592,25 @@
                 <w:sz w:val="6"/>
                 <w:szCs w:val="8"/>
               </w:rPr>
-              <w:t>${wed_check_column}</w:t>
+              <w:t>${</w:t>
+            </w:r>
+            <w:proofErr w:type="spellStart"/>
+            <w:r>
+              <w:rPr>
+                <w:rFonts w:ascii="Times New Roman"/>
+                <w:sz w:val="6"/>
+                <w:szCs w:val="8"/>
+              </w:rPr>
+              <w:t>wed_check_column</w:t>
+            </w:r>
+            <w:proofErr w:type="spellEnd"/>
+            <w:r>
+              <w:rPr>
+                <w:rFonts w:ascii="Times New Roman"/>
+                <w:sz w:val="6"/>
+                <w:szCs w:val="8"/>
+              </w:rPr>
+              <w:t>}</w:t>
             </w:r>
           </w:p>
         </w:tc>
@@ -2993,7 +3625,25 @@
                 <w:sz w:val="6"/>
                 <w:szCs w:val="8"/>
               </w:rPr>
-              <w:t>${tue_check_column}</w:t>
+              <w:t>${</w:t>
+            </w:r>
+            <w:proofErr w:type="spellStart"/>
+            <w:r>
+              <w:rPr>
+                <w:rFonts w:ascii="Times New Roman"/>
+                <w:sz w:val="6"/>
+                <w:szCs w:val="8"/>
+              </w:rPr>
+              <w:t>tue_check_column</w:t>
+            </w:r>
+            <w:proofErr w:type="spellEnd"/>
+            <w:r>
+              <w:rPr>
+                <w:rFonts w:ascii="Times New Roman"/>
+                <w:sz w:val="6"/>
+                <w:szCs w:val="8"/>
+              </w:rPr>
+              <w:t>}</w:t>
             </w:r>
           </w:p>
         </w:tc>
@@ -3008,7 +3658,25 @@
                 <w:sz w:val="6"/>
                 <w:szCs w:val="8"/>
               </w:rPr>
-              <w:t>${mon_check_column}</w:t>
+              <w:t>${</w:t>
+            </w:r>
+            <w:proofErr w:type="spellStart"/>
+            <w:r>
+              <w:rPr>
+                <w:rFonts w:ascii="Times New Roman"/>
+                <w:sz w:val="6"/>
+                <w:szCs w:val="8"/>
+              </w:rPr>
+              <w:t>mon_check_column</w:t>
+            </w:r>
+            <w:proofErr w:type="spellEnd"/>
+            <w:r>
+              <w:rPr>
+                <w:rFonts w:ascii="Times New Roman"/>
+                <w:sz w:val="6"/>
+                <w:szCs w:val="8"/>
+              </w:rPr>
+              <w:t>}</w:t>
             </w:r>
           </w:p>
         </w:tc>
@@ -3023,7 +3691,25 @@
                 <w:sz w:val="6"/>
                 <w:szCs w:val="8"/>
               </w:rPr>
-              <w:t>${sun_check_column}</w:t>
+              <w:t>${</w:t>
+            </w:r>
+            <w:proofErr w:type="spellStart"/>
+            <w:r>
+              <w:rPr>
+                <w:rFonts w:ascii="Times New Roman"/>
+                <w:sz w:val="6"/>
+                <w:szCs w:val="8"/>
+              </w:rPr>
+              <w:t>sun_check_column</w:t>
+            </w:r>
+            <w:proofErr w:type="spellEnd"/>
+            <w:r>
+              <w:rPr>
+                <w:rFonts w:ascii="Times New Roman"/>
+                <w:sz w:val="6"/>
+                <w:szCs w:val="8"/>
+              </w:rPr>
+              <w:t>}</w:t>
             </w:r>
           </w:p>
         </w:tc>
@@ -3038,7 +3724,25 @@
                 <w:sz w:val="6"/>
                 <w:szCs w:val="8"/>
               </w:rPr>
-              <w:t>${sat_check_column}</w:t>
+              <w:t>${</w:t>
+            </w:r>
+            <w:proofErr w:type="spellStart"/>
+            <w:r>
+              <w:rPr>
+                <w:rFonts w:ascii="Times New Roman"/>
+                <w:sz w:val="6"/>
+                <w:szCs w:val="8"/>
+              </w:rPr>
+              <w:t>sat_check_column</w:t>
+            </w:r>
+            <w:proofErr w:type="spellEnd"/>
+            <w:r>
+              <w:rPr>
+                <w:rFonts w:ascii="Times New Roman"/>
+                <w:sz w:val="6"/>
+                <w:szCs w:val="8"/>
+              </w:rPr>
+              <w:t>}</w:t>
             </w:r>
           </w:p>
         </w:tc>
@@ -3129,7 +3833,25 @@
                 <w:sz w:val="6"/>
                 <w:szCs w:val="8"/>
               </w:rPr>
-              <w:t>${fri_check_column}</w:t>
+              <w:t>${</w:t>
+            </w:r>
+            <w:proofErr w:type="spellStart"/>
+            <w:r>
+              <w:rPr>
+                <w:rFonts w:ascii="Times New Roman"/>
+                <w:sz w:val="6"/>
+                <w:szCs w:val="8"/>
+              </w:rPr>
+              <w:t>fri_check_column</w:t>
+            </w:r>
+            <w:proofErr w:type="spellEnd"/>
+            <w:r>
+              <w:rPr>
+                <w:rFonts w:ascii="Times New Roman"/>
+                <w:sz w:val="6"/>
+                <w:szCs w:val="8"/>
+              </w:rPr>
+              <w:t>}</w:t>
             </w:r>
           </w:p>
         </w:tc>
@@ -3144,7 +3866,25 @@
                 <w:sz w:val="6"/>
                 <w:szCs w:val="8"/>
               </w:rPr>
-              <w:t>${thu_check_column}</w:t>
+              <w:t>${</w:t>
+            </w:r>
+            <w:proofErr w:type="spellStart"/>
+            <w:r>
+              <w:rPr>
+                <w:rFonts w:ascii="Times New Roman"/>
+                <w:sz w:val="6"/>
+                <w:szCs w:val="8"/>
+              </w:rPr>
+              <w:t>thu_check_column</w:t>
+            </w:r>
+            <w:proofErr w:type="spellEnd"/>
+            <w:r>
+              <w:rPr>
+                <w:rFonts w:ascii="Times New Roman"/>
+                <w:sz w:val="6"/>
+                <w:szCs w:val="8"/>
+              </w:rPr>
+              <w:t>}</w:t>
             </w:r>
           </w:p>
         </w:tc>
@@ -3159,7 +3899,25 @@
                 <w:sz w:val="6"/>
                 <w:szCs w:val="8"/>
               </w:rPr>
-              <w:t>${wed_check_column}</w:t>
+              <w:t>${</w:t>
+            </w:r>
+            <w:proofErr w:type="spellStart"/>
+            <w:r>
+              <w:rPr>
+                <w:rFonts w:ascii="Times New Roman"/>
+                <w:sz w:val="6"/>
+                <w:szCs w:val="8"/>
+              </w:rPr>
+              <w:t>wed_check_column</w:t>
+            </w:r>
+            <w:proofErr w:type="spellEnd"/>
+            <w:r>
+              <w:rPr>
+                <w:rFonts w:ascii="Times New Roman"/>
+                <w:sz w:val="6"/>
+                <w:szCs w:val="8"/>
+              </w:rPr>
+              <w:t>}</w:t>
             </w:r>
           </w:p>
         </w:tc>
@@ -3174,7 +3932,25 @@
                 <w:sz w:val="6"/>
                 <w:szCs w:val="8"/>
               </w:rPr>
-              <w:t>${tue_check_column}</w:t>
+              <w:t>${</w:t>
+            </w:r>
+            <w:proofErr w:type="spellStart"/>
+            <w:r>
+              <w:rPr>
+                <w:rFonts w:ascii="Times New Roman"/>
+                <w:sz w:val="6"/>
+                <w:szCs w:val="8"/>
+              </w:rPr>
+              <w:t>tue_check_column</w:t>
+            </w:r>
+            <w:proofErr w:type="spellEnd"/>
+            <w:r>
+              <w:rPr>
+                <w:rFonts w:ascii="Times New Roman"/>
+                <w:sz w:val="6"/>
+                <w:szCs w:val="8"/>
+              </w:rPr>
+              <w:t>}</w:t>
             </w:r>
           </w:p>
         </w:tc>
@@ -3189,7 +3965,25 @@
                 <w:sz w:val="6"/>
                 <w:szCs w:val="8"/>
               </w:rPr>
-              <w:t>${mon_check_column}</w:t>
+              <w:t>${</w:t>
+            </w:r>
+            <w:proofErr w:type="spellStart"/>
+            <w:r>
+              <w:rPr>
+                <w:rFonts w:ascii="Times New Roman"/>
+                <w:sz w:val="6"/>
+                <w:szCs w:val="8"/>
+              </w:rPr>
+              <w:t>mon_check_column</w:t>
+            </w:r>
+            <w:proofErr w:type="spellEnd"/>
+            <w:r>
+              <w:rPr>
+                <w:rFonts w:ascii="Times New Roman"/>
+                <w:sz w:val="6"/>
+                <w:szCs w:val="8"/>
+              </w:rPr>
+              <w:t>}</w:t>
             </w:r>
           </w:p>
         </w:tc>
@@ -3204,7 +3998,25 @@
                 <w:sz w:val="6"/>
                 <w:szCs w:val="8"/>
               </w:rPr>
-              <w:t>${sun_check_column}</w:t>
+              <w:t>${</w:t>
+            </w:r>
+            <w:proofErr w:type="spellStart"/>
+            <w:r>
+              <w:rPr>
+                <w:rFonts w:ascii="Times New Roman"/>
+                <w:sz w:val="6"/>
+                <w:szCs w:val="8"/>
+              </w:rPr>
+              <w:t>sun_check_column</w:t>
+            </w:r>
+            <w:proofErr w:type="spellEnd"/>
+            <w:r>
+              <w:rPr>
+                <w:rFonts w:ascii="Times New Roman"/>
+                <w:sz w:val="6"/>
+                <w:szCs w:val="8"/>
+              </w:rPr>
+              <w:t>}</w:t>
             </w:r>
           </w:p>
         </w:tc>
@@ -3219,7 +4031,25 @@
                 <w:sz w:val="6"/>
                 <w:szCs w:val="8"/>
               </w:rPr>
-              <w:t>${sat_check_column}</w:t>
+              <w:t>${</w:t>
+            </w:r>
+            <w:proofErr w:type="spellStart"/>
+            <w:r>
+              <w:rPr>
+                <w:rFonts w:ascii="Times New Roman"/>
+                <w:sz w:val="6"/>
+                <w:szCs w:val="8"/>
+              </w:rPr>
+              <w:t>sat_check_column</w:t>
+            </w:r>
+            <w:proofErr w:type="spellEnd"/>
+            <w:r>
+              <w:rPr>
+                <w:rFonts w:ascii="Times New Roman"/>
+                <w:sz w:val="6"/>
+                <w:szCs w:val="8"/>
+              </w:rPr>
+              <w:t>}</w:t>
             </w:r>
           </w:p>
         </w:tc>
@@ -3310,7 +4140,25 @@
                 <w:sz w:val="6"/>
                 <w:szCs w:val="8"/>
               </w:rPr>
-              <w:t>${fri_check_column}</w:t>
+              <w:t>${</w:t>
+            </w:r>
+            <w:proofErr w:type="spellStart"/>
+            <w:r>
+              <w:rPr>
+                <w:rFonts w:ascii="Times New Roman"/>
+                <w:sz w:val="6"/>
+                <w:szCs w:val="8"/>
+              </w:rPr>
+              <w:t>fri_check_column</w:t>
+            </w:r>
+            <w:proofErr w:type="spellEnd"/>
+            <w:r>
+              <w:rPr>
+                <w:rFonts w:ascii="Times New Roman"/>
+                <w:sz w:val="6"/>
+                <w:szCs w:val="8"/>
+              </w:rPr>
+              <w:t>}</w:t>
             </w:r>
           </w:p>
         </w:tc>
@@ -3325,7 +4173,25 @@
                 <w:sz w:val="6"/>
                 <w:szCs w:val="8"/>
               </w:rPr>
-              <w:t>${thu_check_column}</w:t>
+              <w:t>${</w:t>
+            </w:r>
+            <w:proofErr w:type="spellStart"/>
+            <w:r>
+              <w:rPr>
+                <w:rFonts w:ascii="Times New Roman"/>
+                <w:sz w:val="6"/>
+                <w:szCs w:val="8"/>
+              </w:rPr>
+              <w:t>thu_check_column</w:t>
+            </w:r>
+            <w:proofErr w:type="spellEnd"/>
+            <w:r>
+              <w:rPr>
+                <w:rFonts w:ascii="Times New Roman"/>
+                <w:sz w:val="6"/>
+                <w:szCs w:val="8"/>
+              </w:rPr>
+              <w:t>}</w:t>
             </w:r>
           </w:p>
         </w:tc>
@@ -3340,7 +4206,25 @@
                 <w:sz w:val="6"/>
                 <w:szCs w:val="8"/>
               </w:rPr>
-              <w:t>${wed_check_column}</w:t>
+              <w:t>${</w:t>
+            </w:r>
+            <w:proofErr w:type="spellStart"/>
+            <w:r>
+              <w:rPr>
+                <w:rFonts w:ascii="Times New Roman"/>
+                <w:sz w:val="6"/>
+                <w:szCs w:val="8"/>
+              </w:rPr>
+              <w:t>wed_check_column</w:t>
+            </w:r>
+            <w:proofErr w:type="spellEnd"/>
+            <w:r>
+              <w:rPr>
+                <w:rFonts w:ascii="Times New Roman"/>
+                <w:sz w:val="6"/>
+                <w:szCs w:val="8"/>
+              </w:rPr>
+              <w:t>}</w:t>
             </w:r>
           </w:p>
         </w:tc>
@@ -3355,7 +4239,25 @@
                 <w:sz w:val="6"/>
                 <w:szCs w:val="8"/>
               </w:rPr>
-              <w:t>${tue_check_column}</w:t>
+              <w:t>${</w:t>
+            </w:r>
+            <w:proofErr w:type="spellStart"/>
+            <w:r>
+              <w:rPr>
+                <w:rFonts w:ascii="Times New Roman"/>
+                <w:sz w:val="6"/>
+                <w:szCs w:val="8"/>
+              </w:rPr>
+              <w:t>tue_check_column</w:t>
+            </w:r>
+            <w:proofErr w:type="spellEnd"/>
+            <w:r>
+              <w:rPr>
+                <w:rFonts w:ascii="Times New Roman"/>
+                <w:sz w:val="6"/>
+                <w:szCs w:val="8"/>
+              </w:rPr>
+              <w:t>}</w:t>
             </w:r>
           </w:p>
         </w:tc>
@@ -3370,7 +4272,25 @@
                 <w:sz w:val="6"/>
                 <w:szCs w:val="8"/>
               </w:rPr>
-              <w:t>${mon_check_column}</w:t>
+              <w:t>${</w:t>
+            </w:r>
+            <w:proofErr w:type="spellStart"/>
+            <w:r>
+              <w:rPr>
+                <w:rFonts w:ascii="Times New Roman"/>
+                <w:sz w:val="6"/>
+                <w:szCs w:val="8"/>
+              </w:rPr>
+              <w:t>mon_check_column</w:t>
+            </w:r>
+            <w:proofErr w:type="spellEnd"/>
+            <w:r>
+              <w:rPr>
+                <w:rFonts w:ascii="Times New Roman"/>
+                <w:sz w:val="6"/>
+                <w:szCs w:val="8"/>
+              </w:rPr>
+              <w:t>}</w:t>
             </w:r>
           </w:p>
         </w:tc>
@@ -3385,7 +4305,25 @@
                 <w:sz w:val="6"/>
                 <w:szCs w:val="8"/>
               </w:rPr>
-              <w:t>${sun_check_column}</w:t>
+              <w:t>${</w:t>
+            </w:r>
+            <w:proofErr w:type="spellStart"/>
+            <w:r>
+              <w:rPr>
+                <w:rFonts w:ascii="Times New Roman"/>
+                <w:sz w:val="6"/>
+                <w:szCs w:val="8"/>
+              </w:rPr>
+              <w:t>sun_check_column</w:t>
+            </w:r>
+            <w:proofErr w:type="spellEnd"/>
+            <w:r>
+              <w:rPr>
+                <w:rFonts w:ascii="Times New Roman"/>
+                <w:sz w:val="6"/>
+                <w:szCs w:val="8"/>
+              </w:rPr>
+              <w:t>}</w:t>
             </w:r>
           </w:p>
         </w:tc>
@@ -3400,7 +4338,25 @@
                 <w:sz w:val="6"/>
                 <w:szCs w:val="8"/>
               </w:rPr>
-              <w:t>${sat_check_column}</w:t>
+              <w:t>${</w:t>
+            </w:r>
+            <w:proofErr w:type="spellStart"/>
+            <w:r>
+              <w:rPr>
+                <w:rFonts w:ascii="Times New Roman"/>
+                <w:sz w:val="6"/>
+                <w:szCs w:val="8"/>
+              </w:rPr>
+              <w:t>sat_check_column</w:t>
+            </w:r>
+            <w:proofErr w:type="spellEnd"/>
+            <w:r>
+              <w:rPr>
+                <w:rFonts w:ascii="Times New Roman"/>
+                <w:sz w:val="6"/>
+                <w:szCs w:val="8"/>
+              </w:rPr>
+              <w:t>}</w:t>
             </w:r>
           </w:p>
         </w:tc>
@@ -3491,7 +4447,25 @@
                 <w:sz w:val="6"/>
                 <w:szCs w:val="8"/>
               </w:rPr>
-              <w:t>${fri_check_column}</w:t>
+              <w:t>${</w:t>
+            </w:r>
+            <w:proofErr w:type="spellStart"/>
+            <w:r>
+              <w:rPr>
+                <w:rFonts w:ascii="Times New Roman"/>
+                <w:sz w:val="6"/>
+                <w:szCs w:val="8"/>
+              </w:rPr>
+              <w:t>fri_check_column</w:t>
+            </w:r>
+            <w:proofErr w:type="spellEnd"/>
+            <w:r>
+              <w:rPr>
+                <w:rFonts w:ascii="Times New Roman"/>
+                <w:sz w:val="6"/>
+                <w:szCs w:val="8"/>
+              </w:rPr>
+              <w:t>}</w:t>
             </w:r>
           </w:p>
         </w:tc>
@@ -3506,7 +4480,25 @@
                 <w:sz w:val="6"/>
                 <w:szCs w:val="8"/>
               </w:rPr>
-              <w:t>${thu_check_column}</w:t>
+              <w:t>${</w:t>
+            </w:r>
+            <w:proofErr w:type="spellStart"/>
+            <w:r>
+              <w:rPr>
+                <w:rFonts w:ascii="Times New Roman"/>
+                <w:sz w:val="6"/>
+                <w:szCs w:val="8"/>
+              </w:rPr>
+              <w:t>thu_check_column</w:t>
+            </w:r>
+            <w:proofErr w:type="spellEnd"/>
+            <w:r>
+              <w:rPr>
+                <w:rFonts w:ascii="Times New Roman"/>
+                <w:sz w:val="6"/>
+                <w:szCs w:val="8"/>
+              </w:rPr>
+              <w:t>}</w:t>
             </w:r>
           </w:p>
         </w:tc>
@@ -3521,7 +4513,25 @@
                 <w:sz w:val="6"/>
                 <w:szCs w:val="8"/>
               </w:rPr>
-              <w:t>${wed_check_column}</w:t>
+              <w:t>${</w:t>
+            </w:r>
+            <w:proofErr w:type="spellStart"/>
+            <w:r>
+              <w:rPr>
+                <w:rFonts w:ascii="Times New Roman"/>
+                <w:sz w:val="6"/>
+                <w:szCs w:val="8"/>
+              </w:rPr>
+              <w:t>wed_check_column</w:t>
+            </w:r>
+            <w:proofErr w:type="spellEnd"/>
+            <w:r>
+              <w:rPr>
+                <w:rFonts w:ascii="Times New Roman"/>
+                <w:sz w:val="6"/>
+                <w:szCs w:val="8"/>
+              </w:rPr>
+              <w:t>}</w:t>
             </w:r>
           </w:p>
         </w:tc>
@@ -3536,7 +4546,25 @@
                 <w:sz w:val="6"/>
                 <w:szCs w:val="8"/>
               </w:rPr>
-              <w:t>${tue_check_column}</w:t>
+              <w:t>${</w:t>
+            </w:r>
+            <w:proofErr w:type="spellStart"/>
+            <w:r>
+              <w:rPr>
+                <w:rFonts w:ascii="Times New Roman"/>
+                <w:sz w:val="6"/>
+                <w:szCs w:val="8"/>
+              </w:rPr>
+              <w:t>tue_check_column</w:t>
+            </w:r>
+            <w:proofErr w:type="spellEnd"/>
+            <w:r>
+              <w:rPr>
+                <w:rFonts w:ascii="Times New Roman"/>
+                <w:sz w:val="6"/>
+                <w:szCs w:val="8"/>
+              </w:rPr>
+              <w:t>}</w:t>
             </w:r>
           </w:p>
         </w:tc>
@@ -3551,7 +4579,25 @@
                 <w:sz w:val="6"/>
                 <w:szCs w:val="8"/>
               </w:rPr>
-              <w:t>${mon_check_column}</w:t>
+              <w:t>${</w:t>
+            </w:r>
+            <w:proofErr w:type="spellStart"/>
+            <w:r>
+              <w:rPr>
+                <w:rFonts w:ascii="Times New Roman"/>
+                <w:sz w:val="6"/>
+                <w:szCs w:val="8"/>
+              </w:rPr>
+              <w:t>mon_check_column</w:t>
+            </w:r>
+            <w:proofErr w:type="spellEnd"/>
+            <w:r>
+              <w:rPr>
+                <w:rFonts w:ascii="Times New Roman"/>
+                <w:sz w:val="6"/>
+                <w:szCs w:val="8"/>
+              </w:rPr>
+              <w:t>}</w:t>
             </w:r>
           </w:p>
         </w:tc>
@@ -3566,7 +4612,25 @@
                 <w:sz w:val="6"/>
                 <w:szCs w:val="8"/>
               </w:rPr>
-              <w:t>${sun_check_column}</w:t>
+              <w:t>${</w:t>
+            </w:r>
+            <w:proofErr w:type="spellStart"/>
+            <w:r>
+              <w:rPr>
+                <w:rFonts w:ascii="Times New Roman"/>
+                <w:sz w:val="6"/>
+                <w:szCs w:val="8"/>
+              </w:rPr>
+              <w:t>sun_check_column</w:t>
+            </w:r>
+            <w:proofErr w:type="spellEnd"/>
+            <w:r>
+              <w:rPr>
+                <w:rFonts w:ascii="Times New Roman"/>
+                <w:sz w:val="6"/>
+                <w:szCs w:val="8"/>
+              </w:rPr>
+              <w:t>}</w:t>
             </w:r>
           </w:p>
         </w:tc>
@@ -3581,7 +4645,25 @@
                 <w:sz w:val="6"/>
                 <w:szCs w:val="8"/>
               </w:rPr>
-              <w:t>${sat_check_column}</w:t>
+              <w:t>${</w:t>
+            </w:r>
+            <w:proofErr w:type="spellStart"/>
+            <w:r>
+              <w:rPr>
+                <w:rFonts w:ascii="Times New Roman"/>
+                <w:sz w:val="6"/>
+                <w:szCs w:val="8"/>
+              </w:rPr>
+              <w:t>sat_check_column</w:t>
+            </w:r>
+            <w:proofErr w:type="spellEnd"/>
+            <w:r>
+              <w:rPr>
+                <w:rFonts w:ascii="Times New Roman"/>
+                <w:sz w:val="6"/>
+                <w:szCs w:val="8"/>
+              </w:rPr>
+              <w:t>}</w:t>
             </w:r>
           </w:p>
         </w:tc>
@@ -3681,7 +4763,25 @@
                 <w:sz w:val="6"/>
                 <w:szCs w:val="8"/>
               </w:rPr>
-              <w:t>${fri_check_column}</w:t>
+              <w:t>${</w:t>
+            </w:r>
+            <w:proofErr w:type="spellStart"/>
+            <w:r>
+              <w:rPr>
+                <w:rFonts w:ascii="Times New Roman"/>
+                <w:sz w:val="6"/>
+                <w:szCs w:val="8"/>
+              </w:rPr>
+              <w:t>fri_check_column</w:t>
+            </w:r>
+            <w:proofErr w:type="spellEnd"/>
+            <w:r>
+              <w:rPr>
+                <w:rFonts w:ascii="Times New Roman"/>
+                <w:sz w:val="6"/>
+                <w:szCs w:val="8"/>
+              </w:rPr>
+              <w:t>}</w:t>
             </w:r>
           </w:p>
         </w:tc>
@@ -3696,7 +4796,25 @@
                 <w:sz w:val="6"/>
                 <w:szCs w:val="8"/>
               </w:rPr>
-              <w:t>${thu_check_column}</w:t>
+              <w:t>${</w:t>
+            </w:r>
+            <w:proofErr w:type="spellStart"/>
+            <w:r>
+              <w:rPr>
+                <w:rFonts w:ascii="Times New Roman"/>
+                <w:sz w:val="6"/>
+                <w:szCs w:val="8"/>
+              </w:rPr>
+              <w:t>thu_check_column</w:t>
+            </w:r>
+            <w:proofErr w:type="spellEnd"/>
+            <w:r>
+              <w:rPr>
+                <w:rFonts w:ascii="Times New Roman"/>
+                <w:sz w:val="6"/>
+                <w:szCs w:val="8"/>
+              </w:rPr>
+              <w:t>}</w:t>
             </w:r>
           </w:p>
         </w:tc>
@@ -3711,7 +4829,25 @@
                 <w:sz w:val="6"/>
                 <w:szCs w:val="8"/>
               </w:rPr>
-              <w:t>${wed_check_column}</w:t>
+              <w:t>${</w:t>
+            </w:r>
+            <w:proofErr w:type="spellStart"/>
+            <w:r>
+              <w:rPr>
+                <w:rFonts w:ascii="Times New Roman"/>
+                <w:sz w:val="6"/>
+                <w:szCs w:val="8"/>
+              </w:rPr>
+              <w:t>wed_check_column</w:t>
+            </w:r>
+            <w:proofErr w:type="spellEnd"/>
+            <w:r>
+              <w:rPr>
+                <w:rFonts w:ascii="Times New Roman"/>
+                <w:sz w:val="6"/>
+                <w:szCs w:val="8"/>
+              </w:rPr>
+              <w:t>}</w:t>
             </w:r>
           </w:p>
         </w:tc>
@@ -3726,7 +4862,25 @@
                 <w:sz w:val="6"/>
                 <w:szCs w:val="8"/>
               </w:rPr>
-              <w:t>${tue_check_column}</w:t>
+              <w:t>${</w:t>
+            </w:r>
+            <w:proofErr w:type="spellStart"/>
+            <w:r>
+              <w:rPr>
+                <w:rFonts w:ascii="Times New Roman"/>
+                <w:sz w:val="6"/>
+                <w:szCs w:val="8"/>
+              </w:rPr>
+              <w:t>tue_check_column</w:t>
+            </w:r>
+            <w:proofErr w:type="spellEnd"/>
+            <w:r>
+              <w:rPr>
+                <w:rFonts w:ascii="Times New Roman"/>
+                <w:sz w:val="6"/>
+                <w:szCs w:val="8"/>
+              </w:rPr>
+              <w:t>}</w:t>
             </w:r>
           </w:p>
         </w:tc>
@@ -3741,7 +4895,25 @@
                 <w:sz w:val="6"/>
                 <w:szCs w:val="8"/>
               </w:rPr>
-              <w:t>${mon_check_column}</w:t>
+              <w:t>${</w:t>
+            </w:r>
+            <w:proofErr w:type="spellStart"/>
+            <w:r>
+              <w:rPr>
+                <w:rFonts w:ascii="Times New Roman"/>
+                <w:sz w:val="6"/>
+                <w:szCs w:val="8"/>
+              </w:rPr>
+              <w:t>mon_check_column</w:t>
+            </w:r>
+            <w:proofErr w:type="spellEnd"/>
+            <w:r>
+              <w:rPr>
+                <w:rFonts w:ascii="Times New Roman"/>
+                <w:sz w:val="6"/>
+                <w:szCs w:val="8"/>
+              </w:rPr>
+              <w:t>}</w:t>
             </w:r>
           </w:p>
         </w:tc>
@@ -3756,7 +4928,25 @@
                 <w:sz w:val="6"/>
                 <w:szCs w:val="8"/>
               </w:rPr>
-              <w:t>${sun_check_column}</w:t>
+              <w:t>${</w:t>
+            </w:r>
+            <w:proofErr w:type="spellStart"/>
+            <w:r>
+              <w:rPr>
+                <w:rFonts w:ascii="Times New Roman"/>
+                <w:sz w:val="6"/>
+                <w:szCs w:val="8"/>
+              </w:rPr>
+              <w:t>sun_check_column</w:t>
+            </w:r>
+            <w:proofErr w:type="spellEnd"/>
+            <w:r>
+              <w:rPr>
+                <w:rFonts w:ascii="Times New Roman"/>
+                <w:sz w:val="6"/>
+                <w:szCs w:val="8"/>
+              </w:rPr>
+              <w:t>}</w:t>
             </w:r>
           </w:p>
         </w:tc>
@@ -3771,7 +4961,25 @@
                 <w:sz w:val="6"/>
                 <w:szCs w:val="8"/>
               </w:rPr>
-              <w:t>${sat_check_column}</w:t>
+              <w:t>${</w:t>
+            </w:r>
+            <w:proofErr w:type="spellStart"/>
+            <w:r>
+              <w:rPr>
+                <w:rFonts w:ascii="Times New Roman"/>
+                <w:sz w:val="6"/>
+                <w:szCs w:val="8"/>
+              </w:rPr>
+              <w:t>sat_check_column</w:t>
+            </w:r>
+            <w:proofErr w:type="spellEnd"/>
+            <w:r>
+              <w:rPr>
+                <w:rFonts w:ascii="Times New Roman"/>
+                <w:sz w:val="6"/>
+                <w:szCs w:val="8"/>
+              </w:rPr>
+              <w:t>}</w:t>
             </w:r>
           </w:p>
         </w:tc>
@@ -3862,7 +5070,25 @@
                 <w:sz w:val="6"/>
                 <w:szCs w:val="8"/>
               </w:rPr>
-              <w:t>${fri_check_column}</w:t>
+              <w:t>${</w:t>
+            </w:r>
+            <w:proofErr w:type="spellStart"/>
+            <w:r>
+              <w:rPr>
+                <w:rFonts w:ascii="Times New Roman"/>
+                <w:sz w:val="6"/>
+                <w:szCs w:val="8"/>
+              </w:rPr>
+              <w:t>fri_check_column</w:t>
+            </w:r>
+            <w:proofErr w:type="spellEnd"/>
+            <w:r>
+              <w:rPr>
+                <w:rFonts w:ascii="Times New Roman"/>
+                <w:sz w:val="6"/>
+                <w:szCs w:val="8"/>
+              </w:rPr>
+              <w:t>}</w:t>
             </w:r>
           </w:p>
         </w:tc>
@@ -3877,7 +5103,25 @@
                 <w:sz w:val="6"/>
                 <w:szCs w:val="8"/>
               </w:rPr>
-              <w:t>${thu_check_column}</w:t>
+              <w:t>${</w:t>
+            </w:r>
+            <w:proofErr w:type="spellStart"/>
+            <w:r>
+              <w:rPr>
+                <w:rFonts w:ascii="Times New Roman"/>
+                <w:sz w:val="6"/>
+                <w:szCs w:val="8"/>
+              </w:rPr>
+              <w:t>thu_check_column</w:t>
+            </w:r>
+            <w:proofErr w:type="spellEnd"/>
+            <w:r>
+              <w:rPr>
+                <w:rFonts w:ascii="Times New Roman"/>
+                <w:sz w:val="6"/>
+                <w:szCs w:val="8"/>
+              </w:rPr>
+              <w:t>}</w:t>
             </w:r>
           </w:p>
         </w:tc>
@@ -3892,7 +5136,25 @@
                 <w:sz w:val="6"/>
                 <w:szCs w:val="8"/>
               </w:rPr>
-              <w:t>${wed_check_column}</w:t>
+              <w:t>${</w:t>
+            </w:r>
+            <w:proofErr w:type="spellStart"/>
+            <w:r>
+              <w:rPr>
+                <w:rFonts w:ascii="Times New Roman"/>
+                <w:sz w:val="6"/>
+                <w:szCs w:val="8"/>
+              </w:rPr>
+              <w:t>wed_check_column</w:t>
+            </w:r>
+            <w:proofErr w:type="spellEnd"/>
+            <w:r>
+              <w:rPr>
+                <w:rFonts w:ascii="Times New Roman"/>
+                <w:sz w:val="6"/>
+                <w:szCs w:val="8"/>
+              </w:rPr>
+              <w:t>}</w:t>
             </w:r>
           </w:p>
         </w:tc>
@@ -3907,7 +5169,25 @@
                 <w:sz w:val="6"/>
                 <w:szCs w:val="8"/>
               </w:rPr>
-              <w:t>${tue_check_column}</w:t>
+              <w:t>${</w:t>
+            </w:r>
+            <w:proofErr w:type="spellStart"/>
+            <w:r>
+              <w:rPr>
+                <w:rFonts w:ascii="Times New Roman"/>
+                <w:sz w:val="6"/>
+                <w:szCs w:val="8"/>
+              </w:rPr>
+              <w:t>tue_check_column</w:t>
+            </w:r>
+            <w:proofErr w:type="spellEnd"/>
+            <w:r>
+              <w:rPr>
+                <w:rFonts w:ascii="Times New Roman"/>
+                <w:sz w:val="6"/>
+                <w:szCs w:val="8"/>
+              </w:rPr>
+              <w:t>}</w:t>
             </w:r>
           </w:p>
         </w:tc>
@@ -3922,7 +5202,25 @@
                 <w:sz w:val="6"/>
                 <w:szCs w:val="8"/>
               </w:rPr>
-              <w:t>${mon_check_column}</w:t>
+              <w:t>${</w:t>
+            </w:r>
+            <w:proofErr w:type="spellStart"/>
+            <w:r>
+              <w:rPr>
+                <w:rFonts w:ascii="Times New Roman"/>
+                <w:sz w:val="6"/>
+                <w:szCs w:val="8"/>
+              </w:rPr>
+              <w:t>mon_check_column</w:t>
+            </w:r>
+            <w:proofErr w:type="spellEnd"/>
+            <w:r>
+              <w:rPr>
+                <w:rFonts w:ascii="Times New Roman"/>
+                <w:sz w:val="6"/>
+                <w:szCs w:val="8"/>
+              </w:rPr>
+              <w:t>}</w:t>
             </w:r>
           </w:p>
         </w:tc>
@@ -3937,7 +5235,25 @@
                 <w:sz w:val="6"/>
                 <w:szCs w:val="8"/>
               </w:rPr>
-              <w:t>${sun_check_column}</w:t>
+              <w:t>${</w:t>
+            </w:r>
+            <w:proofErr w:type="spellStart"/>
+            <w:r>
+              <w:rPr>
+                <w:rFonts w:ascii="Times New Roman"/>
+                <w:sz w:val="6"/>
+                <w:szCs w:val="8"/>
+              </w:rPr>
+              <w:t>sun_check_column</w:t>
+            </w:r>
+            <w:proofErr w:type="spellEnd"/>
+            <w:r>
+              <w:rPr>
+                <w:rFonts w:ascii="Times New Roman"/>
+                <w:sz w:val="6"/>
+                <w:szCs w:val="8"/>
+              </w:rPr>
+              <w:t>}</w:t>
             </w:r>
           </w:p>
         </w:tc>
@@ -3952,7 +5268,25 @@
                 <w:sz w:val="6"/>
                 <w:szCs w:val="8"/>
               </w:rPr>
-              <w:t>${sat_check_column}</w:t>
+              <w:t>${</w:t>
+            </w:r>
+            <w:proofErr w:type="spellStart"/>
+            <w:r>
+              <w:rPr>
+                <w:rFonts w:ascii="Times New Roman"/>
+                <w:sz w:val="6"/>
+                <w:szCs w:val="8"/>
+              </w:rPr>
+              <w:t>sat_check_column</w:t>
+            </w:r>
+            <w:proofErr w:type="spellEnd"/>
+            <w:r>
+              <w:rPr>
+                <w:rFonts w:ascii="Times New Roman"/>
+                <w:sz w:val="6"/>
+                <w:szCs w:val="8"/>
+              </w:rPr>
+              <w:t>}</w:t>
             </w:r>
           </w:p>
         </w:tc>
@@ -4033,7 +5367,25 @@
                 <w:sz w:val="6"/>
                 <w:szCs w:val="8"/>
               </w:rPr>
-              <w:t>${fri_check_column}</w:t>
+              <w:t>${</w:t>
+            </w:r>
+            <w:proofErr w:type="spellStart"/>
+            <w:r>
+              <w:rPr>
+                <w:rFonts w:ascii="Times New Roman"/>
+                <w:sz w:val="6"/>
+                <w:szCs w:val="8"/>
+              </w:rPr>
+              <w:t>fri_check_column</w:t>
+            </w:r>
+            <w:proofErr w:type="spellEnd"/>
+            <w:r>
+              <w:rPr>
+                <w:rFonts w:ascii="Times New Roman"/>
+                <w:sz w:val="6"/>
+                <w:szCs w:val="8"/>
+              </w:rPr>
+              <w:t>}</w:t>
             </w:r>
           </w:p>
         </w:tc>
@@ -4048,7 +5400,25 @@
                 <w:sz w:val="6"/>
                 <w:szCs w:val="8"/>
               </w:rPr>
-              <w:t>${thu_check_column}</w:t>
+              <w:t>${</w:t>
+            </w:r>
+            <w:proofErr w:type="spellStart"/>
+            <w:r>
+              <w:rPr>
+                <w:rFonts w:ascii="Times New Roman"/>
+                <w:sz w:val="6"/>
+                <w:szCs w:val="8"/>
+              </w:rPr>
+              <w:t>thu_check_column</w:t>
+            </w:r>
+            <w:proofErr w:type="spellEnd"/>
+            <w:r>
+              <w:rPr>
+                <w:rFonts w:ascii="Times New Roman"/>
+                <w:sz w:val="6"/>
+                <w:szCs w:val="8"/>
+              </w:rPr>
+              <w:t>}</w:t>
             </w:r>
           </w:p>
         </w:tc>
@@ -4063,7 +5433,25 @@
                 <w:sz w:val="6"/>
                 <w:szCs w:val="8"/>
               </w:rPr>
-              <w:t>${wed_check_column}</w:t>
+              <w:t>${</w:t>
+            </w:r>
+            <w:proofErr w:type="spellStart"/>
+            <w:r>
+              <w:rPr>
+                <w:rFonts w:ascii="Times New Roman"/>
+                <w:sz w:val="6"/>
+                <w:szCs w:val="8"/>
+              </w:rPr>
+              <w:t>wed_check_column</w:t>
+            </w:r>
+            <w:proofErr w:type="spellEnd"/>
+            <w:r>
+              <w:rPr>
+                <w:rFonts w:ascii="Times New Roman"/>
+                <w:sz w:val="6"/>
+                <w:szCs w:val="8"/>
+              </w:rPr>
+              <w:t>}</w:t>
             </w:r>
           </w:p>
         </w:tc>
@@ -4078,7 +5466,25 @@
                 <w:sz w:val="6"/>
                 <w:szCs w:val="8"/>
               </w:rPr>
-              <w:t>${tue_check_column}</w:t>
+              <w:t>${</w:t>
+            </w:r>
+            <w:proofErr w:type="spellStart"/>
+            <w:r>
+              <w:rPr>
+                <w:rFonts w:ascii="Times New Roman"/>
+                <w:sz w:val="6"/>
+                <w:szCs w:val="8"/>
+              </w:rPr>
+              <w:t>tue_check_column</w:t>
+            </w:r>
+            <w:proofErr w:type="spellEnd"/>
+            <w:r>
+              <w:rPr>
+                <w:rFonts w:ascii="Times New Roman"/>
+                <w:sz w:val="6"/>
+                <w:szCs w:val="8"/>
+              </w:rPr>
+              <w:t>}</w:t>
             </w:r>
           </w:p>
         </w:tc>
@@ -4093,7 +5499,25 @@
                 <w:sz w:val="6"/>
                 <w:szCs w:val="8"/>
               </w:rPr>
-              <w:t>${mon_check_column}</w:t>
+              <w:t>${</w:t>
+            </w:r>
+            <w:proofErr w:type="spellStart"/>
+            <w:r>
+              <w:rPr>
+                <w:rFonts w:ascii="Times New Roman"/>
+                <w:sz w:val="6"/>
+                <w:szCs w:val="8"/>
+              </w:rPr>
+              <w:t>mon_check_column</w:t>
+            </w:r>
+            <w:proofErr w:type="spellEnd"/>
+            <w:r>
+              <w:rPr>
+                <w:rFonts w:ascii="Times New Roman"/>
+                <w:sz w:val="6"/>
+                <w:szCs w:val="8"/>
+              </w:rPr>
+              <w:t>}</w:t>
             </w:r>
           </w:p>
         </w:tc>
@@ -4108,7 +5532,25 @@
                 <w:sz w:val="6"/>
                 <w:szCs w:val="8"/>
               </w:rPr>
-              <w:t>${sun_check_column}</w:t>
+              <w:t>${</w:t>
+            </w:r>
+            <w:proofErr w:type="spellStart"/>
+            <w:r>
+              <w:rPr>
+                <w:rFonts w:ascii="Times New Roman"/>
+                <w:sz w:val="6"/>
+                <w:szCs w:val="8"/>
+              </w:rPr>
+              <w:t>sun_check_column</w:t>
+            </w:r>
+            <w:proofErr w:type="spellEnd"/>
+            <w:r>
+              <w:rPr>
+                <w:rFonts w:ascii="Times New Roman"/>
+                <w:sz w:val="6"/>
+                <w:szCs w:val="8"/>
+              </w:rPr>
+              <w:t>}</w:t>
             </w:r>
           </w:p>
         </w:tc>
@@ -4123,7 +5565,25 @@
                 <w:sz w:val="6"/>
                 <w:szCs w:val="8"/>
               </w:rPr>
-              <w:t>${sat_check_column}</w:t>
+              <w:t>${</w:t>
+            </w:r>
+            <w:proofErr w:type="spellStart"/>
+            <w:r>
+              <w:rPr>
+                <w:rFonts w:ascii="Times New Roman"/>
+                <w:sz w:val="6"/>
+                <w:szCs w:val="8"/>
+              </w:rPr>
+              <w:t>sat_check_column</w:t>
+            </w:r>
+            <w:proofErr w:type="spellEnd"/>
+            <w:r>
+              <w:rPr>
+                <w:rFonts w:ascii="Times New Roman"/>
+                <w:sz w:val="6"/>
+                <w:szCs w:val="8"/>
+              </w:rPr>
+              <w:t>}</w:t>
             </w:r>
           </w:p>
         </w:tc>
@@ -4204,7 +5664,25 @@
                 <w:sz w:val="6"/>
                 <w:szCs w:val="8"/>
               </w:rPr>
-              <w:t>${fri_check_column}</w:t>
+              <w:t>${</w:t>
+            </w:r>
+            <w:proofErr w:type="spellStart"/>
+            <w:r>
+              <w:rPr>
+                <w:rFonts w:ascii="Times New Roman"/>
+                <w:sz w:val="6"/>
+                <w:szCs w:val="8"/>
+              </w:rPr>
+              <w:t>fri_check_column</w:t>
+            </w:r>
+            <w:proofErr w:type="spellEnd"/>
+            <w:r>
+              <w:rPr>
+                <w:rFonts w:ascii="Times New Roman"/>
+                <w:sz w:val="6"/>
+                <w:szCs w:val="8"/>
+              </w:rPr>
+              <w:t>}</w:t>
             </w:r>
           </w:p>
         </w:tc>
@@ -4219,7 +5697,25 @@
                 <w:sz w:val="6"/>
                 <w:szCs w:val="8"/>
               </w:rPr>
-              <w:t>${thu_check_column}</w:t>
+              <w:t>${</w:t>
+            </w:r>
+            <w:proofErr w:type="spellStart"/>
+            <w:r>
+              <w:rPr>
+                <w:rFonts w:ascii="Times New Roman"/>
+                <w:sz w:val="6"/>
+                <w:szCs w:val="8"/>
+              </w:rPr>
+              <w:t>thu_check_column</w:t>
+            </w:r>
+            <w:proofErr w:type="spellEnd"/>
+            <w:r>
+              <w:rPr>
+                <w:rFonts w:ascii="Times New Roman"/>
+                <w:sz w:val="6"/>
+                <w:szCs w:val="8"/>
+              </w:rPr>
+              <w:t>}</w:t>
             </w:r>
           </w:p>
         </w:tc>
@@ -4234,7 +5730,25 @@
                 <w:sz w:val="6"/>
                 <w:szCs w:val="8"/>
               </w:rPr>
-              <w:t>${wed_check_column}</w:t>
+              <w:t>${</w:t>
+            </w:r>
+            <w:proofErr w:type="spellStart"/>
+            <w:r>
+              <w:rPr>
+                <w:rFonts w:ascii="Times New Roman"/>
+                <w:sz w:val="6"/>
+                <w:szCs w:val="8"/>
+              </w:rPr>
+              <w:t>wed_check_column</w:t>
+            </w:r>
+            <w:proofErr w:type="spellEnd"/>
+            <w:r>
+              <w:rPr>
+                <w:rFonts w:ascii="Times New Roman"/>
+                <w:sz w:val="6"/>
+                <w:szCs w:val="8"/>
+              </w:rPr>
+              <w:t>}</w:t>
             </w:r>
           </w:p>
         </w:tc>
@@ -4249,7 +5763,25 @@
                 <w:sz w:val="6"/>
                 <w:szCs w:val="8"/>
               </w:rPr>
-              <w:t>${tue_check_column}</w:t>
+              <w:t>${</w:t>
+            </w:r>
+            <w:proofErr w:type="spellStart"/>
+            <w:r>
+              <w:rPr>
+                <w:rFonts w:ascii="Times New Roman"/>
+                <w:sz w:val="6"/>
+                <w:szCs w:val="8"/>
+              </w:rPr>
+              <w:t>tue_check_column</w:t>
+            </w:r>
+            <w:proofErr w:type="spellEnd"/>
+            <w:r>
+              <w:rPr>
+                <w:rFonts w:ascii="Times New Roman"/>
+                <w:sz w:val="6"/>
+                <w:szCs w:val="8"/>
+              </w:rPr>
+              <w:t>}</w:t>
             </w:r>
           </w:p>
         </w:tc>
@@ -4264,7 +5796,25 @@
                 <w:sz w:val="6"/>
                 <w:szCs w:val="8"/>
               </w:rPr>
-              <w:t>${mon_check_column}</w:t>
+              <w:t>${</w:t>
+            </w:r>
+            <w:proofErr w:type="spellStart"/>
+            <w:r>
+              <w:rPr>
+                <w:rFonts w:ascii="Times New Roman"/>
+                <w:sz w:val="6"/>
+                <w:szCs w:val="8"/>
+              </w:rPr>
+              <w:t>mon_check_column</w:t>
+            </w:r>
+            <w:proofErr w:type="spellEnd"/>
+            <w:r>
+              <w:rPr>
+                <w:rFonts w:ascii="Times New Roman"/>
+                <w:sz w:val="6"/>
+                <w:szCs w:val="8"/>
+              </w:rPr>
+              <w:t>}</w:t>
             </w:r>
           </w:p>
         </w:tc>
@@ -4279,7 +5829,25 @@
                 <w:sz w:val="6"/>
                 <w:szCs w:val="8"/>
               </w:rPr>
-              <w:t>${sun_check_column}</w:t>
+              <w:t>${</w:t>
+            </w:r>
+            <w:proofErr w:type="spellStart"/>
+            <w:r>
+              <w:rPr>
+                <w:rFonts w:ascii="Times New Roman"/>
+                <w:sz w:val="6"/>
+                <w:szCs w:val="8"/>
+              </w:rPr>
+              <w:t>sun_check_column</w:t>
+            </w:r>
+            <w:proofErr w:type="spellEnd"/>
+            <w:r>
+              <w:rPr>
+                <w:rFonts w:ascii="Times New Roman"/>
+                <w:sz w:val="6"/>
+                <w:szCs w:val="8"/>
+              </w:rPr>
+              <w:t>}</w:t>
             </w:r>
           </w:p>
         </w:tc>
@@ -4294,7 +5862,25 @@
                 <w:sz w:val="6"/>
                 <w:szCs w:val="8"/>
               </w:rPr>
-              <w:t>${sat_check_column}</w:t>
+              <w:t>${</w:t>
+            </w:r>
+            <w:proofErr w:type="spellStart"/>
+            <w:r>
+              <w:rPr>
+                <w:rFonts w:ascii="Times New Roman"/>
+                <w:sz w:val="6"/>
+                <w:szCs w:val="8"/>
+              </w:rPr>
+              <w:t>sat_check_column</w:t>
+            </w:r>
+            <w:proofErr w:type="spellEnd"/>
+            <w:r>
+              <w:rPr>
+                <w:rFonts w:ascii="Times New Roman"/>
+                <w:sz w:val="6"/>
+                <w:szCs w:val="8"/>
+              </w:rPr>
+              <w:t>}</w:t>
             </w:r>
           </w:p>
         </w:tc>
@@ -4375,7 +5961,25 @@
                 <w:sz w:val="6"/>
                 <w:szCs w:val="8"/>
               </w:rPr>
-              <w:t>${fri_check_column}</w:t>
+              <w:t>${</w:t>
+            </w:r>
+            <w:proofErr w:type="spellStart"/>
+            <w:r>
+              <w:rPr>
+                <w:rFonts w:ascii="Times New Roman"/>
+                <w:sz w:val="6"/>
+                <w:szCs w:val="8"/>
+              </w:rPr>
+              <w:t>fri_check_column</w:t>
+            </w:r>
+            <w:proofErr w:type="spellEnd"/>
+            <w:r>
+              <w:rPr>
+                <w:rFonts w:ascii="Times New Roman"/>
+                <w:sz w:val="6"/>
+                <w:szCs w:val="8"/>
+              </w:rPr>
+              <w:t>}</w:t>
             </w:r>
           </w:p>
         </w:tc>
@@ -4390,7 +5994,25 @@
                 <w:sz w:val="6"/>
                 <w:szCs w:val="8"/>
               </w:rPr>
-              <w:t>${thu_check_column}</w:t>
+              <w:t>${</w:t>
+            </w:r>
+            <w:proofErr w:type="spellStart"/>
+            <w:r>
+              <w:rPr>
+                <w:rFonts w:ascii="Times New Roman"/>
+                <w:sz w:val="6"/>
+                <w:szCs w:val="8"/>
+              </w:rPr>
+              <w:t>thu_check_column</w:t>
+            </w:r>
+            <w:proofErr w:type="spellEnd"/>
+            <w:r>
+              <w:rPr>
+                <w:rFonts w:ascii="Times New Roman"/>
+                <w:sz w:val="6"/>
+                <w:szCs w:val="8"/>
+              </w:rPr>
+              <w:t>}</w:t>
             </w:r>
           </w:p>
         </w:tc>
@@ -4405,7 +6027,25 @@
                 <w:sz w:val="6"/>
                 <w:szCs w:val="8"/>
               </w:rPr>
-              <w:t>${wed_check_column}</w:t>
+              <w:t>${</w:t>
+            </w:r>
+            <w:proofErr w:type="spellStart"/>
+            <w:r>
+              <w:rPr>
+                <w:rFonts w:ascii="Times New Roman"/>
+                <w:sz w:val="6"/>
+                <w:szCs w:val="8"/>
+              </w:rPr>
+              <w:t>wed_check_column</w:t>
+            </w:r>
+            <w:proofErr w:type="spellEnd"/>
+            <w:r>
+              <w:rPr>
+                <w:rFonts w:ascii="Times New Roman"/>
+                <w:sz w:val="6"/>
+                <w:szCs w:val="8"/>
+              </w:rPr>
+              <w:t>}</w:t>
             </w:r>
           </w:p>
         </w:tc>
@@ -4420,7 +6060,25 @@
                 <w:sz w:val="6"/>
                 <w:szCs w:val="8"/>
               </w:rPr>
-              <w:t>${tue_check_column}</w:t>
+              <w:t>${</w:t>
+            </w:r>
+            <w:proofErr w:type="spellStart"/>
+            <w:r>
+              <w:rPr>
+                <w:rFonts w:ascii="Times New Roman"/>
+                <w:sz w:val="6"/>
+                <w:szCs w:val="8"/>
+              </w:rPr>
+              <w:t>tue_check_column</w:t>
+            </w:r>
+            <w:proofErr w:type="spellEnd"/>
+            <w:r>
+              <w:rPr>
+                <w:rFonts w:ascii="Times New Roman"/>
+                <w:sz w:val="6"/>
+                <w:szCs w:val="8"/>
+              </w:rPr>
+              <w:t>}</w:t>
             </w:r>
           </w:p>
         </w:tc>
@@ -4435,7 +6093,25 @@
                 <w:sz w:val="6"/>
                 <w:szCs w:val="8"/>
               </w:rPr>
-              <w:t>${mon_check_column}</w:t>
+              <w:t>${</w:t>
+            </w:r>
+            <w:proofErr w:type="spellStart"/>
+            <w:r>
+              <w:rPr>
+                <w:rFonts w:ascii="Times New Roman"/>
+                <w:sz w:val="6"/>
+                <w:szCs w:val="8"/>
+              </w:rPr>
+              <w:t>mon_check_column</w:t>
+            </w:r>
+            <w:proofErr w:type="spellEnd"/>
+            <w:r>
+              <w:rPr>
+                <w:rFonts w:ascii="Times New Roman"/>
+                <w:sz w:val="6"/>
+                <w:szCs w:val="8"/>
+              </w:rPr>
+              <w:t>}</w:t>
             </w:r>
           </w:p>
         </w:tc>
@@ -4450,7 +6126,25 @@
                 <w:sz w:val="6"/>
                 <w:szCs w:val="8"/>
               </w:rPr>
-              <w:t>${sun_check_column}</w:t>
+              <w:t>${</w:t>
+            </w:r>
+            <w:proofErr w:type="spellStart"/>
+            <w:r>
+              <w:rPr>
+                <w:rFonts w:ascii="Times New Roman"/>
+                <w:sz w:val="6"/>
+                <w:szCs w:val="8"/>
+              </w:rPr>
+              <w:t>sun_check_column</w:t>
+            </w:r>
+            <w:proofErr w:type="spellEnd"/>
+            <w:r>
+              <w:rPr>
+                <w:rFonts w:ascii="Times New Roman"/>
+                <w:sz w:val="6"/>
+                <w:szCs w:val="8"/>
+              </w:rPr>
+              <w:t>}</w:t>
             </w:r>
           </w:p>
         </w:tc>
@@ -4465,7 +6159,25 @@
                 <w:sz w:val="6"/>
                 <w:szCs w:val="8"/>
               </w:rPr>
-              <w:t>${sat_check_column}</w:t>
+              <w:t>${</w:t>
+            </w:r>
+            <w:proofErr w:type="spellStart"/>
+            <w:r>
+              <w:rPr>
+                <w:rFonts w:ascii="Times New Roman"/>
+                <w:sz w:val="6"/>
+                <w:szCs w:val="8"/>
+              </w:rPr>
+              <w:t>sat_check_column</w:t>
+            </w:r>
+            <w:proofErr w:type="spellEnd"/>
+            <w:r>
+              <w:rPr>
+                <w:rFonts w:ascii="Times New Roman"/>
+                <w:sz w:val="6"/>
+                <w:szCs w:val="8"/>
+              </w:rPr>
+              <w:t>}</w:t>
             </w:r>
           </w:p>
         </w:tc>
@@ -4546,7 +6258,25 @@
                 <w:sz w:val="6"/>
                 <w:szCs w:val="8"/>
               </w:rPr>
-              <w:t>${fri_check_column}</w:t>
+              <w:t>${</w:t>
+            </w:r>
+            <w:proofErr w:type="spellStart"/>
+            <w:r>
+              <w:rPr>
+                <w:rFonts w:ascii="Times New Roman"/>
+                <w:sz w:val="6"/>
+                <w:szCs w:val="8"/>
+              </w:rPr>
+              <w:t>fri_check_column</w:t>
+            </w:r>
+            <w:proofErr w:type="spellEnd"/>
+            <w:r>
+              <w:rPr>
+                <w:rFonts w:ascii="Times New Roman"/>
+                <w:sz w:val="6"/>
+                <w:szCs w:val="8"/>
+              </w:rPr>
+              <w:t>}</w:t>
             </w:r>
           </w:p>
         </w:tc>
@@ -4561,7 +6291,25 @@
                 <w:sz w:val="6"/>
                 <w:szCs w:val="8"/>
               </w:rPr>
-              <w:t>${thu_check_column}</w:t>
+              <w:t>${</w:t>
+            </w:r>
+            <w:proofErr w:type="spellStart"/>
+            <w:r>
+              <w:rPr>
+                <w:rFonts w:ascii="Times New Roman"/>
+                <w:sz w:val="6"/>
+                <w:szCs w:val="8"/>
+              </w:rPr>
+              <w:t>thu_check_column</w:t>
+            </w:r>
+            <w:proofErr w:type="spellEnd"/>
+            <w:r>
+              <w:rPr>
+                <w:rFonts w:ascii="Times New Roman"/>
+                <w:sz w:val="6"/>
+                <w:szCs w:val="8"/>
+              </w:rPr>
+              <w:t>}</w:t>
             </w:r>
           </w:p>
         </w:tc>
@@ -4576,7 +6324,25 @@
                 <w:sz w:val="6"/>
                 <w:szCs w:val="8"/>
               </w:rPr>
-              <w:t>${wed_check_column}</w:t>
+              <w:t>${</w:t>
+            </w:r>
+            <w:proofErr w:type="spellStart"/>
+            <w:r>
+              <w:rPr>
+                <w:rFonts w:ascii="Times New Roman"/>
+                <w:sz w:val="6"/>
+                <w:szCs w:val="8"/>
+              </w:rPr>
+              <w:t>wed_check_column</w:t>
+            </w:r>
+            <w:proofErr w:type="spellEnd"/>
+            <w:r>
+              <w:rPr>
+                <w:rFonts w:ascii="Times New Roman"/>
+                <w:sz w:val="6"/>
+                <w:szCs w:val="8"/>
+              </w:rPr>
+              <w:t>}</w:t>
             </w:r>
           </w:p>
         </w:tc>
@@ -4591,7 +6357,25 @@
                 <w:sz w:val="6"/>
                 <w:szCs w:val="8"/>
               </w:rPr>
-              <w:t>${tue_check_column}</w:t>
+              <w:t>${</w:t>
+            </w:r>
+            <w:proofErr w:type="spellStart"/>
+            <w:r>
+              <w:rPr>
+                <w:rFonts w:ascii="Times New Roman"/>
+                <w:sz w:val="6"/>
+                <w:szCs w:val="8"/>
+              </w:rPr>
+              <w:t>tue_check_column</w:t>
+            </w:r>
+            <w:proofErr w:type="spellEnd"/>
+            <w:r>
+              <w:rPr>
+                <w:rFonts w:ascii="Times New Roman"/>
+                <w:sz w:val="6"/>
+                <w:szCs w:val="8"/>
+              </w:rPr>
+              <w:t>}</w:t>
             </w:r>
           </w:p>
         </w:tc>
@@ -4606,7 +6390,25 @@
                 <w:sz w:val="6"/>
                 <w:szCs w:val="8"/>
               </w:rPr>
-              <w:t>${mon_check_column}</w:t>
+              <w:t>${</w:t>
+            </w:r>
+            <w:proofErr w:type="spellStart"/>
+            <w:r>
+              <w:rPr>
+                <w:rFonts w:ascii="Times New Roman"/>
+                <w:sz w:val="6"/>
+                <w:szCs w:val="8"/>
+              </w:rPr>
+              <w:t>mon_check_column</w:t>
+            </w:r>
+            <w:proofErr w:type="spellEnd"/>
+            <w:r>
+              <w:rPr>
+                <w:rFonts w:ascii="Times New Roman"/>
+                <w:sz w:val="6"/>
+                <w:szCs w:val="8"/>
+              </w:rPr>
+              <w:t>}</w:t>
             </w:r>
           </w:p>
         </w:tc>
@@ -4621,7 +6423,25 @@
                 <w:sz w:val="6"/>
                 <w:szCs w:val="8"/>
               </w:rPr>
-              <w:t>${sun_check_column}</w:t>
+              <w:t>${</w:t>
+            </w:r>
+            <w:proofErr w:type="spellStart"/>
+            <w:r>
+              <w:rPr>
+                <w:rFonts w:ascii="Times New Roman"/>
+                <w:sz w:val="6"/>
+                <w:szCs w:val="8"/>
+              </w:rPr>
+              <w:t>sun_check_column</w:t>
+            </w:r>
+            <w:proofErr w:type="spellEnd"/>
+            <w:r>
+              <w:rPr>
+                <w:rFonts w:ascii="Times New Roman"/>
+                <w:sz w:val="6"/>
+                <w:szCs w:val="8"/>
+              </w:rPr>
+              <w:t>}</w:t>
             </w:r>
           </w:p>
         </w:tc>
@@ -4636,7 +6456,25 @@
                 <w:sz w:val="6"/>
                 <w:szCs w:val="8"/>
               </w:rPr>
-              <w:t>${sat_check_column}</w:t>
+              <w:t>${</w:t>
+            </w:r>
+            <w:proofErr w:type="spellStart"/>
+            <w:r>
+              <w:rPr>
+                <w:rFonts w:ascii="Times New Roman"/>
+                <w:sz w:val="6"/>
+                <w:szCs w:val="8"/>
+              </w:rPr>
+              <w:t>sat_check_column</w:t>
+            </w:r>
+            <w:proofErr w:type="spellEnd"/>
+            <w:r>
+              <w:rPr>
+                <w:rFonts w:ascii="Times New Roman"/>
+                <w:sz w:val="6"/>
+                <w:szCs w:val="8"/>
+              </w:rPr>
+              <w:t>}</w:t>
             </w:r>
           </w:p>
         </w:tc>
@@ -4717,7 +6555,25 @@
                 <w:sz w:val="6"/>
                 <w:szCs w:val="8"/>
               </w:rPr>
-              <w:t>${fri_check_column}</w:t>
+              <w:t>${</w:t>
+            </w:r>
+            <w:proofErr w:type="spellStart"/>
+            <w:r>
+              <w:rPr>
+                <w:rFonts w:ascii="Times New Roman"/>
+                <w:sz w:val="6"/>
+                <w:szCs w:val="8"/>
+              </w:rPr>
+              <w:t>fri_check_column</w:t>
+            </w:r>
+            <w:proofErr w:type="spellEnd"/>
+            <w:r>
+              <w:rPr>
+                <w:rFonts w:ascii="Times New Roman"/>
+                <w:sz w:val="6"/>
+                <w:szCs w:val="8"/>
+              </w:rPr>
+              <w:t>}</w:t>
             </w:r>
           </w:p>
         </w:tc>
@@ -4732,7 +6588,25 @@
                 <w:sz w:val="6"/>
                 <w:szCs w:val="8"/>
               </w:rPr>
-              <w:t>${thu_check_column}</w:t>
+              <w:t>${</w:t>
+            </w:r>
+            <w:proofErr w:type="spellStart"/>
+            <w:r>
+              <w:rPr>
+                <w:rFonts w:ascii="Times New Roman"/>
+                <w:sz w:val="6"/>
+                <w:szCs w:val="8"/>
+              </w:rPr>
+              <w:t>thu_check_column</w:t>
+            </w:r>
+            <w:proofErr w:type="spellEnd"/>
+            <w:r>
+              <w:rPr>
+                <w:rFonts w:ascii="Times New Roman"/>
+                <w:sz w:val="6"/>
+                <w:szCs w:val="8"/>
+              </w:rPr>
+              <w:t>}</w:t>
             </w:r>
           </w:p>
         </w:tc>
@@ -4747,7 +6621,25 @@
                 <w:sz w:val="6"/>
                 <w:szCs w:val="8"/>
               </w:rPr>
-              <w:t>${wed_check_column}</w:t>
+              <w:t>${</w:t>
+            </w:r>
+            <w:proofErr w:type="spellStart"/>
+            <w:r>
+              <w:rPr>
+                <w:rFonts w:ascii="Times New Roman"/>
+                <w:sz w:val="6"/>
+                <w:szCs w:val="8"/>
+              </w:rPr>
+              <w:t>wed_check_column</w:t>
+            </w:r>
+            <w:proofErr w:type="spellEnd"/>
+            <w:r>
+              <w:rPr>
+                <w:rFonts w:ascii="Times New Roman"/>
+                <w:sz w:val="6"/>
+                <w:szCs w:val="8"/>
+              </w:rPr>
+              <w:t>}</w:t>
             </w:r>
           </w:p>
         </w:tc>
@@ -4762,7 +6654,25 @@
                 <w:sz w:val="6"/>
                 <w:szCs w:val="8"/>
               </w:rPr>
-              <w:t>${tue_check_column}</w:t>
+              <w:t>${</w:t>
+            </w:r>
+            <w:proofErr w:type="spellStart"/>
+            <w:r>
+              <w:rPr>
+                <w:rFonts w:ascii="Times New Roman"/>
+                <w:sz w:val="6"/>
+                <w:szCs w:val="8"/>
+              </w:rPr>
+              <w:t>tue_check_column</w:t>
+            </w:r>
+            <w:proofErr w:type="spellEnd"/>
+            <w:r>
+              <w:rPr>
+                <w:rFonts w:ascii="Times New Roman"/>
+                <w:sz w:val="6"/>
+                <w:szCs w:val="8"/>
+              </w:rPr>
+              <w:t>}</w:t>
             </w:r>
           </w:p>
         </w:tc>
@@ -4777,7 +6687,25 @@
                 <w:sz w:val="6"/>
                 <w:szCs w:val="8"/>
               </w:rPr>
-              <w:t>${mon_check_column}</w:t>
+              <w:t>${</w:t>
+            </w:r>
+            <w:proofErr w:type="spellStart"/>
+            <w:r>
+              <w:rPr>
+                <w:rFonts w:ascii="Times New Roman"/>
+                <w:sz w:val="6"/>
+                <w:szCs w:val="8"/>
+              </w:rPr>
+              <w:t>mon_check_column</w:t>
+            </w:r>
+            <w:proofErr w:type="spellEnd"/>
+            <w:r>
+              <w:rPr>
+                <w:rFonts w:ascii="Times New Roman"/>
+                <w:sz w:val="6"/>
+                <w:szCs w:val="8"/>
+              </w:rPr>
+              <w:t>}</w:t>
             </w:r>
           </w:p>
         </w:tc>
@@ -4792,7 +6720,25 @@
                 <w:sz w:val="6"/>
                 <w:szCs w:val="8"/>
               </w:rPr>
-              <w:t>${sun_check_column}</w:t>
+              <w:t>${</w:t>
+            </w:r>
+            <w:proofErr w:type="spellStart"/>
+            <w:r>
+              <w:rPr>
+                <w:rFonts w:ascii="Times New Roman"/>
+                <w:sz w:val="6"/>
+                <w:szCs w:val="8"/>
+              </w:rPr>
+              <w:t>sun_check_column</w:t>
+            </w:r>
+            <w:proofErr w:type="spellEnd"/>
+            <w:r>
+              <w:rPr>
+                <w:rFonts w:ascii="Times New Roman"/>
+                <w:sz w:val="6"/>
+                <w:szCs w:val="8"/>
+              </w:rPr>
+              <w:t>}</w:t>
             </w:r>
           </w:p>
         </w:tc>
@@ -4807,7 +6753,25 @@
                 <w:sz w:val="6"/>
                 <w:szCs w:val="8"/>
               </w:rPr>
-              <w:t>${sat_check_column}</w:t>
+              <w:t>${</w:t>
+            </w:r>
+            <w:proofErr w:type="spellStart"/>
+            <w:r>
+              <w:rPr>
+                <w:rFonts w:ascii="Times New Roman"/>
+                <w:sz w:val="6"/>
+                <w:szCs w:val="8"/>
+              </w:rPr>
+              <w:t>sat_check_column</w:t>
+            </w:r>
+            <w:proofErr w:type="spellEnd"/>
+            <w:r>
+              <w:rPr>
+                <w:rFonts w:ascii="Times New Roman"/>
+                <w:sz w:val="6"/>
+                <w:szCs w:val="8"/>
+              </w:rPr>
+              <w:t>}</w:t>
             </w:r>
           </w:p>
         </w:tc>
@@ -4898,7 +6862,25 @@
                 <w:sz w:val="6"/>
                 <w:szCs w:val="8"/>
               </w:rPr>
-              <w:t>${fri_check_column}</w:t>
+              <w:t>${</w:t>
+            </w:r>
+            <w:proofErr w:type="spellStart"/>
+            <w:r>
+              <w:rPr>
+                <w:rFonts w:ascii="Times New Roman"/>
+                <w:sz w:val="6"/>
+                <w:szCs w:val="8"/>
+              </w:rPr>
+              <w:t>fri_check_column</w:t>
+            </w:r>
+            <w:proofErr w:type="spellEnd"/>
+            <w:r>
+              <w:rPr>
+                <w:rFonts w:ascii="Times New Roman"/>
+                <w:sz w:val="6"/>
+                <w:szCs w:val="8"/>
+              </w:rPr>
+              <w:t>}</w:t>
             </w:r>
           </w:p>
         </w:tc>
@@ -4913,7 +6895,25 @@
                 <w:sz w:val="6"/>
                 <w:szCs w:val="8"/>
               </w:rPr>
-              <w:t>${thu_check_column}</w:t>
+              <w:t>${</w:t>
+            </w:r>
+            <w:proofErr w:type="spellStart"/>
+            <w:r>
+              <w:rPr>
+                <w:rFonts w:ascii="Times New Roman"/>
+                <w:sz w:val="6"/>
+                <w:szCs w:val="8"/>
+              </w:rPr>
+              <w:t>thu_check_column</w:t>
+            </w:r>
+            <w:proofErr w:type="spellEnd"/>
+            <w:r>
+              <w:rPr>
+                <w:rFonts w:ascii="Times New Roman"/>
+                <w:sz w:val="6"/>
+                <w:szCs w:val="8"/>
+              </w:rPr>
+              <w:t>}</w:t>
             </w:r>
           </w:p>
         </w:tc>
@@ -4928,7 +6928,25 @@
                 <w:sz w:val="6"/>
                 <w:szCs w:val="8"/>
               </w:rPr>
-              <w:t>${wed_check_column}</w:t>
+              <w:t>${</w:t>
+            </w:r>
+            <w:proofErr w:type="spellStart"/>
+            <w:r>
+              <w:rPr>
+                <w:rFonts w:ascii="Times New Roman"/>
+                <w:sz w:val="6"/>
+                <w:szCs w:val="8"/>
+              </w:rPr>
+              <w:t>wed_check_column</w:t>
+            </w:r>
+            <w:proofErr w:type="spellEnd"/>
+            <w:r>
+              <w:rPr>
+                <w:rFonts w:ascii="Times New Roman"/>
+                <w:sz w:val="6"/>
+                <w:szCs w:val="8"/>
+              </w:rPr>
+              <w:t>}</w:t>
             </w:r>
           </w:p>
         </w:tc>
@@ -4943,7 +6961,25 @@
                 <w:sz w:val="6"/>
                 <w:szCs w:val="8"/>
               </w:rPr>
-              <w:t>${tue_check_column}</w:t>
+              <w:t>${</w:t>
+            </w:r>
+            <w:proofErr w:type="spellStart"/>
+            <w:r>
+              <w:rPr>
+                <w:rFonts w:ascii="Times New Roman"/>
+                <w:sz w:val="6"/>
+                <w:szCs w:val="8"/>
+              </w:rPr>
+              <w:t>tue_check_column</w:t>
+            </w:r>
+            <w:proofErr w:type="spellEnd"/>
+            <w:r>
+              <w:rPr>
+                <w:rFonts w:ascii="Times New Roman"/>
+                <w:sz w:val="6"/>
+                <w:szCs w:val="8"/>
+              </w:rPr>
+              <w:t>}</w:t>
             </w:r>
           </w:p>
         </w:tc>
@@ -4958,7 +6994,25 @@
                 <w:sz w:val="6"/>
                 <w:szCs w:val="8"/>
               </w:rPr>
-              <w:t>${mon_check_column}</w:t>
+              <w:t>${</w:t>
+            </w:r>
+            <w:proofErr w:type="spellStart"/>
+            <w:r>
+              <w:rPr>
+                <w:rFonts w:ascii="Times New Roman"/>
+                <w:sz w:val="6"/>
+                <w:szCs w:val="8"/>
+              </w:rPr>
+              <w:t>mon_check_column</w:t>
+            </w:r>
+            <w:proofErr w:type="spellEnd"/>
+            <w:r>
+              <w:rPr>
+                <w:rFonts w:ascii="Times New Roman"/>
+                <w:sz w:val="6"/>
+                <w:szCs w:val="8"/>
+              </w:rPr>
+              <w:t>}</w:t>
             </w:r>
           </w:p>
         </w:tc>
@@ -4973,7 +7027,25 @@
                 <w:sz w:val="6"/>
                 <w:szCs w:val="8"/>
               </w:rPr>
-              <w:t>${sun_check_column}</w:t>
+              <w:t>${</w:t>
+            </w:r>
+            <w:proofErr w:type="spellStart"/>
+            <w:r>
+              <w:rPr>
+                <w:rFonts w:ascii="Times New Roman"/>
+                <w:sz w:val="6"/>
+                <w:szCs w:val="8"/>
+              </w:rPr>
+              <w:t>sun_check_column</w:t>
+            </w:r>
+            <w:proofErr w:type="spellEnd"/>
+            <w:r>
+              <w:rPr>
+                <w:rFonts w:ascii="Times New Roman"/>
+                <w:sz w:val="6"/>
+                <w:szCs w:val="8"/>
+              </w:rPr>
+              <w:t>}</w:t>
             </w:r>
           </w:p>
         </w:tc>
@@ -4988,7 +7060,25 @@
                 <w:sz w:val="6"/>
                 <w:szCs w:val="8"/>
               </w:rPr>
-              <w:t>${sat_check_column}</w:t>
+              <w:t>${</w:t>
+            </w:r>
+            <w:proofErr w:type="spellStart"/>
+            <w:r>
+              <w:rPr>
+                <w:rFonts w:ascii="Times New Roman"/>
+                <w:sz w:val="6"/>
+                <w:szCs w:val="8"/>
+              </w:rPr>
+              <w:t>sat_check_column</w:t>
+            </w:r>
+            <w:proofErr w:type="spellEnd"/>
+            <w:r>
+              <w:rPr>
+                <w:rFonts w:ascii="Times New Roman"/>
+                <w:sz w:val="6"/>
+                <w:szCs w:val="8"/>
+              </w:rPr>
+              <w:t>}</w:t>
             </w:r>
           </w:p>
         </w:tc>
@@ -5079,7 +7169,25 @@
                 <w:sz w:val="6"/>
                 <w:szCs w:val="8"/>
               </w:rPr>
-              <w:t>${fri_check_column}</w:t>
+              <w:t>${</w:t>
+            </w:r>
+            <w:proofErr w:type="spellStart"/>
+            <w:r>
+              <w:rPr>
+                <w:rFonts w:ascii="Times New Roman"/>
+                <w:sz w:val="6"/>
+                <w:szCs w:val="8"/>
+              </w:rPr>
+              <w:t>fri_check_column</w:t>
+            </w:r>
+            <w:proofErr w:type="spellEnd"/>
+            <w:r>
+              <w:rPr>
+                <w:rFonts w:ascii="Times New Roman"/>
+                <w:sz w:val="6"/>
+                <w:szCs w:val="8"/>
+              </w:rPr>
+              <w:t>}</w:t>
             </w:r>
           </w:p>
         </w:tc>
@@ -5094,7 +7202,25 @@
                 <w:sz w:val="6"/>
                 <w:szCs w:val="8"/>
               </w:rPr>
-              <w:t>${thu_check_column}</w:t>
+              <w:t>${</w:t>
+            </w:r>
+            <w:proofErr w:type="spellStart"/>
+            <w:r>
+              <w:rPr>
+                <w:rFonts w:ascii="Times New Roman"/>
+                <w:sz w:val="6"/>
+                <w:szCs w:val="8"/>
+              </w:rPr>
+              <w:t>thu_check_column</w:t>
+            </w:r>
+            <w:proofErr w:type="spellEnd"/>
+            <w:r>
+              <w:rPr>
+                <w:rFonts w:ascii="Times New Roman"/>
+                <w:sz w:val="6"/>
+                <w:szCs w:val="8"/>
+              </w:rPr>
+              <w:t>}</w:t>
             </w:r>
           </w:p>
         </w:tc>
@@ -5109,7 +7235,25 @@
                 <w:sz w:val="6"/>
                 <w:szCs w:val="8"/>
               </w:rPr>
-              <w:t>${wed_check_column}</w:t>
+              <w:t>${</w:t>
+            </w:r>
+            <w:proofErr w:type="spellStart"/>
+            <w:r>
+              <w:rPr>
+                <w:rFonts w:ascii="Times New Roman"/>
+                <w:sz w:val="6"/>
+                <w:szCs w:val="8"/>
+              </w:rPr>
+              <w:t>wed_check_column</w:t>
+            </w:r>
+            <w:proofErr w:type="spellEnd"/>
+            <w:r>
+              <w:rPr>
+                <w:rFonts w:ascii="Times New Roman"/>
+                <w:sz w:val="6"/>
+                <w:szCs w:val="8"/>
+              </w:rPr>
+              <w:t>}</w:t>
             </w:r>
           </w:p>
         </w:tc>
@@ -5124,7 +7268,25 @@
                 <w:sz w:val="6"/>
                 <w:szCs w:val="8"/>
               </w:rPr>
-              <w:t>${tue_check_column}</w:t>
+              <w:t>${</w:t>
+            </w:r>
+            <w:proofErr w:type="spellStart"/>
+            <w:r>
+              <w:rPr>
+                <w:rFonts w:ascii="Times New Roman"/>
+                <w:sz w:val="6"/>
+                <w:szCs w:val="8"/>
+              </w:rPr>
+              <w:t>tue_check_column</w:t>
+            </w:r>
+            <w:proofErr w:type="spellEnd"/>
+            <w:r>
+              <w:rPr>
+                <w:rFonts w:ascii="Times New Roman"/>
+                <w:sz w:val="6"/>
+                <w:szCs w:val="8"/>
+              </w:rPr>
+              <w:t>}</w:t>
             </w:r>
           </w:p>
         </w:tc>
@@ -5139,7 +7301,25 @@
                 <w:sz w:val="6"/>
                 <w:szCs w:val="8"/>
               </w:rPr>
-              <w:t>${mon_check_column}</w:t>
+              <w:t>${</w:t>
+            </w:r>
+            <w:proofErr w:type="spellStart"/>
+            <w:r>
+              <w:rPr>
+                <w:rFonts w:ascii="Times New Roman"/>
+                <w:sz w:val="6"/>
+                <w:szCs w:val="8"/>
+              </w:rPr>
+              <w:t>mon_check_column</w:t>
+            </w:r>
+            <w:proofErr w:type="spellEnd"/>
+            <w:r>
+              <w:rPr>
+                <w:rFonts w:ascii="Times New Roman"/>
+                <w:sz w:val="6"/>
+                <w:szCs w:val="8"/>
+              </w:rPr>
+              <w:t>}</w:t>
             </w:r>
           </w:p>
         </w:tc>
@@ -5154,7 +7334,25 @@
                 <w:sz w:val="6"/>
                 <w:szCs w:val="8"/>
               </w:rPr>
-              <w:t>${sun_check_column}</w:t>
+              <w:t>${</w:t>
+            </w:r>
+            <w:proofErr w:type="spellStart"/>
+            <w:r>
+              <w:rPr>
+                <w:rFonts w:ascii="Times New Roman"/>
+                <w:sz w:val="6"/>
+                <w:szCs w:val="8"/>
+              </w:rPr>
+              <w:t>sun_check_column</w:t>
+            </w:r>
+            <w:proofErr w:type="spellEnd"/>
+            <w:r>
+              <w:rPr>
+                <w:rFonts w:ascii="Times New Roman"/>
+                <w:sz w:val="6"/>
+                <w:szCs w:val="8"/>
+              </w:rPr>
+              <w:t>}</w:t>
             </w:r>
           </w:p>
         </w:tc>
@@ -5169,7 +7367,25 @@
                 <w:sz w:val="6"/>
                 <w:szCs w:val="8"/>
               </w:rPr>
-              <w:t>${sat_check_column}</w:t>
+              <w:t>${</w:t>
+            </w:r>
+            <w:proofErr w:type="spellStart"/>
+            <w:r>
+              <w:rPr>
+                <w:rFonts w:ascii="Times New Roman"/>
+                <w:sz w:val="6"/>
+                <w:szCs w:val="8"/>
+              </w:rPr>
+              <w:t>sat_check_column</w:t>
+            </w:r>
+            <w:proofErr w:type="spellEnd"/>
+            <w:r>
+              <w:rPr>
+                <w:rFonts w:ascii="Times New Roman"/>
+                <w:sz w:val="6"/>
+                <w:szCs w:val="8"/>
+              </w:rPr>
+              <w:t>}</w:t>
             </w:r>
           </w:p>
         </w:tc>

</xml_diff>

<commit_message>
feat: add buttons to select all actual and optional equipment in inspection
</commit_message>
<xml_diff>
--- a/storage/app/templates/Qalab-daily-inspection.docx
+++ b/storage/app/templates/Qalab-daily-inspection.docx
@@ -897,14 +897,14 @@
         <w:tblLook w:val="0000" w:firstRow="0" w:lastRow="0" w:firstColumn="0" w:lastColumn="0" w:noHBand="0" w:noVBand="0"/>
       </w:tblPr>
       <w:tblGrid>
-        <w:gridCol w:w="1251"/>
-        <w:gridCol w:w="1286"/>
-        <w:gridCol w:w="1341"/>
-        <w:gridCol w:w="1263"/>
-        <w:gridCol w:w="1374"/>
-        <w:gridCol w:w="1297"/>
-        <w:gridCol w:w="1241"/>
-        <w:gridCol w:w="2082"/>
+        <w:gridCol w:w="1406"/>
+        <w:gridCol w:w="1499"/>
+        <w:gridCol w:w="1566"/>
+        <w:gridCol w:w="1472"/>
+        <w:gridCol w:w="1606"/>
+        <w:gridCol w:w="1513"/>
+        <w:gridCol w:w="1446"/>
+        <w:gridCol w:w="1167"/>
       </w:tblGrid>
       <w:tr>
         <w:trPr>
@@ -1968,28 +1968,25 @@
               <w:rPr>
                 <w:b/>
                 <w:bCs/>
-                <w:sz w:val="26"/>
-                <w:szCs w:val="26"/>
-              </w:rPr>
-            </w:pPr>
-            <w:r>
-              <w:rPr>
-                <w:rFonts w:ascii="Times New Roman"/>
-                <w:b/>
-                <w:bCs/>
-                <w:sz w:val="14"/>
-                <w:szCs w:val="16"/>
-              </w:rPr>
-              <w:t>${</w:t>
-            </w:r>
-            <w:proofErr w:type="spellStart"/>
-            <w:r>
-              <w:rPr>
-                <w:rFonts w:ascii="Times New Roman"/>
-                <w:b/>
-                <w:bCs/>
-                <w:sz w:val="14"/>
-                <w:szCs w:val="16"/>
+                <w:szCs w:val="28"/>
+              </w:rPr>
+            </w:pPr>
+            <w:r>
+              <w:rPr>
+                <w:rFonts w:ascii="Times New Roman"/>
+                <w:b/>
+                <w:bCs/>
+                <w:szCs w:val="28"/>
+              </w:rPr>
+              <w:t>${</w:t>
+            </w:r>
+            <w:proofErr w:type="spellStart"/>
+            <w:r>
+              <w:rPr>
+                <w:rFonts w:ascii="Times New Roman"/>
+                <w:b/>
+                <w:bCs/>
+                <w:szCs w:val="28"/>
               </w:rPr>
               <w:t>fri_date</w:t>
             </w:r>
@@ -1999,8 +1996,7 @@
                 <w:rFonts w:ascii="Times New Roman"/>
                 <w:b/>
                 <w:bCs/>
-                <w:sz w:val="14"/>
-                <w:szCs w:val="16"/>
+                <w:szCs w:val="28"/>
               </w:rPr>
               <w:t>}</w:t>
             </w:r>
@@ -2017,49 +2013,35 @@
               <w:rPr>
                 <w:b/>
                 <w:bCs/>
-                <w:sz w:val="26"/>
-                <w:szCs w:val="26"/>
-              </w:rPr>
-            </w:pPr>
-            <w:r>
-              <w:rPr>
-                <w:rFonts w:ascii="Times New Roman"/>
-                <w:b/>
-                <w:bCs/>
-                <w:sz w:val="14"/>
-                <w:szCs w:val="16"/>
-              </w:rPr>
-              <w:t>${</w:t>
-            </w:r>
-            <w:proofErr w:type="spellStart"/>
-            <w:r>
-              <w:rPr>
-                <w:rFonts w:ascii="Times New Roman"/>
-                <w:b/>
-                <w:bCs/>
-                <w:sz w:val="14"/>
-                <w:szCs w:val="16"/>
-              </w:rPr>
-              <w:t>thu_dat</w:t>
-            </w:r>
-            <w:r>
-              <w:rPr>
-                <w:rFonts w:ascii="Times New Roman"/>
-                <w:b/>
-                <w:bCs/>
-                <w:sz w:val="14"/>
-                <w:szCs w:val="14"/>
-              </w:rPr>
-              <w:t>e</w:t>
-            </w:r>
-            <w:proofErr w:type="spellEnd"/>
-            <w:r>
-              <w:rPr>
-                <w:rFonts w:ascii="Times New Roman"/>
-                <w:b/>
-                <w:bCs/>
-                <w:sz w:val="14"/>
-                <w:szCs w:val="14"/>
+                <w:szCs w:val="28"/>
+              </w:rPr>
+            </w:pPr>
+            <w:r>
+              <w:rPr>
+                <w:rFonts w:ascii="Times New Roman"/>
+                <w:b/>
+                <w:bCs/>
+                <w:szCs w:val="28"/>
+              </w:rPr>
+              <w:t>${</w:t>
+            </w:r>
+            <w:proofErr w:type="spellStart"/>
+            <w:r>
+              <w:rPr>
+                <w:rFonts w:ascii="Times New Roman"/>
+                <w:b/>
+                <w:bCs/>
+                <w:szCs w:val="28"/>
+              </w:rPr>
+              <w:t>thu_date</w:t>
+            </w:r>
+            <w:proofErr w:type="spellEnd"/>
+            <w:r>
+              <w:rPr>
+                <w:rFonts w:ascii="Times New Roman"/>
+                <w:b/>
+                <w:bCs/>
+                <w:szCs w:val="28"/>
               </w:rPr>
               <w:t>}</w:t>
             </w:r>
@@ -2075,28 +2057,25 @@
               <w:jc w:val="center"/>
               <w:rPr>
                 <w:rFonts w:ascii="Times New Roman"/>
-                <w:sz w:val="10"/>
-                <w:szCs w:val="12"/>
-              </w:rPr>
-            </w:pPr>
-            <w:r>
-              <w:rPr>
-                <w:rFonts w:ascii="Times New Roman"/>
-                <w:b/>
-                <w:bCs/>
-                <w:sz w:val="14"/>
-                <w:szCs w:val="16"/>
-              </w:rPr>
-              <w:t>${</w:t>
-            </w:r>
-            <w:proofErr w:type="spellStart"/>
-            <w:r>
-              <w:rPr>
-                <w:rFonts w:ascii="Times New Roman"/>
-                <w:b/>
-                <w:bCs/>
-                <w:sz w:val="14"/>
-                <w:szCs w:val="16"/>
+                <w:szCs w:val="28"/>
+              </w:rPr>
+            </w:pPr>
+            <w:r>
+              <w:rPr>
+                <w:rFonts w:ascii="Times New Roman"/>
+                <w:b/>
+                <w:bCs/>
+                <w:szCs w:val="28"/>
+              </w:rPr>
+              <w:t>${</w:t>
+            </w:r>
+            <w:proofErr w:type="spellStart"/>
+            <w:r>
+              <w:rPr>
+                <w:rFonts w:ascii="Times New Roman"/>
+                <w:b/>
+                <w:bCs/>
+                <w:szCs w:val="28"/>
               </w:rPr>
               <w:t>wed_date</w:t>
             </w:r>
@@ -2106,8 +2085,7 @@
                 <w:rFonts w:ascii="Times New Roman"/>
                 <w:b/>
                 <w:bCs/>
-                <w:sz w:val="14"/>
-                <w:szCs w:val="16"/>
+                <w:szCs w:val="28"/>
               </w:rPr>
               <w:t>}</w:t>
             </w:r>
@@ -2124,28 +2102,25 @@
               <w:rPr>
                 <w:b/>
                 <w:bCs/>
-                <w:sz w:val="26"/>
-                <w:szCs w:val="26"/>
-              </w:rPr>
-            </w:pPr>
-            <w:r>
-              <w:rPr>
-                <w:rFonts w:ascii="Times New Roman"/>
-                <w:b/>
-                <w:bCs/>
-                <w:sz w:val="14"/>
-                <w:szCs w:val="16"/>
-              </w:rPr>
-              <w:t>${</w:t>
-            </w:r>
-            <w:proofErr w:type="spellStart"/>
-            <w:r>
-              <w:rPr>
-                <w:rFonts w:ascii="Times New Roman"/>
-                <w:b/>
-                <w:bCs/>
-                <w:sz w:val="14"/>
-                <w:szCs w:val="16"/>
+                <w:szCs w:val="28"/>
+              </w:rPr>
+            </w:pPr>
+            <w:r>
+              <w:rPr>
+                <w:rFonts w:ascii="Times New Roman"/>
+                <w:b/>
+                <w:bCs/>
+                <w:szCs w:val="28"/>
+              </w:rPr>
+              <w:t>${</w:t>
+            </w:r>
+            <w:proofErr w:type="spellStart"/>
+            <w:r>
+              <w:rPr>
+                <w:rFonts w:ascii="Times New Roman"/>
+                <w:b/>
+                <w:bCs/>
+                <w:szCs w:val="28"/>
               </w:rPr>
               <w:t>tue_date</w:t>
             </w:r>
@@ -2155,8 +2130,7 @@
                 <w:rFonts w:ascii="Times New Roman"/>
                 <w:b/>
                 <w:bCs/>
-                <w:sz w:val="14"/>
-                <w:szCs w:val="16"/>
+                <w:szCs w:val="28"/>
               </w:rPr>
               <w:t>}</w:t>
             </w:r>
@@ -2173,28 +2147,25 @@
               <w:rPr>
                 <w:b/>
                 <w:bCs/>
-                <w:sz w:val="26"/>
-                <w:szCs w:val="26"/>
-              </w:rPr>
-            </w:pPr>
-            <w:r>
-              <w:rPr>
-                <w:rFonts w:ascii="Times New Roman"/>
-                <w:b/>
-                <w:bCs/>
-                <w:sz w:val="14"/>
-                <w:szCs w:val="16"/>
-              </w:rPr>
-              <w:t>${</w:t>
-            </w:r>
-            <w:proofErr w:type="spellStart"/>
-            <w:r>
-              <w:rPr>
-                <w:rFonts w:ascii="Times New Roman"/>
-                <w:b/>
-                <w:bCs/>
-                <w:sz w:val="14"/>
-                <w:szCs w:val="16"/>
+                <w:szCs w:val="28"/>
+              </w:rPr>
+            </w:pPr>
+            <w:r>
+              <w:rPr>
+                <w:rFonts w:ascii="Times New Roman"/>
+                <w:b/>
+                <w:bCs/>
+                <w:szCs w:val="28"/>
+              </w:rPr>
+              <w:t>${</w:t>
+            </w:r>
+            <w:proofErr w:type="spellStart"/>
+            <w:r>
+              <w:rPr>
+                <w:rFonts w:ascii="Times New Roman"/>
+                <w:b/>
+                <w:bCs/>
+                <w:szCs w:val="28"/>
               </w:rPr>
               <w:t>mon_date</w:t>
             </w:r>
@@ -2204,8 +2175,7 @@
                 <w:rFonts w:ascii="Times New Roman"/>
                 <w:b/>
                 <w:bCs/>
-                <w:sz w:val="14"/>
-                <w:szCs w:val="16"/>
+                <w:szCs w:val="28"/>
               </w:rPr>
               <w:t>}</w:t>
             </w:r>
@@ -2222,28 +2192,25 @@
               <w:rPr>
                 <w:b/>
                 <w:bCs/>
-                <w:sz w:val="26"/>
-                <w:szCs w:val="26"/>
-              </w:rPr>
-            </w:pPr>
-            <w:r>
-              <w:rPr>
-                <w:rFonts w:ascii="Times New Roman"/>
-                <w:b/>
-                <w:bCs/>
-                <w:sz w:val="14"/>
-                <w:szCs w:val="16"/>
-              </w:rPr>
-              <w:t>${</w:t>
-            </w:r>
-            <w:proofErr w:type="spellStart"/>
-            <w:r>
-              <w:rPr>
-                <w:rFonts w:ascii="Times New Roman"/>
-                <w:b/>
-                <w:bCs/>
-                <w:sz w:val="14"/>
-                <w:szCs w:val="16"/>
+                <w:szCs w:val="28"/>
+              </w:rPr>
+            </w:pPr>
+            <w:r>
+              <w:rPr>
+                <w:rFonts w:ascii="Times New Roman"/>
+                <w:b/>
+                <w:bCs/>
+                <w:szCs w:val="28"/>
+              </w:rPr>
+              <w:t>${</w:t>
+            </w:r>
+            <w:proofErr w:type="spellStart"/>
+            <w:r>
+              <w:rPr>
+                <w:rFonts w:ascii="Times New Roman"/>
+                <w:b/>
+                <w:bCs/>
+                <w:szCs w:val="28"/>
               </w:rPr>
               <w:t>sun_date</w:t>
             </w:r>
@@ -2253,8 +2220,7 @@
                 <w:rFonts w:ascii="Times New Roman"/>
                 <w:b/>
                 <w:bCs/>
-                <w:sz w:val="14"/>
-                <w:szCs w:val="16"/>
+                <w:szCs w:val="28"/>
               </w:rPr>
               <w:t>}</w:t>
             </w:r>
@@ -2271,28 +2237,25 @@
               <w:rPr>
                 <w:b/>
                 <w:bCs/>
-                <w:sz w:val="26"/>
-                <w:szCs w:val="26"/>
-              </w:rPr>
-            </w:pPr>
-            <w:r>
-              <w:rPr>
-                <w:rFonts w:ascii="Times New Roman"/>
-                <w:b/>
-                <w:bCs/>
-                <w:sz w:val="14"/>
-                <w:szCs w:val="16"/>
-              </w:rPr>
-              <w:t>${</w:t>
-            </w:r>
-            <w:proofErr w:type="spellStart"/>
-            <w:r>
-              <w:rPr>
-                <w:rFonts w:ascii="Times New Roman"/>
-                <w:b/>
-                <w:bCs/>
-                <w:sz w:val="14"/>
-                <w:szCs w:val="16"/>
+                <w:szCs w:val="28"/>
+              </w:rPr>
+            </w:pPr>
+            <w:r>
+              <w:rPr>
+                <w:rFonts w:ascii="Times New Roman"/>
+                <w:b/>
+                <w:bCs/>
+                <w:szCs w:val="28"/>
+              </w:rPr>
+              <w:t>${</w:t>
+            </w:r>
+            <w:proofErr w:type="spellStart"/>
+            <w:r>
+              <w:rPr>
+                <w:rFonts w:ascii="Times New Roman"/>
+                <w:b/>
+                <w:bCs/>
+                <w:szCs w:val="28"/>
               </w:rPr>
               <w:t>sat_date</w:t>
             </w:r>
@@ -2302,8 +2265,7 @@
                 <w:rFonts w:ascii="Times New Roman"/>
                 <w:b/>
                 <w:bCs/>
-                <w:sz w:val="14"/>
-                <w:szCs w:val="16"/>
+                <w:szCs w:val="28"/>
               </w:rPr>
               <w:t>}</w:t>
             </w:r>
@@ -2385,8 +2347,7 @@
                 <w:rFonts w:ascii="Times New Roman"/>
                 <w:b/>
                 <w:bCs/>
-                <w:sz w:val="20"/>
-                <w:szCs w:val="22"/>
+                <w:szCs w:val="28"/>
                 <w:lang w:bidi="ar-EG"/>
               </w:rPr>
             </w:pPr>
@@ -2395,8 +2356,7 @@
                 <w:rFonts w:ascii="Times New Roman"/>
                 <w:b/>
                 <w:bCs/>
-                <w:sz w:val="20"/>
-                <w:szCs w:val="22"/>
+                <w:szCs w:val="28"/>
                 <w:lang w:bidi="ar-EG"/>
               </w:rPr>
               <w:t>${</w:t>
@@ -2407,8 +2367,7 @@
                 <w:rFonts w:ascii="Times New Roman"/>
                 <w:b/>
                 <w:bCs/>
-                <w:sz w:val="20"/>
-                <w:szCs w:val="22"/>
+                <w:szCs w:val="28"/>
                 <w:lang w:bidi="ar-EG"/>
               </w:rPr>
               <w:t>fri_</w:t>
@@ -2418,8 +2377,7 @@
                 <w:rFonts w:ascii="Times New Roman"/>
                 <w:b/>
                 <w:bCs/>
-                <w:sz w:val="20"/>
-                <w:szCs w:val="22"/>
+                <w:szCs w:val="28"/>
                 <w:lang w:bidi="ar-EG"/>
               </w:rPr>
               <w:t>daily</w:t>
@@ -2430,8 +2388,7 @@
                 <w:rFonts w:ascii="Times New Roman"/>
                 <w:b/>
                 <w:bCs/>
-                <w:sz w:val="20"/>
-                <w:szCs w:val="22"/>
+                <w:szCs w:val="28"/>
                 <w:lang w:bidi="ar-EG"/>
               </w:rPr>
               <w:t>}</w:t>
@@ -2450,8 +2407,7 @@
                 <w:rFonts w:ascii="Times New Roman"/>
                 <w:b/>
                 <w:bCs/>
-                <w:sz w:val="20"/>
-                <w:szCs w:val="22"/>
+                <w:szCs w:val="28"/>
                 <w:lang w:bidi="ar-EG"/>
               </w:rPr>
             </w:pPr>
@@ -2460,8 +2416,7 @@
                 <w:rFonts w:ascii="Times New Roman"/>
                 <w:b/>
                 <w:bCs/>
-                <w:sz w:val="20"/>
-                <w:szCs w:val="22"/>
+                <w:szCs w:val="28"/>
                 <w:lang w:bidi="ar-EG"/>
               </w:rPr>
               <w:t>${</w:t>
@@ -2472,8 +2427,7 @@
                 <w:rFonts w:ascii="Times New Roman"/>
                 <w:b/>
                 <w:bCs/>
-                <w:sz w:val="20"/>
-                <w:szCs w:val="22"/>
+                <w:szCs w:val="28"/>
                 <w:lang w:bidi="ar-EG"/>
               </w:rPr>
               <w:t>thu_</w:t>
@@ -2483,8 +2437,7 @@
                 <w:rFonts w:ascii="Times New Roman"/>
                 <w:b/>
                 <w:bCs/>
-                <w:sz w:val="20"/>
-                <w:szCs w:val="22"/>
+                <w:szCs w:val="28"/>
                 <w:lang w:bidi="ar-EG"/>
               </w:rPr>
               <w:t>daily</w:t>
@@ -2495,8 +2448,7 @@
                 <w:rFonts w:ascii="Times New Roman"/>
                 <w:b/>
                 <w:bCs/>
-                <w:sz w:val="20"/>
-                <w:szCs w:val="22"/>
+                <w:szCs w:val="28"/>
                 <w:lang w:bidi="ar-EG"/>
               </w:rPr>
               <w:t>}</w:t>
@@ -2515,8 +2467,7 @@
                 <w:rFonts w:ascii="Times New Roman"/>
                 <w:b/>
                 <w:bCs/>
-                <w:sz w:val="20"/>
-                <w:szCs w:val="22"/>
+                <w:szCs w:val="28"/>
                 <w:lang w:bidi="ar-EG"/>
               </w:rPr>
             </w:pPr>
@@ -2525,8 +2476,7 @@
                 <w:rFonts w:ascii="Times New Roman"/>
                 <w:b/>
                 <w:bCs/>
-                <w:sz w:val="20"/>
-                <w:szCs w:val="22"/>
+                <w:szCs w:val="28"/>
                 <w:lang w:bidi="ar-EG"/>
               </w:rPr>
               <w:t>${</w:t>
@@ -2537,8 +2487,7 @@
                 <w:rFonts w:ascii="Times New Roman"/>
                 <w:b/>
                 <w:bCs/>
-                <w:sz w:val="20"/>
-                <w:szCs w:val="22"/>
+                <w:szCs w:val="28"/>
                 <w:lang w:bidi="ar-EG"/>
               </w:rPr>
               <w:t>wed_</w:t>
@@ -2548,8 +2497,7 @@
                 <w:rFonts w:ascii="Times New Roman"/>
                 <w:b/>
                 <w:bCs/>
-                <w:sz w:val="20"/>
-                <w:szCs w:val="22"/>
+                <w:szCs w:val="28"/>
                 <w:lang w:bidi="ar-EG"/>
               </w:rPr>
               <w:t>daily</w:t>
@@ -2560,8 +2508,7 @@
                 <w:rFonts w:ascii="Times New Roman"/>
                 <w:b/>
                 <w:bCs/>
-                <w:sz w:val="20"/>
-                <w:szCs w:val="22"/>
+                <w:szCs w:val="28"/>
                 <w:lang w:bidi="ar-EG"/>
               </w:rPr>
               <w:t>}</w:t>
@@ -2580,8 +2527,7 @@
                 <w:rFonts w:ascii="Times New Roman"/>
                 <w:b/>
                 <w:bCs/>
-                <w:sz w:val="20"/>
-                <w:szCs w:val="22"/>
+                <w:szCs w:val="28"/>
                 <w:lang w:bidi="ar-EG"/>
               </w:rPr>
             </w:pPr>
@@ -2590,8 +2536,7 @@
                 <w:rFonts w:ascii="Times New Roman"/>
                 <w:b/>
                 <w:bCs/>
-                <w:sz w:val="20"/>
-                <w:szCs w:val="22"/>
+                <w:szCs w:val="28"/>
                 <w:lang w:bidi="ar-EG"/>
               </w:rPr>
               <w:t>${</w:t>
@@ -2602,8 +2547,7 @@
                 <w:rFonts w:ascii="Times New Roman"/>
                 <w:b/>
                 <w:bCs/>
-                <w:sz w:val="20"/>
-                <w:szCs w:val="22"/>
+                <w:szCs w:val="28"/>
                 <w:lang w:bidi="ar-EG"/>
               </w:rPr>
               <w:t>tue_</w:t>
@@ -2613,8 +2557,7 @@
                 <w:rFonts w:ascii="Times New Roman"/>
                 <w:b/>
                 <w:bCs/>
-                <w:sz w:val="20"/>
-                <w:szCs w:val="22"/>
+                <w:szCs w:val="28"/>
                 <w:lang w:bidi="ar-EG"/>
               </w:rPr>
               <w:t>daily</w:t>
@@ -2625,8 +2568,7 @@
                 <w:rFonts w:ascii="Times New Roman"/>
                 <w:b/>
                 <w:bCs/>
-                <w:sz w:val="20"/>
-                <w:szCs w:val="22"/>
+                <w:szCs w:val="28"/>
                 <w:lang w:bidi="ar-EG"/>
               </w:rPr>
               <w:t>}</w:t>
@@ -2645,8 +2587,7 @@
                 <w:rFonts w:ascii="Times New Roman"/>
                 <w:b/>
                 <w:bCs/>
-                <w:sz w:val="20"/>
-                <w:szCs w:val="22"/>
+                <w:szCs w:val="28"/>
                 <w:lang w:bidi="ar-EG"/>
               </w:rPr>
             </w:pPr>
@@ -2655,8 +2596,7 @@
                 <w:rFonts w:ascii="Times New Roman"/>
                 <w:b/>
                 <w:bCs/>
-                <w:sz w:val="20"/>
-                <w:szCs w:val="22"/>
+                <w:szCs w:val="28"/>
                 <w:lang w:bidi="ar-EG"/>
               </w:rPr>
               <w:t>${</w:t>
@@ -2667,8 +2607,7 @@
                 <w:rFonts w:ascii="Times New Roman"/>
                 <w:b/>
                 <w:bCs/>
-                <w:sz w:val="20"/>
-                <w:szCs w:val="22"/>
+                <w:szCs w:val="28"/>
                 <w:lang w:bidi="ar-EG"/>
               </w:rPr>
               <w:t>mon_</w:t>
@@ -2678,8 +2617,7 @@
                 <w:rFonts w:ascii="Times New Roman"/>
                 <w:b/>
                 <w:bCs/>
-                <w:sz w:val="20"/>
-                <w:szCs w:val="22"/>
+                <w:szCs w:val="28"/>
                 <w:lang w:bidi="ar-EG"/>
               </w:rPr>
               <w:t>daily</w:t>
@@ -2690,8 +2628,7 @@
                 <w:rFonts w:ascii="Times New Roman"/>
                 <w:b/>
                 <w:bCs/>
-                <w:sz w:val="20"/>
-                <w:szCs w:val="22"/>
+                <w:szCs w:val="28"/>
                 <w:lang w:bidi="ar-EG"/>
               </w:rPr>
               <w:t>}</w:t>
@@ -2710,8 +2647,7 @@
                 <w:rFonts w:ascii="Times New Roman"/>
                 <w:b/>
                 <w:bCs/>
-                <w:sz w:val="20"/>
-                <w:szCs w:val="22"/>
+                <w:szCs w:val="28"/>
                 <w:lang w:bidi="ar-EG"/>
               </w:rPr>
             </w:pPr>
@@ -2720,8 +2656,7 @@
                 <w:rFonts w:ascii="Times New Roman"/>
                 <w:b/>
                 <w:bCs/>
-                <w:sz w:val="20"/>
-                <w:szCs w:val="22"/>
+                <w:szCs w:val="28"/>
                 <w:lang w:bidi="ar-EG"/>
               </w:rPr>
               <w:t>${</w:t>
@@ -2732,8 +2667,7 @@
                 <w:rFonts w:ascii="Times New Roman"/>
                 <w:b/>
                 <w:bCs/>
-                <w:sz w:val="20"/>
-                <w:szCs w:val="22"/>
+                <w:szCs w:val="28"/>
                 <w:lang w:bidi="ar-EG"/>
               </w:rPr>
               <w:t>sun_</w:t>
@@ -2743,8 +2677,7 @@
                 <w:rFonts w:ascii="Times New Roman"/>
                 <w:b/>
                 <w:bCs/>
-                <w:sz w:val="20"/>
-                <w:szCs w:val="22"/>
+                <w:szCs w:val="28"/>
                 <w:lang w:bidi="ar-EG"/>
               </w:rPr>
               <w:t>daily</w:t>
@@ -2755,8 +2688,7 @@
                 <w:rFonts w:ascii="Times New Roman"/>
                 <w:b/>
                 <w:bCs/>
-                <w:sz w:val="20"/>
-                <w:szCs w:val="22"/>
+                <w:szCs w:val="28"/>
                 <w:lang w:bidi="ar-EG"/>
               </w:rPr>
               <w:t>}</w:t>
@@ -2775,8 +2707,7 @@
                 <w:rFonts w:ascii="Times New Roman"/>
                 <w:b/>
                 <w:bCs/>
-                <w:sz w:val="20"/>
-                <w:szCs w:val="22"/>
+                <w:szCs w:val="28"/>
                 <w:lang w:bidi="ar-EG"/>
               </w:rPr>
             </w:pPr>
@@ -2785,8 +2716,7 @@
                 <w:rFonts w:ascii="Times New Roman"/>
                 <w:b/>
                 <w:bCs/>
-                <w:sz w:val="20"/>
-                <w:szCs w:val="22"/>
+                <w:szCs w:val="28"/>
                 <w:lang w:bidi="ar-EG"/>
               </w:rPr>
               <w:t>${</w:t>
@@ -2797,8 +2727,7 @@
                 <w:rFonts w:ascii="Times New Roman"/>
                 <w:b/>
                 <w:bCs/>
-                <w:sz w:val="20"/>
-                <w:szCs w:val="22"/>
+                <w:szCs w:val="28"/>
                 <w:lang w:bidi="ar-EG"/>
               </w:rPr>
               <w:t>sat_</w:t>
@@ -2808,8 +2737,7 @@
                 <w:rFonts w:ascii="Times New Roman"/>
                 <w:b/>
                 <w:bCs/>
-                <w:sz w:val="20"/>
-                <w:szCs w:val="22"/>
+                <w:szCs w:val="28"/>
                 <w:lang w:bidi="ar-EG"/>
               </w:rPr>
               <w:t>daily</w:t>
@@ -2820,8 +2748,7 @@
                 <w:rFonts w:ascii="Times New Roman"/>
                 <w:b/>
                 <w:bCs/>
-                <w:sz w:val="20"/>
-                <w:szCs w:val="22"/>
+                <w:szCs w:val="28"/>
                 <w:lang w:bidi="ar-EG"/>
               </w:rPr>
               <w:t>}</w:t>
@@ -5634,6 +5561,7 @@
                 <w:sz w:val="16"/>
                 <w:szCs w:val="16"/>
               </w:rPr>
+              <w:lastRenderedPageBreak/>
               <w:t>All Seat Belts Condition</w:t>
             </w:r>
             <w:r>
@@ -5664,6 +5592,7 @@
                 <w:sz w:val="6"/>
                 <w:szCs w:val="8"/>
               </w:rPr>
+              <w:lastRenderedPageBreak/>
               <w:t>${</w:t>
             </w:r>
             <w:proofErr w:type="spellStart"/>

</xml_diff>

<commit_message>
chore: update daily inspection document for improved formatting
</commit_message>
<xml_diff>
--- a/storage/app/templates/Qalab-daily-inspection.docx
+++ b/storage/app/templates/Qalab-daily-inspection.docx
@@ -897,14 +897,14 @@
         <w:tblLook w:val="0000" w:firstRow="0" w:lastRow="0" w:firstColumn="0" w:lastColumn="0" w:noHBand="0" w:noVBand="0"/>
       </w:tblPr>
       <w:tblGrid>
-        <w:gridCol w:w="1406"/>
-        <w:gridCol w:w="1499"/>
-        <w:gridCol w:w="1566"/>
-        <w:gridCol w:w="1472"/>
-        <w:gridCol w:w="1606"/>
-        <w:gridCol w:w="1513"/>
-        <w:gridCol w:w="1446"/>
-        <w:gridCol w:w="1167"/>
+        <w:gridCol w:w="1307"/>
+        <w:gridCol w:w="1392"/>
+        <w:gridCol w:w="1453"/>
+        <w:gridCol w:w="1368"/>
+        <w:gridCol w:w="1490"/>
+        <w:gridCol w:w="1405"/>
+        <w:gridCol w:w="1343"/>
+        <w:gridCol w:w="1377"/>
       </w:tblGrid>
       <w:tr>
         <w:trPr>
@@ -1968,25 +1968,28 @@
               <w:rPr>
                 <w:b/>
                 <w:bCs/>
-                <w:szCs w:val="28"/>
-              </w:rPr>
-            </w:pPr>
-            <w:r>
-              <w:rPr>
-                <w:rFonts w:ascii="Times New Roman"/>
-                <w:b/>
-                <w:bCs/>
-                <w:szCs w:val="28"/>
-              </w:rPr>
-              <w:t>${</w:t>
-            </w:r>
-            <w:proofErr w:type="spellStart"/>
-            <w:r>
-              <w:rPr>
-                <w:rFonts w:ascii="Times New Roman"/>
-                <w:b/>
-                <w:bCs/>
-                <w:szCs w:val="28"/>
+                <w:sz w:val="22"/>
+                <w:szCs w:val="22"/>
+              </w:rPr>
+            </w:pPr>
+            <w:r>
+              <w:rPr>
+                <w:rFonts w:ascii="Times New Roman"/>
+                <w:b/>
+                <w:bCs/>
+                <w:sz w:val="22"/>
+                <w:szCs w:val="22"/>
+              </w:rPr>
+              <w:t>${</w:t>
+            </w:r>
+            <w:proofErr w:type="spellStart"/>
+            <w:r>
+              <w:rPr>
+                <w:rFonts w:ascii="Times New Roman"/>
+                <w:b/>
+                <w:bCs/>
+                <w:sz w:val="22"/>
+                <w:szCs w:val="22"/>
               </w:rPr>
               <w:t>fri_date</w:t>
             </w:r>
@@ -1996,7 +1999,8 @@
                 <w:rFonts w:ascii="Times New Roman"/>
                 <w:b/>
                 <w:bCs/>
-                <w:szCs w:val="28"/>
+                <w:sz w:val="22"/>
+                <w:szCs w:val="22"/>
               </w:rPr>
               <w:t>}</w:t>
             </w:r>
@@ -2013,25 +2017,28 @@
               <w:rPr>
                 <w:b/>
                 <w:bCs/>
-                <w:szCs w:val="28"/>
-              </w:rPr>
-            </w:pPr>
-            <w:r>
-              <w:rPr>
-                <w:rFonts w:ascii="Times New Roman"/>
-                <w:b/>
-                <w:bCs/>
-                <w:szCs w:val="28"/>
-              </w:rPr>
-              <w:t>${</w:t>
-            </w:r>
-            <w:proofErr w:type="spellStart"/>
-            <w:r>
-              <w:rPr>
-                <w:rFonts w:ascii="Times New Roman"/>
-                <w:b/>
-                <w:bCs/>
-                <w:szCs w:val="28"/>
+                <w:sz w:val="22"/>
+                <w:szCs w:val="22"/>
+              </w:rPr>
+            </w:pPr>
+            <w:r>
+              <w:rPr>
+                <w:rFonts w:ascii="Times New Roman"/>
+                <w:b/>
+                <w:bCs/>
+                <w:sz w:val="22"/>
+                <w:szCs w:val="22"/>
+              </w:rPr>
+              <w:t>${</w:t>
+            </w:r>
+            <w:proofErr w:type="spellStart"/>
+            <w:r>
+              <w:rPr>
+                <w:rFonts w:ascii="Times New Roman"/>
+                <w:b/>
+                <w:bCs/>
+                <w:sz w:val="22"/>
+                <w:szCs w:val="22"/>
               </w:rPr>
               <w:t>thu_date</w:t>
             </w:r>
@@ -2041,7 +2048,8 @@
                 <w:rFonts w:ascii="Times New Roman"/>
                 <w:b/>
                 <w:bCs/>
-                <w:szCs w:val="28"/>
+                <w:sz w:val="22"/>
+                <w:szCs w:val="22"/>
               </w:rPr>
               <w:t>}</w:t>
             </w:r>
@@ -2057,25 +2065,28 @@
               <w:jc w:val="center"/>
               <w:rPr>
                 <w:rFonts w:ascii="Times New Roman"/>
-                <w:szCs w:val="28"/>
-              </w:rPr>
-            </w:pPr>
-            <w:r>
-              <w:rPr>
-                <w:rFonts w:ascii="Times New Roman"/>
-                <w:b/>
-                <w:bCs/>
-                <w:szCs w:val="28"/>
-              </w:rPr>
-              <w:t>${</w:t>
-            </w:r>
-            <w:proofErr w:type="spellStart"/>
-            <w:r>
-              <w:rPr>
-                <w:rFonts w:ascii="Times New Roman"/>
-                <w:b/>
-                <w:bCs/>
-                <w:szCs w:val="28"/>
+                <w:sz w:val="22"/>
+                <w:szCs w:val="22"/>
+              </w:rPr>
+            </w:pPr>
+            <w:r>
+              <w:rPr>
+                <w:rFonts w:ascii="Times New Roman"/>
+                <w:b/>
+                <w:bCs/>
+                <w:sz w:val="22"/>
+                <w:szCs w:val="22"/>
+              </w:rPr>
+              <w:t>${</w:t>
+            </w:r>
+            <w:proofErr w:type="spellStart"/>
+            <w:r>
+              <w:rPr>
+                <w:rFonts w:ascii="Times New Roman"/>
+                <w:b/>
+                <w:bCs/>
+                <w:sz w:val="22"/>
+                <w:szCs w:val="22"/>
               </w:rPr>
               <w:t>wed_date</w:t>
             </w:r>
@@ -2085,7 +2096,8 @@
                 <w:rFonts w:ascii="Times New Roman"/>
                 <w:b/>
                 <w:bCs/>
-                <w:szCs w:val="28"/>
+                <w:sz w:val="22"/>
+                <w:szCs w:val="22"/>
               </w:rPr>
               <w:t>}</w:t>
             </w:r>
@@ -2102,25 +2114,28 @@
               <w:rPr>
                 <w:b/>
                 <w:bCs/>
-                <w:szCs w:val="28"/>
-              </w:rPr>
-            </w:pPr>
-            <w:r>
-              <w:rPr>
-                <w:rFonts w:ascii="Times New Roman"/>
-                <w:b/>
-                <w:bCs/>
-                <w:szCs w:val="28"/>
-              </w:rPr>
-              <w:t>${</w:t>
-            </w:r>
-            <w:proofErr w:type="spellStart"/>
-            <w:r>
-              <w:rPr>
-                <w:rFonts w:ascii="Times New Roman"/>
-                <w:b/>
-                <w:bCs/>
-                <w:szCs w:val="28"/>
+                <w:sz w:val="22"/>
+                <w:szCs w:val="22"/>
+              </w:rPr>
+            </w:pPr>
+            <w:r>
+              <w:rPr>
+                <w:rFonts w:ascii="Times New Roman"/>
+                <w:b/>
+                <w:bCs/>
+                <w:sz w:val="22"/>
+                <w:szCs w:val="22"/>
+              </w:rPr>
+              <w:t>${</w:t>
+            </w:r>
+            <w:proofErr w:type="spellStart"/>
+            <w:r>
+              <w:rPr>
+                <w:rFonts w:ascii="Times New Roman"/>
+                <w:b/>
+                <w:bCs/>
+                <w:sz w:val="22"/>
+                <w:szCs w:val="22"/>
               </w:rPr>
               <w:t>tue_date</w:t>
             </w:r>
@@ -2130,7 +2145,8 @@
                 <w:rFonts w:ascii="Times New Roman"/>
                 <w:b/>
                 <w:bCs/>
-                <w:szCs w:val="28"/>
+                <w:sz w:val="22"/>
+                <w:szCs w:val="22"/>
               </w:rPr>
               <w:t>}</w:t>
             </w:r>
@@ -2147,25 +2163,28 @@
               <w:rPr>
                 <w:b/>
                 <w:bCs/>
-                <w:szCs w:val="28"/>
-              </w:rPr>
-            </w:pPr>
-            <w:r>
-              <w:rPr>
-                <w:rFonts w:ascii="Times New Roman"/>
-                <w:b/>
-                <w:bCs/>
-                <w:szCs w:val="28"/>
-              </w:rPr>
-              <w:t>${</w:t>
-            </w:r>
-            <w:proofErr w:type="spellStart"/>
-            <w:r>
-              <w:rPr>
-                <w:rFonts w:ascii="Times New Roman"/>
-                <w:b/>
-                <w:bCs/>
-                <w:szCs w:val="28"/>
+                <w:sz w:val="22"/>
+                <w:szCs w:val="22"/>
+              </w:rPr>
+            </w:pPr>
+            <w:r>
+              <w:rPr>
+                <w:rFonts w:ascii="Times New Roman"/>
+                <w:b/>
+                <w:bCs/>
+                <w:sz w:val="22"/>
+                <w:szCs w:val="22"/>
+              </w:rPr>
+              <w:t>${</w:t>
+            </w:r>
+            <w:proofErr w:type="spellStart"/>
+            <w:r>
+              <w:rPr>
+                <w:rFonts w:ascii="Times New Roman"/>
+                <w:b/>
+                <w:bCs/>
+                <w:sz w:val="22"/>
+                <w:szCs w:val="22"/>
               </w:rPr>
               <w:t>mon_date</w:t>
             </w:r>
@@ -2175,7 +2194,8 @@
                 <w:rFonts w:ascii="Times New Roman"/>
                 <w:b/>
                 <w:bCs/>
-                <w:szCs w:val="28"/>
+                <w:sz w:val="22"/>
+                <w:szCs w:val="22"/>
               </w:rPr>
               <w:t>}</w:t>
             </w:r>
@@ -2192,25 +2212,28 @@
               <w:rPr>
                 <w:b/>
                 <w:bCs/>
-                <w:szCs w:val="28"/>
-              </w:rPr>
-            </w:pPr>
-            <w:r>
-              <w:rPr>
-                <w:rFonts w:ascii="Times New Roman"/>
-                <w:b/>
-                <w:bCs/>
-                <w:szCs w:val="28"/>
-              </w:rPr>
-              <w:t>${</w:t>
-            </w:r>
-            <w:proofErr w:type="spellStart"/>
-            <w:r>
-              <w:rPr>
-                <w:rFonts w:ascii="Times New Roman"/>
-                <w:b/>
-                <w:bCs/>
-                <w:szCs w:val="28"/>
+                <w:sz w:val="22"/>
+                <w:szCs w:val="22"/>
+              </w:rPr>
+            </w:pPr>
+            <w:r>
+              <w:rPr>
+                <w:rFonts w:ascii="Times New Roman"/>
+                <w:b/>
+                <w:bCs/>
+                <w:sz w:val="22"/>
+                <w:szCs w:val="22"/>
+              </w:rPr>
+              <w:t>${</w:t>
+            </w:r>
+            <w:proofErr w:type="spellStart"/>
+            <w:r>
+              <w:rPr>
+                <w:rFonts w:ascii="Times New Roman"/>
+                <w:b/>
+                <w:bCs/>
+                <w:sz w:val="22"/>
+                <w:szCs w:val="22"/>
               </w:rPr>
               <w:t>sun_date</w:t>
             </w:r>
@@ -2220,7 +2243,8 @@
                 <w:rFonts w:ascii="Times New Roman"/>
                 <w:b/>
                 <w:bCs/>
-                <w:szCs w:val="28"/>
+                <w:sz w:val="22"/>
+                <w:szCs w:val="22"/>
               </w:rPr>
               <w:t>}</w:t>
             </w:r>
@@ -2237,25 +2261,28 @@
               <w:rPr>
                 <w:b/>
                 <w:bCs/>
-                <w:szCs w:val="28"/>
-              </w:rPr>
-            </w:pPr>
-            <w:r>
-              <w:rPr>
-                <w:rFonts w:ascii="Times New Roman"/>
-                <w:b/>
-                <w:bCs/>
-                <w:szCs w:val="28"/>
-              </w:rPr>
-              <w:t>${</w:t>
-            </w:r>
-            <w:proofErr w:type="spellStart"/>
-            <w:r>
-              <w:rPr>
-                <w:rFonts w:ascii="Times New Roman"/>
-                <w:b/>
-                <w:bCs/>
-                <w:szCs w:val="28"/>
+                <w:sz w:val="22"/>
+                <w:szCs w:val="22"/>
+              </w:rPr>
+            </w:pPr>
+            <w:r>
+              <w:rPr>
+                <w:rFonts w:ascii="Times New Roman"/>
+                <w:b/>
+                <w:bCs/>
+                <w:sz w:val="22"/>
+                <w:szCs w:val="22"/>
+              </w:rPr>
+              <w:t>${</w:t>
+            </w:r>
+            <w:proofErr w:type="spellStart"/>
+            <w:r>
+              <w:rPr>
+                <w:rFonts w:ascii="Times New Roman"/>
+                <w:b/>
+                <w:bCs/>
+                <w:sz w:val="22"/>
+                <w:szCs w:val="22"/>
               </w:rPr>
               <w:t>sat_date</w:t>
             </w:r>
@@ -2265,7 +2292,8 @@
                 <w:rFonts w:ascii="Times New Roman"/>
                 <w:b/>
                 <w:bCs/>
-                <w:szCs w:val="28"/>
+                <w:sz w:val="22"/>
+                <w:szCs w:val="22"/>
               </w:rPr>
               <w:t>}</w:t>
             </w:r>
@@ -2347,7 +2375,8 @@
                 <w:rFonts w:ascii="Times New Roman"/>
                 <w:b/>
                 <w:bCs/>
-                <w:szCs w:val="28"/>
+                <w:sz w:val="22"/>
+                <w:szCs w:val="22"/>
                 <w:lang w:bidi="ar-EG"/>
               </w:rPr>
             </w:pPr>
@@ -2356,7 +2385,8 @@
                 <w:rFonts w:ascii="Times New Roman"/>
                 <w:b/>
                 <w:bCs/>
-                <w:szCs w:val="28"/>
+                <w:sz w:val="22"/>
+                <w:szCs w:val="22"/>
                 <w:lang w:bidi="ar-EG"/>
               </w:rPr>
               <w:t>${</w:t>
@@ -2367,7 +2397,8 @@
                 <w:rFonts w:ascii="Times New Roman"/>
                 <w:b/>
                 <w:bCs/>
-                <w:szCs w:val="28"/>
+                <w:sz w:val="22"/>
+                <w:szCs w:val="22"/>
                 <w:lang w:bidi="ar-EG"/>
               </w:rPr>
               <w:t>fri_</w:t>
@@ -2377,7 +2408,8 @@
                 <w:rFonts w:ascii="Times New Roman"/>
                 <w:b/>
                 <w:bCs/>
-                <w:szCs w:val="28"/>
+                <w:sz w:val="22"/>
+                <w:szCs w:val="22"/>
                 <w:lang w:bidi="ar-EG"/>
               </w:rPr>
               <w:t>daily</w:t>
@@ -2388,7 +2420,8 @@
                 <w:rFonts w:ascii="Times New Roman"/>
                 <w:b/>
                 <w:bCs/>
-                <w:szCs w:val="28"/>
+                <w:sz w:val="22"/>
+                <w:szCs w:val="22"/>
                 <w:lang w:bidi="ar-EG"/>
               </w:rPr>
               <w:t>}</w:t>
@@ -2407,7 +2440,8 @@
                 <w:rFonts w:ascii="Times New Roman"/>
                 <w:b/>
                 <w:bCs/>
-                <w:szCs w:val="28"/>
+                <w:sz w:val="22"/>
+                <w:szCs w:val="22"/>
                 <w:lang w:bidi="ar-EG"/>
               </w:rPr>
             </w:pPr>
@@ -2416,7 +2450,8 @@
                 <w:rFonts w:ascii="Times New Roman"/>
                 <w:b/>
                 <w:bCs/>
-                <w:szCs w:val="28"/>
+                <w:sz w:val="22"/>
+                <w:szCs w:val="22"/>
                 <w:lang w:bidi="ar-EG"/>
               </w:rPr>
               <w:t>${</w:t>
@@ -2427,7 +2462,8 @@
                 <w:rFonts w:ascii="Times New Roman"/>
                 <w:b/>
                 <w:bCs/>
-                <w:szCs w:val="28"/>
+                <w:sz w:val="22"/>
+                <w:szCs w:val="22"/>
                 <w:lang w:bidi="ar-EG"/>
               </w:rPr>
               <w:t>thu_</w:t>
@@ -2437,7 +2473,8 @@
                 <w:rFonts w:ascii="Times New Roman"/>
                 <w:b/>
                 <w:bCs/>
-                <w:szCs w:val="28"/>
+                <w:sz w:val="22"/>
+                <w:szCs w:val="22"/>
                 <w:lang w:bidi="ar-EG"/>
               </w:rPr>
               <w:t>daily</w:t>
@@ -2448,7 +2485,8 @@
                 <w:rFonts w:ascii="Times New Roman"/>
                 <w:b/>
                 <w:bCs/>
-                <w:szCs w:val="28"/>
+                <w:sz w:val="22"/>
+                <w:szCs w:val="22"/>
                 <w:lang w:bidi="ar-EG"/>
               </w:rPr>
               <w:t>}</w:t>
@@ -2467,7 +2505,8 @@
                 <w:rFonts w:ascii="Times New Roman"/>
                 <w:b/>
                 <w:bCs/>
-                <w:szCs w:val="28"/>
+                <w:sz w:val="22"/>
+                <w:szCs w:val="22"/>
                 <w:lang w:bidi="ar-EG"/>
               </w:rPr>
             </w:pPr>
@@ -2476,7 +2515,8 @@
                 <w:rFonts w:ascii="Times New Roman"/>
                 <w:b/>
                 <w:bCs/>
-                <w:szCs w:val="28"/>
+                <w:sz w:val="22"/>
+                <w:szCs w:val="22"/>
                 <w:lang w:bidi="ar-EG"/>
               </w:rPr>
               <w:t>${</w:t>
@@ -2487,7 +2527,8 @@
                 <w:rFonts w:ascii="Times New Roman"/>
                 <w:b/>
                 <w:bCs/>
-                <w:szCs w:val="28"/>
+                <w:sz w:val="22"/>
+                <w:szCs w:val="22"/>
                 <w:lang w:bidi="ar-EG"/>
               </w:rPr>
               <w:t>wed_</w:t>
@@ -2497,7 +2538,8 @@
                 <w:rFonts w:ascii="Times New Roman"/>
                 <w:b/>
                 <w:bCs/>
-                <w:szCs w:val="28"/>
+                <w:sz w:val="22"/>
+                <w:szCs w:val="22"/>
                 <w:lang w:bidi="ar-EG"/>
               </w:rPr>
               <w:t>daily</w:t>
@@ -2508,7 +2550,8 @@
                 <w:rFonts w:ascii="Times New Roman"/>
                 <w:b/>
                 <w:bCs/>
-                <w:szCs w:val="28"/>
+                <w:sz w:val="22"/>
+                <w:szCs w:val="22"/>
                 <w:lang w:bidi="ar-EG"/>
               </w:rPr>
               <w:t>}</w:t>
@@ -2527,7 +2570,8 @@
                 <w:rFonts w:ascii="Times New Roman"/>
                 <w:b/>
                 <w:bCs/>
-                <w:szCs w:val="28"/>
+                <w:sz w:val="22"/>
+                <w:szCs w:val="22"/>
                 <w:lang w:bidi="ar-EG"/>
               </w:rPr>
             </w:pPr>
@@ -2536,7 +2580,8 @@
                 <w:rFonts w:ascii="Times New Roman"/>
                 <w:b/>
                 <w:bCs/>
-                <w:szCs w:val="28"/>
+                <w:sz w:val="22"/>
+                <w:szCs w:val="22"/>
                 <w:lang w:bidi="ar-EG"/>
               </w:rPr>
               <w:t>${</w:t>
@@ -2547,7 +2592,8 @@
                 <w:rFonts w:ascii="Times New Roman"/>
                 <w:b/>
                 <w:bCs/>
-                <w:szCs w:val="28"/>
+                <w:sz w:val="22"/>
+                <w:szCs w:val="22"/>
                 <w:lang w:bidi="ar-EG"/>
               </w:rPr>
               <w:t>tue_</w:t>
@@ -2557,7 +2603,8 @@
                 <w:rFonts w:ascii="Times New Roman"/>
                 <w:b/>
                 <w:bCs/>
-                <w:szCs w:val="28"/>
+                <w:sz w:val="22"/>
+                <w:szCs w:val="22"/>
                 <w:lang w:bidi="ar-EG"/>
               </w:rPr>
               <w:t>daily</w:t>
@@ -2568,7 +2615,8 @@
                 <w:rFonts w:ascii="Times New Roman"/>
                 <w:b/>
                 <w:bCs/>
-                <w:szCs w:val="28"/>
+                <w:sz w:val="22"/>
+                <w:szCs w:val="22"/>
                 <w:lang w:bidi="ar-EG"/>
               </w:rPr>
               <w:t>}</w:t>
@@ -2587,7 +2635,8 @@
                 <w:rFonts w:ascii="Times New Roman"/>
                 <w:b/>
                 <w:bCs/>
-                <w:szCs w:val="28"/>
+                <w:sz w:val="22"/>
+                <w:szCs w:val="22"/>
                 <w:lang w:bidi="ar-EG"/>
               </w:rPr>
             </w:pPr>
@@ -2596,7 +2645,8 @@
                 <w:rFonts w:ascii="Times New Roman"/>
                 <w:b/>
                 <w:bCs/>
-                <w:szCs w:val="28"/>
+                <w:sz w:val="22"/>
+                <w:szCs w:val="22"/>
                 <w:lang w:bidi="ar-EG"/>
               </w:rPr>
               <w:t>${</w:t>
@@ -2607,7 +2657,8 @@
                 <w:rFonts w:ascii="Times New Roman"/>
                 <w:b/>
                 <w:bCs/>
-                <w:szCs w:val="28"/>
+                <w:sz w:val="22"/>
+                <w:szCs w:val="22"/>
                 <w:lang w:bidi="ar-EG"/>
               </w:rPr>
               <w:t>mon_</w:t>
@@ -2617,7 +2668,8 @@
                 <w:rFonts w:ascii="Times New Roman"/>
                 <w:b/>
                 <w:bCs/>
-                <w:szCs w:val="28"/>
+                <w:sz w:val="22"/>
+                <w:szCs w:val="22"/>
                 <w:lang w:bidi="ar-EG"/>
               </w:rPr>
               <w:t>daily</w:t>
@@ -2628,7 +2680,8 @@
                 <w:rFonts w:ascii="Times New Roman"/>
                 <w:b/>
                 <w:bCs/>
-                <w:szCs w:val="28"/>
+                <w:sz w:val="22"/>
+                <w:szCs w:val="22"/>
                 <w:lang w:bidi="ar-EG"/>
               </w:rPr>
               <w:t>}</w:t>
@@ -2647,7 +2700,8 @@
                 <w:rFonts w:ascii="Times New Roman"/>
                 <w:b/>
                 <w:bCs/>
-                <w:szCs w:val="28"/>
+                <w:sz w:val="22"/>
+                <w:szCs w:val="22"/>
                 <w:lang w:bidi="ar-EG"/>
               </w:rPr>
             </w:pPr>
@@ -2656,7 +2710,8 @@
                 <w:rFonts w:ascii="Times New Roman"/>
                 <w:b/>
                 <w:bCs/>
-                <w:szCs w:val="28"/>
+                <w:sz w:val="22"/>
+                <w:szCs w:val="22"/>
                 <w:lang w:bidi="ar-EG"/>
               </w:rPr>
               <w:t>${</w:t>
@@ -2667,7 +2722,8 @@
                 <w:rFonts w:ascii="Times New Roman"/>
                 <w:b/>
                 <w:bCs/>
-                <w:szCs w:val="28"/>
+                <w:sz w:val="22"/>
+                <w:szCs w:val="22"/>
                 <w:lang w:bidi="ar-EG"/>
               </w:rPr>
               <w:t>sun_</w:t>
@@ -2677,7 +2733,8 @@
                 <w:rFonts w:ascii="Times New Roman"/>
                 <w:b/>
                 <w:bCs/>
-                <w:szCs w:val="28"/>
+                <w:sz w:val="22"/>
+                <w:szCs w:val="22"/>
                 <w:lang w:bidi="ar-EG"/>
               </w:rPr>
               <w:t>daily</w:t>
@@ -2688,7 +2745,8 @@
                 <w:rFonts w:ascii="Times New Roman"/>
                 <w:b/>
                 <w:bCs/>
-                <w:szCs w:val="28"/>
+                <w:sz w:val="22"/>
+                <w:szCs w:val="22"/>
                 <w:lang w:bidi="ar-EG"/>
               </w:rPr>
               <w:t>}</w:t>
@@ -2707,7 +2765,8 @@
                 <w:rFonts w:ascii="Times New Roman"/>
                 <w:b/>
                 <w:bCs/>
-                <w:szCs w:val="28"/>
+                <w:sz w:val="22"/>
+                <w:szCs w:val="22"/>
                 <w:lang w:bidi="ar-EG"/>
               </w:rPr>
             </w:pPr>
@@ -2716,7 +2775,8 @@
                 <w:rFonts w:ascii="Times New Roman"/>
                 <w:b/>
                 <w:bCs/>
-                <w:szCs w:val="28"/>
+                <w:sz w:val="22"/>
+                <w:szCs w:val="22"/>
                 <w:lang w:bidi="ar-EG"/>
               </w:rPr>
               <w:t>${</w:t>
@@ -2727,7 +2787,8 @@
                 <w:rFonts w:ascii="Times New Roman"/>
                 <w:b/>
                 <w:bCs/>
-                <w:szCs w:val="28"/>
+                <w:sz w:val="22"/>
+                <w:szCs w:val="22"/>
                 <w:lang w:bidi="ar-EG"/>
               </w:rPr>
               <w:t>sat_</w:t>
@@ -2737,7 +2798,8 @@
                 <w:rFonts w:ascii="Times New Roman"/>
                 <w:b/>
                 <w:bCs/>
-                <w:szCs w:val="28"/>
+                <w:sz w:val="22"/>
+                <w:szCs w:val="22"/>
                 <w:lang w:bidi="ar-EG"/>
               </w:rPr>
               <w:t>daily</w:t>
@@ -2748,7 +2810,8 @@
                 <w:rFonts w:ascii="Times New Roman"/>
                 <w:b/>
                 <w:bCs/>
-                <w:szCs w:val="28"/>
+                <w:sz w:val="22"/>
+                <w:szCs w:val="22"/>
                 <w:lang w:bidi="ar-EG"/>
               </w:rPr>
               <w:t>}</w:t>
@@ -5561,7 +5624,6 @@
                 <w:sz w:val="16"/>
                 <w:szCs w:val="16"/>
               </w:rPr>
-              <w:lastRenderedPageBreak/>
               <w:t>All Seat Belts Condition</w:t>
             </w:r>
             <w:r>
@@ -5592,7 +5654,6 @@
                 <w:sz w:val="6"/>
                 <w:szCs w:val="8"/>
               </w:rPr>
-              <w:lastRenderedPageBreak/>
               <w:t>${</w:t>
             </w:r>
             <w:proofErr w:type="spellStart"/>
@@ -6157,6 +6218,7 @@
                 <w:sz w:val="16"/>
                 <w:szCs w:val="16"/>
               </w:rPr>
+              <w:lastRenderedPageBreak/>
               <w:t>Dumper condition</w:t>
             </w:r>
             <w:r>
@@ -6187,6 +6249,7 @@
                 <w:sz w:val="6"/>
                 <w:szCs w:val="8"/>
               </w:rPr>
+              <w:lastRenderedPageBreak/>
               <w:t>${</w:t>
             </w:r>
             <w:proofErr w:type="spellStart"/>

</xml_diff>

<commit_message>
feat: add daily inspection templates for various equipment types
</commit_message>
<xml_diff>
--- a/storage/app/templates/Qalab-daily-inspection.docx
+++ b/storage/app/templates/Qalab-daily-inspection.docx
@@ -17,22 +17,22 @@
         <w:tblLook w:val="0000" w:firstRow="0" w:lastRow="0" w:firstColumn="0" w:lastColumn="0" w:noHBand="0" w:noVBand="0"/>
       </w:tblPr>
       <w:tblGrid>
+        <w:gridCol w:w="878"/>
         <w:gridCol w:w="862"/>
-        <w:gridCol w:w="863"/>
-        <w:gridCol w:w="894"/>
-        <w:gridCol w:w="970"/>
-        <w:gridCol w:w="793"/>
-        <w:gridCol w:w="939"/>
-        <w:gridCol w:w="1122"/>
-        <w:gridCol w:w="144"/>
-        <w:gridCol w:w="1094"/>
-        <w:gridCol w:w="228"/>
-        <w:gridCol w:w="770"/>
+        <w:gridCol w:w="904"/>
+        <w:gridCol w:w="955"/>
+        <w:gridCol w:w="785"/>
+        <w:gridCol w:w="920"/>
+        <w:gridCol w:w="1082"/>
+        <w:gridCol w:w="151"/>
+        <w:gridCol w:w="1108"/>
+        <w:gridCol w:w="231"/>
+        <w:gridCol w:w="803"/>
         <w:gridCol w:w="2357"/>
       </w:tblGrid>
       <w:tr>
         <w:trPr>
-          <w:trHeight w:val="251"/>
+          <w:trHeight w:val="250"/>
         </w:trPr>
         <w:tc>
           <w:tcPr>
@@ -54,16 +54,16 @@
                 <w:szCs w:val="8"/>
               </w:rPr>
               <w:drawing>
-                <wp:anchor distT="0" distB="0" distL="114300" distR="114300" simplePos="0" relativeHeight="251659264" behindDoc="0" locked="0" layoutInCell="1" allowOverlap="1" wp14:anchorId="260ED807" wp14:editId="2282468F">
+                <wp:anchor distT="0" distB="0" distL="114300" distR="114300" simplePos="0" relativeHeight="251658240" behindDoc="0" locked="0" layoutInCell="1" allowOverlap="1" wp14:anchorId="3AACE8B5" wp14:editId="096E8D49">
                   <wp:simplePos x="0" y="0"/>
                   <wp:positionH relativeFrom="column">
-                    <wp:posOffset>-47993</wp:posOffset>
+                    <wp:posOffset>-50298</wp:posOffset>
                   </wp:positionH>
                   <wp:positionV relativeFrom="paragraph">
-                    <wp:posOffset>101898</wp:posOffset>
+                    <wp:posOffset>169384</wp:posOffset>
                   </wp:positionV>
-                  <wp:extent cx="1966340" cy="437165"/>
-                  <wp:effectExtent l="0" t="0" r="0" b="1270"/>
+                  <wp:extent cx="1963270" cy="308344"/>
+                  <wp:effectExtent l="0" t="0" r="0" b="0"/>
                   <wp:wrapNone/>
                   <wp:docPr id="1129190490" name="Picture 3"/>
                   <wp:cNvGraphicFramePr>
@@ -91,7 +91,7 @@
                         <pic:spPr>
                           <a:xfrm>
                             <a:off x="0" y="0"/>
-                            <a:ext cx="1966340" cy="437165"/>
+                            <a:ext cx="1971340" cy="309612"/>
                           </a:xfrm>
                           <a:prstGeom prst="rect">
                             <a:avLst/>
@@ -236,7 +236,7 @@
       </w:tr>
       <w:tr>
         <w:trPr>
-          <w:trHeight w:val="251"/>
+          <w:trHeight w:val="67"/>
         </w:trPr>
         <w:tc>
           <w:tcPr>
@@ -311,7 +311,7 @@
       </w:tr>
       <w:tr>
         <w:trPr>
-          <w:trHeight w:val="259"/>
+          <w:trHeight w:val="67"/>
         </w:trPr>
         <w:tc>
           <w:tcPr>
@@ -418,16 +418,16 @@
               <w:rPr>
                 <w:b/>
                 <w:bCs/>
-                <w:sz w:val="18"/>
-                <w:szCs w:val="18"/>
-              </w:rPr>
-            </w:pPr>
-            <w:r>
-              <w:rPr>
-                <w:b/>
-                <w:bCs/>
-                <w:sz w:val="18"/>
-                <w:szCs w:val="18"/>
+                <w:sz w:val="16"/>
+                <w:szCs w:val="16"/>
+              </w:rPr>
+            </w:pPr>
+            <w:r>
+              <w:rPr>
+                <w:b/>
+                <w:bCs/>
+                <w:sz w:val="16"/>
+                <w:szCs w:val="16"/>
                 <w:rtl/>
               </w:rPr>
               <w:t>م</w:t>
@@ -437,8 +437,8 @@
                 <w:rFonts w:hint="cs"/>
                 <w:b/>
                 <w:bCs/>
-                <w:sz w:val="18"/>
-                <w:szCs w:val="18"/>
+                <w:sz w:val="16"/>
+                <w:szCs w:val="16"/>
                 <w:rtl/>
               </w:rPr>
               <w:t>.</w:t>
@@ -447,8 +447,8 @@
               <w:rPr>
                 <w:b/>
                 <w:bCs/>
-                <w:sz w:val="18"/>
-                <w:szCs w:val="18"/>
+                <w:sz w:val="16"/>
+                <w:szCs w:val="16"/>
                 <w:rtl/>
               </w:rPr>
               <w:t xml:space="preserve"> المعدة</w:t>
@@ -457,8 +457,8 @@
               <w:rPr>
                 <w:b/>
                 <w:bCs/>
-                <w:sz w:val="18"/>
-                <w:szCs w:val="18"/>
+                <w:sz w:val="16"/>
+                <w:szCs w:val="16"/>
               </w:rPr>
               <w:t xml:space="preserve"> </w:t>
             </w:r>
@@ -470,16 +470,16 @@
               <w:rPr>
                 <w:b/>
                 <w:bCs/>
-                <w:sz w:val="18"/>
-                <w:szCs w:val="18"/>
-              </w:rPr>
-            </w:pPr>
-            <w:r>
-              <w:rPr>
-                <w:b/>
-                <w:bCs/>
-                <w:sz w:val="18"/>
-                <w:szCs w:val="18"/>
+                <w:sz w:val="16"/>
+                <w:szCs w:val="16"/>
+              </w:rPr>
+            </w:pPr>
+            <w:r>
+              <w:rPr>
+                <w:b/>
+                <w:bCs/>
+                <w:sz w:val="16"/>
+                <w:szCs w:val="16"/>
               </w:rPr>
               <w:t>Serial No.</w:t>
             </w:r>
@@ -496,21 +496,21 @@
               <w:rPr>
                 <w:b/>
                 <w:bCs/>
-                <w:sz w:val="18"/>
-                <w:szCs w:val="18"/>
-                <w:rtl/>
-              </w:rPr>
-            </w:pPr>
-          </w:p>
-          <w:p>
-            <w:pPr>
-              <w:spacing w:after="0" w:line="240" w:lineRule="auto"/>
-              <w:jc w:val="center"/>
-              <w:rPr>
-                <w:b/>
-                <w:bCs/>
-                <w:sz w:val="18"/>
-                <w:szCs w:val="18"/>
+                <w:sz w:val="16"/>
+                <w:szCs w:val="16"/>
+                <w:rtl/>
+              </w:rPr>
+            </w:pPr>
+          </w:p>
+          <w:p>
+            <w:pPr>
+              <w:spacing w:after="0" w:line="240" w:lineRule="auto"/>
+              <w:jc w:val="center"/>
+              <w:rPr>
+                <w:b/>
+                <w:bCs/>
+                <w:sz w:val="16"/>
+                <w:szCs w:val="16"/>
               </w:rPr>
             </w:pPr>
             <w:r>
@@ -518,8 +518,8 @@
                 <w:rFonts w:hint="cs"/>
                 <w:b/>
                 <w:bCs/>
-                <w:sz w:val="18"/>
-                <w:szCs w:val="18"/>
+                <w:sz w:val="16"/>
+                <w:szCs w:val="16"/>
                 <w:rtl/>
               </w:rPr>
               <w:t>..........</w:t>
@@ -537,16 +537,16 @@
               <w:rPr>
                 <w:b/>
                 <w:bCs/>
-                <w:sz w:val="18"/>
-                <w:szCs w:val="18"/>
-              </w:rPr>
-            </w:pPr>
-            <w:r>
-              <w:rPr>
-                <w:b/>
-                <w:bCs/>
-                <w:sz w:val="18"/>
-                <w:szCs w:val="18"/>
+                <w:sz w:val="16"/>
+                <w:szCs w:val="16"/>
+              </w:rPr>
+            </w:pPr>
+            <w:r>
+              <w:rPr>
+                <w:b/>
+                <w:bCs/>
+                <w:sz w:val="16"/>
+                <w:szCs w:val="16"/>
                 <w:rtl/>
               </w:rPr>
               <w:t>م التسجيل</w:t>
@@ -555,8 +555,8 @@
               <w:rPr>
                 <w:b/>
                 <w:bCs/>
-                <w:sz w:val="18"/>
-                <w:szCs w:val="18"/>
+                <w:sz w:val="16"/>
+                <w:szCs w:val="16"/>
               </w:rPr>
               <w:t xml:space="preserve"> Reg. No.</w:t>
             </w:r>
@@ -573,21 +573,21 @@
               <w:rPr>
                 <w:b/>
                 <w:bCs/>
-                <w:sz w:val="18"/>
-                <w:szCs w:val="18"/>
-                <w:rtl/>
-              </w:rPr>
-            </w:pPr>
-          </w:p>
-          <w:p>
-            <w:pPr>
-              <w:spacing w:after="0" w:line="240" w:lineRule="auto"/>
-              <w:jc w:val="center"/>
-              <w:rPr>
-                <w:b/>
-                <w:bCs/>
-                <w:sz w:val="18"/>
-                <w:szCs w:val="18"/>
+                <w:sz w:val="16"/>
+                <w:szCs w:val="16"/>
+                <w:rtl/>
+              </w:rPr>
+            </w:pPr>
+          </w:p>
+          <w:p>
+            <w:pPr>
+              <w:spacing w:after="0" w:line="240" w:lineRule="auto"/>
+              <w:jc w:val="center"/>
+              <w:rPr>
+                <w:b/>
+                <w:bCs/>
+                <w:sz w:val="16"/>
+                <w:szCs w:val="16"/>
               </w:rPr>
             </w:pPr>
             <w:r>
@@ -595,8 +595,8 @@
                 <w:rFonts w:hint="cs"/>
                 <w:b/>
                 <w:bCs/>
-                <w:sz w:val="18"/>
-                <w:szCs w:val="18"/>
+                <w:sz w:val="16"/>
+                <w:szCs w:val="16"/>
                 <w:rtl/>
               </w:rPr>
               <w:t>.............</w:t>
@@ -614,16 +614,16 @@
               <w:rPr>
                 <w:b/>
                 <w:bCs/>
-                <w:sz w:val="18"/>
-                <w:szCs w:val="18"/>
-              </w:rPr>
-            </w:pPr>
-            <w:r>
-              <w:rPr>
-                <w:b/>
-                <w:bCs/>
-                <w:sz w:val="18"/>
-                <w:szCs w:val="18"/>
+                <w:sz w:val="16"/>
+                <w:szCs w:val="16"/>
+              </w:rPr>
+            </w:pPr>
+            <w:r>
+              <w:rPr>
+                <w:b/>
+                <w:bCs/>
+                <w:sz w:val="16"/>
+                <w:szCs w:val="16"/>
                 <w:rtl/>
               </w:rPr>
               <w:t>الموديل</w:t>
@@ -632,8 +632,8 @@
               <w:rPr>
                 <w:b/>
                 <w:bCs/>
-                <w:sz w:val="18"/>
-                <w:szCs w:val="18"/>
+                <w:sz w:val="16"/>
+                <w:szCs w:val="16"/>
               </w:rPr>
               <w:t xml:space="preserve"> Model</w:t>
             </w:r>
@@ -650,21 +650,21 @@
               <w:rPr>
                 <w:b/>
                 <w:bCs/>
-                <w:sz w:val="18"/>
-                <w:szCs w:val="18"/>
-                <w:rtl/>
-              </w:rPr>
-            </w:pPr>
-          </w:p>
-          <w:p>
-            <w:pPr>
-              <w:spacing w:after="0" w:line="240" w:lineRule="auto"/>
-              <w:jc w:val="center"/>
-              <w:rPr>
-                <w:b/>
-                <w:bCs/>
-                <w:sz w:val="18"/>
-                <w:szCs w:val="18"/>
+                <w:sz w:val="16"/>
+                <w:szCs w:val="16"/>
+                <w:rtl/>
+              </w:rPr>
+            </w:pPr>
+          </w:p>
+          <w:p>
+            <w:pPr>
+              <w:spacing w:after="0" w:line="240" w:lineRule="auto"/>
+              <w:jc w:val="center"/>
+              <w:rPr>
+                <w:b/>
+                <w:bCs/>
+                <w:sz w:val="16"/>
+                <w:szCs w:val="16"/>
               </w:rPr>
             </w:pPr>
             <w:r>
@@ -672,8 +672,8 @@
                 <w:rFonts w:hint="cs"/>
                 <w:b/>
                 <w:bCs/>
-                <w:sz w:val="18"/>
-                <w:szCs w:val="18"/>
+                <w:sz w:val="16"/>
+                <w:szCs w:val="16"/>
                 <w:rtl/>
               </w:rPr>
               <w:t>.............</w:t>
@@ -692,16 +692,16 @@
               <w:rPr>
                 <w:b/>
                 <w:bCs/>
-                <w:sz w:val="18"/>
-                <w:szCs w:val="18"/>
-              </w:rPr>
-            </w:pPr>
-            <w:r>
-              <w:rPr>
-                <w:b/>
-                <w:bCs/>
-                <w:sz w:val="18"/>
-                <w:szCs w:val="18"/>
+                <w:sz w:val="16"/>
+                <w:szCs w:val="16"/>
+              </w:rPr>
+            </w:pPr>
+            <w:r>
+              <w:rPr>
+                <w:b/>
+                <w:bCs/>
+                <w:sz w:val="16"/>
+                <w:szCs w:val="16"/>
                 <w:rtl/>
               </w:rPr>
               <w:t>المصنع</w:t>
@@ -710,8 +710,8 @@
               <w:rPr>
                 <w:b/>
                 <w:bCs/>
-                <w:sz w:val="18"/>
-                <w:szCs w:val="18"/>
+                <w:sz w:val="16"/>
+                <w:szCs w:val="16"/>
               </w:rPr>
               <w:t xml:space="preserve"> Manufacture</w:t>
             </w:r>
@@ -728,21 +728,21 @@
               <w:rPr>
                 <w:b/>
                 <w:bCs/>
-                <w:sz w:val="18"/>
-                <w:szCs w:val="18"/>
-                <w:rtl/>
-              </w:rPr>
-            </w:pPr>
-          </w:p>
-          <w:p>
-            <w:pPr>
-              <w:spacing w:after="0" w:line="240" w:lineRule="auto"/>
-              <w:jc w:val="center"/>
-              <w:rPr>
-                <w:b/>
-                <w:bCs/>
-                <w:sz w:val="18"/>
-                <w:szCs w:val="18"/>
+                <w:sz w:val="16"/>
+                <w:szCs w:val="16"/>
+                <w:rtl/>
+              </w:rPr>
+            </w:pPr>
+          </w:p>
+          <w:p>
+            <w:pPr>
+              <w:spacing w:after="0" w:line="240" w:lineRule="auto"/>
+              <w:jc w:val="center"/>
+              <w:rPr>
+                <w:b/>
+                <w:bCs/>
+                <w:sz w:val="16"/>
+                <w:szCs w:val="16"/>
               </w:rPr>
             </w:pPr>
             <w:r>
@@ -750,8 +750,8 @@
                 <w:rFonts w:hint="cs"/>
                 <w:b/>
                 <w:bCs/>
-                <w:sz w:val="18"/>
-                <w:szCs w:val="18"/>
+                <w:sz w:val="16"/>
+                <w:szCs w:val="16"/>
                 <w:rtl/>
               </w:rPr>
               <w:t>.............</w:t>
@@ -770,8 +770,8 @@
               <w:rPr>
                 <w:b/>
                 <w:bCs/>
-                <w:sz w:val="18"/>
-                <w:szCs w:val="18"/>
+                <w:sz w:val="16"/>
+                <w:szCs w:val="16"/>
                 <w:rtl/>
               </w:rPr>
             </w:pPr>
@@ -780,8 +780,8 @@
                 <w:rFonts w:hint="cs"/>
                 <w:b/>
                 <w:bCs/>
-                <w:sz w:val="18"/>
-                <w:szCs w:val="18"/>
+                <w:sz w:val="16"/>
+                <w:szCs w:val="16"/>
                 <w:rtl/>
               </w:rPr>
               <w:t>م.</w:t>
@@ -790,8 +790,8 @@
               <w:rPr>
                 <w:b/>
                 <w:bCs/>
-                <w:sz w:val="18"/>
-                <w:szCs w:val="18"/>
+                <w:sz w:val="16"/>
+                <w:szCs w:val="16"/>
                 <w:rtl/>
               </w:rPr>
               <w:t xml:space="preserve"> تصريح الدخول</w:t>
@@ -800,8 +800,8 @@
               <w:rPr>
                 <w:b/>
                 <w:bCs/>
-                <w:sz w:val="18"/>
-                <w:szCs w:val="18"/>
+                <w:sz w:val="16"/>
+                <w:szCs w:val="16"/>
               </w:rPr>
               <w:t xml:space="preserve"> </w:t>
             </w:r>
@@ -813,16 +813,16 @@
               <w:rPr>
                 <w:b/>
                 <w:bCs/>
-                <w:sz w:val="18"/>
-                <w:szCs w:val="18"/>
-              </w:rPr>
-            </w:pPr>
-            <w:r>
-              <w:rPr>
-                <w:b/>
-                <w:bCs/>
-                <w:sz w:val="18"/>
-                <w:szCs w:val="18"/>
+                <w:sz w:val="16"/>
+                <w:szCs w:val="16"/>
+              </w:rPr>
+            </w:pPr>
+            <w:r>
+              <w:rPr>
+                <w:b/>
+                <w:bCs/>
+                <w:sz w:val="16"/>
+                <w:szCs w:val="16"/>
               </w:rPr>
               <w:t>Entry Per. Ser.</w:t>
             </w:r>
@@ -835,11 +835,25 @@
           <w:p>
             <w:pPr>
               <w:spacing w:after="0" w:line="240" w:lineRule="auto"/>
-              <w:rPr>
-                <w:b/>
-                <w:bCs/>
-                <w:sz w:val="26"/>
-                <w:szCs w:val="26"/>
+              <w:jc w:val="center"/>
+              <w:rPr>
+                <w:b/>
+                <w:bCs/>
+                <w:sz w:val="16"/>
+                <w:szCs w:val="16"/>
+                <w:rtl/>
+              </w:rPr>
+            </w:pPr>
+          </w:p>
+          <w:p>
+            <w:pPr>
+              <w:spacing w:after="0" w:line="240" w:lineRule="auto"/>
+              <w:jc w:val="center"/>
+              <w:rPr>
+                <w:b/>
+                <w:bCs/>
+                <w:sz w:val="16"/>
+                <w:szCs w:val="16"/>
               </w:rPr>
             </w:pPr>
             <w:r>
@@ -894,17 +908,19 @@
           <w:insideH w:val="single" w:sz="8" w:space="0" w:color="auto"/>
           <w:insideV w:val="single" w:sz="8" w:space="0" w:color="auto"/>
         </w:tblBorders>
+        <w:tblLayout w:type="fixed"/>
         <w:tblLook w:val="0000" w:firstRow="0" w:lastRow="0" w:firstColumn="0" w:lastColumn="0" w:noHBand="0" w:noVBand="0"/>
       </w:tblPr>
       <w:tblGrid>
-        <w:gridCol w:w="1307"/>
-        <w:gridCol w:w="1392"/>
-        <w:gridCol w:w="1453"/>
-        <w:gridCol w:w="1368"/>
-        <w:gridCol w:w="1490"/>
-        <w:gridCol w:w="1405"/>
-        <w:gridCol w:w="1343"/>
-        <w:gridCol w:w="1377"/>
+        <w:gridCol w:w="1297"/>
+        <w:gridCol w:w="1183"/>
+        <w:gridCol w:w="1110"/>
+        <w:gridCol w:w="1112"/>
+        <w:gridCol w:w="1065"/>
+        <w:gridCol w:w="1126"/>
+        <w:gridCol w:w="657"/>
+        <w:gridCol w:w="559"/>
+        <w:gridCol w:w="3026"/>
       </w:tblGrid>
       <w:tr>
         <w:trPr>
@@ -913,7 +929,7 @@
         <w:tc>
           <w:tcPr>
             <w:tcW w:w="11135" w:type="dxa"/>
-            <w:gridSpan w:val="8"/>
+            <w:gridSpan w:val="9"/>
           </w:tcPr>
           <w:p>
             <w:pPr>
@@ -1010,7 +1026,7 @@
         <w:tc>
           <w:tcPr>
             <w:tcW w:w="11135" w:type="dxa"/>
-            <w:gridSpan w:val="8"/>
+            <w:gridSpan w:val="9"/>
             <w:shd w:val="clear" w:color="auto" w:fill="5B9BD5" w:themeFill="accent5"/>
           </w:tcPr>
           <w:p>
@@ -1070,7 +1086,7 @@
       </w:tr>
       <w:tr>
         <w:trPr>
-          <w:trHeight w:val="1025"/>
+          <w:trHeight w:val="566"/>
         </w:trPr>
         <w:tc>
           <w:tcPr>
@@ -1157,6 +1173,8 @@
                 <w:rFonts w:hint="cs"/>
                 <w:b/>
                 <w:bCs/>
+                <w:sz w:val="28"/>
+                <w:szCs w:val="28"/>
                 <w:rtl/>
               </w:rPr>
               <w:t>الشيماء</w:t>
@@ -1165,8 +1183,11 @@
         </w:tc>
         <w:tc>
           <w:tcPr>
-            <w:tcW w:w="4519" w:type="dxa"/>
+            <w:tcW w:w="3960" w:type="dxa"/>
             <w:gridSpan w:val="4"/>
+            <w:tcBorders>
+              <w:right w:val="single" w:sz="8" w:space="0" w:color="auto"/>
+            </w:tcBorders>
           </w:tcPr>
           <w:p>
             <w:pPr>
@@ -1241,67 +1262,53 @@
               <w:rPr>
                 <w:b/>
                 <w:bCs/>
-                <w:sz w:val="26"/>
-                <w:szCs w:val="26"/>
-              </w:rPr>
-            </w:pPr>
-            <w:r>
-              <w:rPr>
-                <w:b/>
-                <w:bCs/>
-                <w:sz w:val="26"/>
-                <w:szCs w:val="26"/>
-              </w:rPr>
-              <w:t>${</w:t>
-            </w:r>
-            <w:proofErr w:type="spellStart"/>
-            <w:r>
-              <w:rPr>
-                <w:b/>
-                <w:bCs/>
-                <w:sz w:val="26"/>
-                <w:szCs w:val="26"/>
-              </w:rPr>
-              <w:t>equipment_</w:t>
-            </w:r>
-            <w:r>
-              <w:rPr>
-                <w:b/>
-                <w:bCs/>
-                <w:sz w:val="26"/>
-                <w:szCs w:val="26"/>
-              </w:rPr>
-              <w:t>number</w:t>
-            </w:r>
-            <w:proofErr w:type="spellEnd"/>
-            <w:r>
-              <w:rPr>
-                <w:b/>
-                <w:bCs/>
-                <w:sz w:val="26"/>
-                <w:szCs w:val="26"/>
-              </w:rPr>
-              <w:t>}</w:t>
-            </w:r>
-          </w:p>
-        </w:tc>
-        <w:tc>
-          <w:tcPr>
-            <w:tcW w:w="3026" w:type="dxa"/>
-          </w:tcPr>
-          <w:p>
-            <w:pPr>
-              <w:spacing w:after="0" w:line="240" w:lineRule="auto"/>
-              <w:jc w:val="center"/>
-              <w:rPr>
-                <w:b/>
-                <w:bCs/>
                 <w:sz w:val="20"/>
                 <w:szCs w:val="20"/>
-                <w:rtl/>
-              </w:rPr>
-            </w:pPr>
-            <w:r>
+              </w:rPr>
+            </w:pPr>
+            <w:r>
+              <w:rPr>
+                <w:b/>
+                <w:bCs/>
+                <w:sz w:val="28"/>
+                <w:szCs w:val="28"/>
+              </w:rPr>
+              <w:t>${</w:t>
+            </w:r>
+            <w:proofErr w:type="spellStart"/>
+            <w:r>
+              <w:rPr>
+                <w:b/>
+                <w:bCs/>
+                <w:sz w:val="28"/>
+                <w:szCs w:val="28"/>
+              </w:rPr>
+              <w:t>equipment_number</w:t>
+            </w:r>
+            <w:proofErr w:type="spellEnd"/>
+            <w:r>
+              <w:rPr>
+                <w:b/>
+                <w:bCs/>
+                <w:sz w:val="28"/>
+                <w:szCs w:val="28"/>
+              </w:rPr>
+              <w:t>}</w:t>
+            </w:r>
+          </w:p>
+        </w:tc>
+        <w:tc>
+          <w:tcPr>
+            <w:tcW w:w="3585" w:type="dxa"/>
+            <w:gridSpan w:val="2"/>
+            <w:tcBorders>
+              <w:left w:val="single" w:sz="8" w:space="0" w:color="auto"/>
+            </w:tcBorders>
+          </w:tcPr>
+          <w:p>
+            <w:pPr>
+              <w:spacing w:after="0" w:line="240" w:lineRule="auto"/>
+              <w:jc w:val="center"/>
               <w:rPr>
                 <w:b/>
                 <w:bCs/>
@@ -1309,51 +1316,60 @@
                 <w:szCs w:val="20"/>
                 <w:rtl/>
               </w:rPr>
-              <w:t>اسم سائق الشاحنه القلاب</w:t>
-            </w:r>
-          </w:p>
-          <w:p>
-            <w:pPr>
-              <w:spacing w:after="0" w:line="240" w:lineRule="auto"/>
-              <w:jc w:val="center"/>
+            </w:pPr>
+            <w:r>
               <w:rPr>
                 <w:b/>
                 <w:bCs/>
                 <w:sz w:val="20"/>
                 <w:szCs w:val="20"/>
-              </w:rPr>
-            </w:pPr>
-            <w:r>
+                <w:rtl/>
+              </w:rPr>
+              <w:t>اسم سائق الشاحنه القلاب</w:t>
+            </w:r>
+          </w:p>
+          <w:p>
+            <w:pPr>
+              <w:spacing w:after="0" w:line="240" w:lineRule="auto"/>
+              <w:jc w:val="center"/>
               <w:rPr>
                 <w:b/>
                 <w:bCs/>
                 <w:sz w:val="20"/>
                 <w:szCs w:val="20"/>
               </w:rPr>
-              <w:t xml:space="preserve"> Name Operator</w:t>
-            </w:r>
-          </w:p>
-          <w:p>
-            <w:pPr>
-              <w:spacing w:after="0" w:line="240" w:lineRule="auto"/>
-              <w:jc w:val="center"/>
+            </w:pPr>
+            <w:r>
               <w:rPr>
                 <w:b/>
                 <w:bCs/>
                 <w:sz w:val="20"/>
                 <w:szCs w:val="20"/>
               </w:rPr>
-            </w:pPr>
-          </w:p>
-          <w:p>
-            <w:pPr>
-              <w:spacing w:after="0" w:line="240" w:lineRule="auto"/>
-              <w:jc w:val="center"/>
-              <w:rPr>
-                <w:b/>
-                <w:bCs/>
-                <w:sz w:val="26"/>
-                <w:szCs w:val="26"/>
+              <w:t xml:space="preserve"> Name Operator</w:t>
+            </w:r>
+          </w:p>
+          <w:p>
+            <w:pPr>
+              <w:spacing w:after="0" w:line="240" w:lineRule="auto"/>
+              <w:jc w:val="center"/>
+              <w:rPr>
+                <w:b/>
+                <w:bCs/>
+                <w:sz w:val="20"/>
+                <w:szCs w:val="20"/>
+              </w:rPr>
+            </w:pPr>
+          </w:p>
+          <w:p>
+            <w:pPr>
+              <w:spacing w:after="0" w:line="240" w:lineRule="auto"/>
+              <w:jc w:val="center"/>
+              <w:rPr>
+                <w:b/>
+                <w:bCs/>
+                <w:sz w:val="20"/>
+                <w:szCs w:val="20"/>
               </w:rPr>
             </w:pPr>
             <w:r>
@@ -1370,22 +1386,22 @@
       </w:tr>
       <w:tr>
         <w:trPr>
-          <w:trHeight w:val="479"/>
+          <w:trHeight w:val="71"/>
         </w:trPr>
         <w:tc>
           <w:tcPr>
             <w:tcW w:w="11135" w:type="dxa"/>
-            <w:gridSpan w:val="8"/>
-          </w:tcPr>
-          <w:p>
-            <w:pPr>
-              <w:spacing w:after="0" w:line="240" w:lineRule="auto"/>
-              <w:jc w:val="center"/>
-              <w:rPr>
-                <w:b/>
-                <w:bCs/>
-                <w:sz w:val="18"/>
-                <w:szCs w:val="18"/>
+            <w:gridSpan w:val="9"/>
+          </w:tcPr>
+          <w:p>
+            <w:pPr>
+              <w:spacing w:after="0" w:line="240" w:lineRule="auto"/>
+              <w:jc w:val="center"/>
+              <w:rPr>
+                <w:b/>
+                <w:bCs/>
+                <w:sz w:val="16"/>
+                <w:szCs w:val="16"/>
                 <w:rtl/>
               </w:rPr>
             </w:pPr>
@@ -1394,8 +1410,8 @@
                 <w:rFonts w:hint="cs"/>
                 <w:b/>
                 <w:bCs/>
-                <w:sz w:val="18"/>
-                <w:szCs w:val="18"/>
+                <w:sz w:val="16"/>
+                <w:szCs w:val="16"/>
                 <w:rtl/>
               </w:rPr>
               <w:t>ضع علامة (</w:t>
@@ -1404,8 +1420,8 @@
               <w:rPr>
                 <w:b/>
                 <w:bCs/>
-                <w:sz w:val="18"/>
-                <w:szCs w:val="18"/>
+                <w:sz w:val="16"/>
+                <w:szCs w:val="16"/>
                 <w:rtl/>
               </w:rPr>
               <w:t>√</w:t>
@@ -1415,139 +1431,91 @@
                 <w:rFonts w:hint="cs"/>
                 <w:b/>
                 <w:bCs/>
-                <w:sz w:val="18"/>
-                <w:szCs w:val="18"/>
-                <w:rtl/>
-              </w:rPr>
-              <w:t xml:space="preserve">) </w:t>
+                <w:sz w:val="16"/>
+                <w:szCs w:val="16"/>
+                <w:rtl/>
+              </w:rPr>
+              <w:t>) اذا كانت نتيجة الفحص (نعم)، أو علامة (</w:t>
+            </w:r>
+            <w:r>
+              <w:rPr>
+                <w:b/>
+                <w:bCs/>
+                <w:sz w:val="16"/>
+                <w:szCs w:val="16"/>
+                <w:rtl/>
+              </w:rPr>
+              <w:t>×</w:t>
+            </w:r>
+            <w:r>
+              <w:rPr>
+                <w:rFonts w:hint="cs"/>
+                <w:b/>
+                <w:bCs/>
+                <w:sz w:val="16"/>
+                <w:szCs w:val="16"/>
+                <w:rtl/>
+              </w:rPr>
+              <w:t>) اذا كانت نتيجة الفحص (لا)</w:t>
+            </w:r>
+          </w:p>
+          <w:p>
+            <w:pPr>
+              <w:spacing w:after="0" w:line="240" w:lineRule="auto"/>
+              <w:jc w:val="center"/>
+              <w:rPr>
+                <w:b/>
+                <w:bCs/>
+                <w:sz w:val="16"/>
+                <w:szCs w:val="16"/>
+              </w:rPr>
+            </w:pPr>
+            <w:r>
+              <w:rPr>
+                <w:b/>
+                <w:bCs/>
+                <w:sz w:val="16"/>
+                <w:szCs w:val="16"/>
+              </w:rPr>
+              <w:t>mark (√) if Check is positive and (</w:t>
             </w:r>
             <w:proofErr w:type="gramStart"/>
             <w:r>
               <w:rPr>
+                <w:b/>
+                <w:bCs/>
+                <w:sz w:val="16"/>
+                <w:szCs w:val="16"/>
+              </w:rPr>
+              <w:t>×)</w:t>
+            </w:r>
+            <w:r>
+              <w:rPr>
                 <w:rFonts w:hint="cs"/>
                 <w:b/>
                 <w:bCs/>
-                <w:sz w:val="18"/>
-                <w:szCs w:val="18"/>
-                <w:rtl/>
-              </w:rPr>
-              <w:t>اذا</w:t>
+                <w:sz w:val="16"/>
+                <w:szCs w:val="16"/>
+                <w:rtl/>
+              </w:rPr>
+              <w:t xml:space="preserve"> </w:t>
+            </w:r>
+            <w:r>
+              <w:rPr>
+                <w:b/>
+                <w:bCs/>
+                <w:sz w:val="16"/>
+                <w:szCs w:val="16"/>
+              </w:rPr>
+              <w:t xml:space="preserve"> if</w:t>
             </w:r>
             <w:proofErr w:type="gramEnd"/>
             <w:r>
               <w:rPr>
-                <w:rFonts w:hint="cs"/>
-                <w:b/>
-                <w:bCs/>
-                <w:sz w:val="18"/>
-                <w:szCs w:val="18"/>
-                <w:rtl/>
-              </w:rPr>
-              <w:t xml:space="preserve"> كانت نتيجة الفحص (نعم)، أو علامة (</w:t>
-            </w:r>
-            <w:r>
-              <w:rPr>
-                <w:b/>
-                <w:bCs/>
-                <w:sz w:val="18"/>
-                <w:szCs w:val="18"/>
-                <w:rtl/>
-              </w:rPr>
-              <w:t>×</w:t>
-            </w:r>
-            <w:r>
-              <w:rPr>
-                <w:rFonts w:hint="cs"/>
-                <w:b/>
-                <w:bCs/>
-                <w:sz w:val="18"/>
-                <w:szCs w:val="18"/>
-                <w:rtl/>
-              </w:rPr>
-              <w:t xml:space="preserve">) </w:t>
-            </w:r>
-            <w:proofErr w:type="gramStart"/>
-            <w:r>
-              <w:rPr>
-                <w:rFonts w:hint="cs"/>
-                <w:b/>
-                <w:bCs/>
-                <w:sz w:val="18"/>
-                <w:szCs w:val="18"/>
-                <w:rtl/>
-              </w:rPr>
-              <w:t>اذا</w:t>
-            </w:r>
-            <w:proofErr w:type="gramEnd"/>
-            <w:r>
-              <w:rPr>
-                <w:rFonts w:hint="cs"/>
-                <w:b/>
-                <w:bCs/>
-                <w:sz w:val="18"/>
-                <w:szCs w:val="18"/>
-                <w:rtl/>
-              </w:rPr>
-              <w:t xml:space="preserve"> كانت نتيجة الفحص (لا)</w:t>
-            </w:r>
-          </w:p>
-          <w:p>
-            <w:pPr>
-              <w:spacing w:after="0" w:line="240" w:lineRule="auto"/>
-              <w:jc w:val="center"/>
-              <w:rPr>
-                <w:b/>
-                <w:bCs/>
-                <w:sz w:val="18"/>
-                <w:szCs w:val="18"/>
-              </w:rPr>
-            </w:pPr>
-            <w:r>
-              <w:rPr>
-                <w:b/>
-                <w:bCs/>
-                <w:sz w:val="18"/>
-                <w:szCs w:val="18"/>
-              </w:rPr>
-              <w:t>mark (√) if Check is positive and (</w:t>
-            </w:r>
-            <w:proofErr w:type="gramStart"/>
-            <w:r>
-              <w:rPr>
-                <w:b/>
-                <w:bCs/>
-                <w:sz w:val="18"/>
-                <w:szCs w:val="18"/>
-              </w:rPr>
-              <w:t>×)</w:t>
-            </w:r>
-            <w:r>
-              <w:rPr>
-                <w:rFonts w:hint="cs"/>
-                <w:b/>
-                <w:bCs/>
-                <w:sz w:val="18"/>
-                <w:szCs w:val="18"/>
-                <w:rtl/>
-              </w:rPr>
-              <w:t xml:space="preserve"> </w:t>
-            </w:r>
-            <w:r>
-              <w:rPr>
-                <w:b/>
-                <w:bCs/>
-                <w:sz w:val="18"/>
-                <w:szCs w:val="18"/>
-              </w:rPr>
-              <w:t xml:space="preserve"> if</w:t>
-            </w:r>
-            <w:proofErr w:type="gramEnd"/>
-            <w:r>
-              <w:rPr>
-                <w:b/>
-                <w:bCs/>
-                <w:sz w:val="18"/>
-                <w:szCs w:val="18"/>
+                <w:b/>
+                <w:bCs/>
+                <w:sz w:val="16"/>
+                <w:szCs w:val="16"/>
               </w:rPr>
               <w:t xml:space="preserve"> Check is negative</w:t>
             </w:r>
@@ -1824,6 +1792,7 @@
         <w:tc>
           <w:tcPr>
             <w:tcW w:w="1216" w:type="dxa"/>
+            <w:gridSpan w:val="2"/>
             <w:shd w:val="clear" w:color="auto" w:fill="D9D9D9" w:themeFill="background1" w:themeFillShade="D9"/>
             <w:vAlign w:val="center"/>
           </w:tcPr>
@@ -1955,7 +1924,7 @@
       </w:tr>
       <w:tr>
         <w:trPr>
-          <w:trHeight w:val="434"/>
+          <w:trHeight w:val="377"/>
         </w:trPr>
         <w:tc>
           <w:tcPr>
@@ -1968,28 +1937,26 @@
               <w:rPr>
                 <w:b/>
                 <w:bCs/>
-                <w:sz w:val="22"/>
-                <w:szCs w:val="22"/>
-              </w:rPr>
-            </w:pPr>
-            <w:r>
-              <w:rPr>
-                <w:rFonts w:ascii="Times New Roman"/>
-                <w:b/>
-                <w:bCs/>
-                <w:sz w:val="22"/>
-                <w:szCs w:val="22"/>
-              </w:rPr>
-              <w:t>${</w:t>
-            </w:r>
-            <w:proofErr w:type="spellStart"/>
-            <w:r>
-              <w:rPr>
-                <w:rFonts w:ascii="Times New Roman"/>
-                <w:b/>
-                <w:bCs/>
-                <w:sz w:val="22"/>
-                <w:szCs w:val="22"/>
+                <w:sz w:val="26"/>
+                <w:szCs w:val="26"/>
+              </w:rPr>
+            </w:pPr>
+            <w:r>
+              <w:rPr>
+                <w:rFonts w:ascii="Times New Roman"/>
+                <w:b/>
+                <w:bCs/>
+                <w:szCs w:val="28"/>
+              </w:rPr>
+              <w:t>${</w:t>
+            </w:r>
+            <w:proofErr w:type="spellStart"/>
+            <w:r>
+              <w:rPr>
+                <w:rFonts w:ascii="Times New Roman"/>
+                <w:b/>
+                <w:bCs/>
+                <w:szCs w:val="28"/>
               </w:rPr>
               <w:t>fri_date</w:t>
             </w:r>
@@ -1999,8 +1966,7 @@
                 <w:rFonts w:ascii="Times New Roman"/>
                 <w:b/>
                 <w:bCs/>
-                <w:sz w:val="22"/>
-                <w:szCs w:val="22"/>
+                <w:szCs w:val="28"/>
               </w:rPr>
               <w:t>}</w:t>
             </w:r>
@@ -2017,28 +1983,26 @@
               <w:rPr>
                 <w:b/>
                 <w:bCs/>
-                <w:sz w:val="22"/>
-                <w:szCs w:val="22"/>
-              </w:rPr>
-            </w:pPr>
-            <w:r>
-              <w:rPr>
-                <w:rFonts w:ascii="Times New Roman"/>
-                <w:b/>
-                <w:bCs/>
-                <w:sz w:val="22"/>
-                <w:szCs w:val="22"/>
-              </w:rPr>
-              <w:t>${</w:t>
-            </w:r>
-            <w:proofErr w:type="spellStart"/>
-            <w:r>
-              <w:rPr>
-                <w:rFonts w:ascii="Times New Roman"/>
-                <w:b/>
-                <w:bCs/>
-                <w:sz w:val="22"/>
-                <w:szCs w:val="22"/>
+                <w:sz w:val="26"/>
+                <w:szCs w:val="26"/>
+              </w:rPr>
+            </w:pPr>
+            <w:r>
+              <w:rPr>
+                <w:rFonts w:ascii="Times New Roman"/>
+                <w:b/>
+                <w:bCs/>
+                <w:szCs w:val="28"/>
+              </w:rPr>
+              <w:t>${</w:t>
+            </w:r>
+            <w:proofErr w:type="spellStart"/>
+            <w:r>
+              <w:rPr>
+                <w:rFonts w:ascii="Times New Roman"/>
+                <w:b/>
+                <w:bCs/>
+                <w:szCs w:val="28"/>
               </w:rPr>
               <w:t>thu_date</w:t>
             </w:r>
@@ -2048,8 +2012,7 @@
                 <w:rFonts w:ascii="Times New Roman"/>
                 <w:b/>
                 <w:bCs/>
-                <w:sz w:val="22"/>
-                <w:szCs w:val="22"/>
+                <w:szCs w:val="28"/>
               </w:rPr>
               <w:t>}</w:t>
             </w:r>
@@ -2061,32 +2024,31 @@
           </w:tcPr>
           <w:p>
             <w:pPr>
-              <w:spacing w:line="240" w:lineRule="auto"/>
-              <w:jc w:val="center"/>
-              <w:rPr>
-                <w:rFonts w:ascii="Times New Roman"/>
-                <w:sz w:val="22"/>
-                <w:szCs w:val="22"/>
-              </w:rPr>
-            </w:pPr>
-            <w:r>
-              <w:rPr>
-                <w:rFonts w:ascii="Times New Roman"/>
-                <w:b/>
-                <w:bCs/>
-                <w:sz w:val="22"/>
-                <w:szCs w:val="22"/>
-              </w:rPr>
-              <w:t>${</w:t>
-            </w:r>
-            <w:proofErr w:type="spellStart"/>
-            <w:r>
-              <w:rPr>
-                <w:rFonts w:ascii="Times New Roman"/>
-                <w:b/>
-                <w:bCs/>
-                <w:sz w:val="22"/>
-                <w:szCs w:val="22"/>
+              <w:spacing w:after="0" w:line="240" w:lineRule="auto"/>
+              <w:jc w:val="center"/>
+              <w:rPr>
+                <w:b/>
+                <w:bCs/>
+                <w:sz w:val="26"/>
+                <w:szCs w:val="26"/>
+              </w:rPr>
+            </w:pPr>
+            <w:r>
+              <w:rPr>
+                <w:rFonts w:ascii="Times New Roman"/>
+                <w:b/>
+                <w:bCs/>
+                <w:szCs w:val="28"/>
+              </w:rPr>
+              <w:t>${</w:t>
+            </w:r>
+            <w:proofErr w:type="spellStart"/>
+            <w:r>
+              <w:rPr>
+                <w:rFonts w:ascii="Times New Roman"/>
+                <w:b/>
+                <w:bCs/>
+                <w:szCs w:val="28"/>
               </w:rPr>
               <w:t>wed_date</w:t>
             </w:r>
@@ -2096,8 +2058,7 @@
                 <w:rFonts w:ascii="Times New Roman"/>
                 <w:b/>
                 <w:bCs/>
-                <w:sz w:val="22"/>
-                <w:szCs w:val="22"/>
+                <w:szCs w:val="28"/>
               </w:rPr>
               <w:t>}</w:t>
             </w:r>
@@ -2114,28 +2075,26 @@
               <w:rPr>
                 <w:b/>
                 <w:bCs/>
-                <w:sz w:val="22"/>
-                <w:szCs w:val="22"/>
-              </w:rPr>
-            </w:pPr>
-            <w:r>
-              <w:rPr>
-                <w:rFonts w:ascii="Times New Roman"/>
-                <w:b/>
-                <w:bCs/>
-                <w:sz w:val="22"/>
-                <w:szCs w:val="22"/>
-              </w:rPr>
-              <w:t>${</w:t>
-            </w:r>
-            <w:proofErr w:type="spellStart"/>
-            <w:r>
-              <w:rPr>
-                <w:rFonts w:ascii="Times New Roman"/>
-                <w:b/>
-                <w:bCs/>
-                <w:sz w:val="22"/>
-                <w:szCs w:val="22"/>
+                <w:sz w:val="26"/>
+                <w:szCs w:val="26"/>
+              </w:rPr>
+            </w:pPr>
+            <w:r>
+              <w:rPr>
+                <w:rFonts w:ascii="Times New Roman"/>
+                <w:b/>
+                <w:bCs/>
+                <w:szCs w:val="28"/>
+              </w:rPr>
+              <w:t>${</w:t>
+            </w:r>
+            <w:proofErr w:type="spellStart"/>
+            <w:r>
+              <w:rPr>
+                <w:rFonts w:ascii="Times New Roman"/>
+                <w:b/>
+                <w:bCs/>
+                <w:szCs w:val="28"/>
               </w:rPr>
               <w:t>tue_date</w:t>
             </w:r>
@@ -2145,8 +2104,7 @@
                 <w:rFonts w:ascii="Times New Roman"/>
                 <w:b/>
                 <w:bCs/>
-                <w:sz w:val="22"/>
-                <w:szCs w:val="22"/>
+                <w:szCs w:val="28"/>
               </w:rPr>
               <w:t>}</w:t>
             </w:r>
@@ -2163,28 +2121,26 @@
               <w:rPr>
                 <w:b/>
                 <w:bCs/>
-                <w:sz w:val="22"/>
-                <w:szCs w:val="22"/>
-              </w:rPr>
-            </w:pPr>
-            <w:r>
-              <w:rPr>
-                <w:rFonts w:ascii="Times New Roman"/>
-                <w:b/>
-                <w:bCs/>
-                <w:sz w:val="22"/>
-                <w:szCs w:val="22"/>
-              </w:rPr>
-              <w:t>${</w:t>
-            </w:r>
-            <w:proofErr w:type="spellStart"/>
-            <w:r>
-              <w:rPr>
-                <w:rFonts w:ascii="Times New Roman"/>
-                <w:b/>
-                <w:bCs/>
-                <w:sz w:val="22"/>
-                <w:szCs w:val="22"/>
+                <w:sz w:val="26"/>
+                <w:szCs w:val="26"/>
+              </w:rPr>
+            </w:pPr>
+            <w:r>
+              <w:rPr>
+                <w:rFonts w:ascii="Times New Roman"/>
+                <w:b/>
+                <w:bCs/>
+                <w:szCs w:val="28"/>
+              </w:rPr>
+              <w:t>${</w:t>
+            </w:r>
+            <w:proofErr w:type="spellStart"/>
+            <w:r>
+              <w:rPr>
+                <w:rFonts w:ascii="Times New Roman"/>
+                <w:b/>
+                <w:bCs/>
+                <w:szCs w:val="28"/>
               </w:rPr>
               <w:t>mon_date</w:t>
             </w:r>
@@ -2194,8 +2150,7 @@
                 <w:rFonts w:ascii="Times New Roman"/>
                 <w:b/>
                 <w:bCs/>
-                <w:sz w:val="22"/>
-                <w:szCs w:val="22"/>
+                <w:szCs w:val="28"/>
               </w:rPr>
               <w:t>}</w:t>
             </w:r>
@@ -2212,28 +2167,26 @@
               <w:rPr>
                 <w:b/>
                 <w:bCs/>
-                <w:sz w:val="22"/>
-                <w:szCs w:val="22"/>
-              </w:rPr>
-            </w:pPr>
-            <w:r>
-              <w:rPr>
-                <w:rFonts w:ascii="Times New Roman"/>
-                <w:b/>
-                <w:bCs/>
-                <w:sz w:val="22"/>
-                <w:szCs w:val="22"/>
-              </w:rPr>
-              <w:t>${</w:t>
-            </w:r>
-            <w:proofErr w:type="spellStart"/>
-            <w:r>
-              <w:rPr>
-                <w:rFonts w:ascii="Times New Roman"/>
-                <w:b/>
-                <w:bCs/>
-                <w:sz w:val="22"/>
-                <w:szCs w:val="22"/>
+                <w:sz w:val="26"/>
+                <w:szCs w:val="26"/>
+              </w:rPr>
+            </w:pPr>
+            <w:r>
+              <w:rPr>
+                <w:rFonts w:ascii="Times New Roman"/>
+                <w:b/>
+                <w:bCs/>
+                <w:szCs w:val="28"/>
+              </w:rPr>
+              <w:t>${</w:t>
+            </w:r>
+            <w:proofErr w:type="spellStart"/>
+            <w:r>
+              <w:rPr>
+                <w:rFonts w:ascii="Times New Roman"/>
+                <w:b/>
+                <w:bCs/>
+                <w:szCs w:val="28"/>
               </w:rPr>
               <w:t>sun_date</w:t>
             </w:r>
@@ -2243,8 +2196,7 @@
                 <w:rFonts w:ascii="Times New Roman"/>
                 <w:b/>
                 <w:bCs/>
-                <w:sz w:val="22"/>
-                <w:szCs w:val="22"/>
+                <w:szCs w:val="28"/>
               </w:rPr>
               <w:t>}</w:t>
             </w:r>
@@ -2253,36 +2205,35 @@
         <w:tc>
           <w:tcPr>
             <w:tcW w:w="1216" w:type="dxa"/>
-          </w:tcPr>
-          <w:p>
-            <w:pPr>
-              <w:spacing w:after="0" w:line="240" w:lineRule="auto"/>
-              <w:jc w:val="center"/>
-              <w:rPr>
-                <w:b/>
-                <w:bCs/>
-                <w:sz w:val="22"/>
-                <w:szCs w:val="22"/>
-              </w:rPr>
-            </w:pPr>
-            <w:r>
-              <w:rPr>
-                <w:rFonts w:ascii="Times New Roman"/>
-                <w:b/>
-                <w:bCs/>
-                <w:sz w:val="22"/>
-                <w:szCs w:val="22"/>
-              </w:rPr>
-              <w:t>${</w:t>
-            </w:r>
-            <w:proofErr w:type="spellStart"/>
-            <w:r>
-              <w:rPr>
-                <w:rFonts w:ascii="Times New Roman"/>
-                <w:b/>
-                <w:bCs/>
-                <w:sz w:val="22"/>
-                <w:szCs w:val="22"/>
+            <w:gridSpan w:val="2"/>
+          </w:tcPr>
+          <w:p>
+            <w:pPr>
+              <w:spacing w:after="0" w:line="240" w:lineRule="auto"/>
+              <w:jc w:val="center"/>
+              <w:rPr>
+                <w:b/>
+                <w:bCs/>
+                <w:sz w:val="26"/>
+                <w:szCs w:val="26"/>
+              </w:rPr>
+            </w:pPr>
+            <w:r>
+              <w:rPr>
+                <w:rFonts w:ascii="Times New Roman"/>
+                <w:b/>
+                <w:bCs/>
+                <w:szCs w:val="28"/>
+              </w:rPr>
+              <w:t>${</w:t>
+            </w:r>
+            <w:proofErr w:type="spellStart"/>
+            <w:r>
+              <w:rPr>
+                <w:rFonts w:ascii="Times New Roman"/>
+                <w:b/>
+                <w:bCs/>
+                <w:szCs w:val="28"/>
               </w:rPr>
               <w:t>sat_date</w:t>
             </w:r>
@@ -2292,8 +2243,7 @@
                 <w:rFonts w:ascii="Times New Roman"/>
                 <w:b/>
                 <w:bCs/>
-                <w:sz w:val="22"/>
-                <w:szCs w:val="22"/>
+                <w:szCs w:val="28"/>
               </w:rPr>
               <w:t>}</w:t>
             </w:r>
@@ -2327,8 +2277,6 @@
               <w:rPr>
                 <w:b/>
                 <w:bCs/>
-                <w:sz w:val="16"/>
-                <w:szCs w:val="16"/>
                 <w:shd w:val="clear" w:color="auto" w:fill="D9D9D9" w:themeFill="background1" w:themeFillShade="D9"/>
               </w:rPr>
               <w:t>Date</w:t>
@@ -2337,20 +2285,25 @@
               <w:rPr>
                 <w:b/>
                 <w:bCs/>
-                <w:sz w:val="16"/>
-                <w:szCs w:val="16"/>
                 <w:shd w:val="clear" w:color="auto" w:fill="D9D9D9" w:themeFill="background1" w:themeFillShade="D9"/>
                 <w:rtl/>
               </w:rPr>
-              <w:t xml:space="preserve"> التاريخ</w:t>
+              <w:t xml:space="preserve"> </w:t>
+            </w:r>
+            <w:r>
+              <w:rPr>
+                <w:b/>
+                <w:bCs/>
+                <w:shd w:val="clear" w:color="auto" w:fill="D9D9D9" w:themeFill="background1" w:themeFillShade="D9"/>
+                <w:rtl/>
+              </w:rPr>
+              <w:t>التاريخ</w:t>
             </w:r>
             <w:r>
               <w:rPr>
                 <w:rFonts w:hint="cs"/>
                 <w:b/>
                 <w:bCs/>
-                <w:sz w:val="16"/>
-                <w:szCs w:val="16"/>
                 <w:shd w:val="clear" w:color="auto" w:fill="D9D9D9" w:themeFill="background1" w:themeFillShade="D9"/>
                 <w:rtl/>
               </w:rPr>
@@ -2361,7 +2314,7 @@
       </w:tr>
       <w:tr>
         <w:trPr>
-          <w:trHeight w:val="497"/>
+          <w:trHeight w:val="107"/>
         </w:trPr>
         <w:tc>
           <w:tcPr>
@@ -2369,89 +2322,101 @@
           </w:tcPr>
           <w:p>
             <w:pPr>
-              <w:spacing w:line="240" w:lineRule="auto"/>
-              <w:jc w:val="center"/>
-              <w:rPr>
-                <w:rFonts w:ascii="Times New Roman"/>
-                <w:b/>
-                <w:bCs/>
-                <w:sz w:val="22"/>
-                <w:szCs w:val="22"/>
+              <w:spacing w:after="0"/>
+              <w:jc w:val="center"/>
+            </w:pPr>
+            <w:r>
+              <w:rPr>
+                <w:rFonts w:ascii="Times New Roman"/>
+                <w:b/>
+                <w:bCs/>
+                <w:szCs w:val="28"/>
                 <w:lang w:bidi="ar-EG"/>
               </w:rPr>
-            </w:pPr>
-            <w:r>
-              <w:rPr>
-                <w:rFonts w:ascii="Times New Roman"/>
-                <w:b/>
-                <w:bCs/>
-                <w:sz w:val="22"/>
-                <w:szCs w:val="22"/>
+              <w:t>${</w:t>
+            </w:r>
+            <w:proofErr w:type="spellStart"/>
+            <w:r>
+              <w:rPr>
+                <w:rFonts w:ascii="Times New Roman"/>
+                <w:b/>
+                <w:bCs/>
+                <w:szCs w:val="28"/>
                 <w:lang w:bidi="ar-EG"/>
               </w:rPr>
-              <w:t>${</w:t>
-            </w:r>
-            <w:proofErr w:type="spellStart"/>
-            <w:r>
-              <w:rPr>
-                <w:rFonts w:ascii="Times New Roman"/>
-                <w:b/>
-                <w:bCs/>
-                <w:sz w:val="22"/>
-                <w:szCs w:val="22"/>
+              <w:t>fri_daily</w:t>
+            </w:r>
+            <w:proofErr w:type="spellEnd"/>
+            <w:r>
+              <w:rPr>
+                <w:rFonts w:ascii="Times New Roman"/>
+                <w:b/>
+                <w:bCs/>
+                <w:szCs w:val="28"/>
                 <w:lang w:bidi="ar-EG"/>
               </w:rPr>
-              <w:t>fri_</w:t>
-            </w:r>
-            <w:r>
-              <w:rPr>
-                <w:rFonts w:ascii="Times New Roman"/>
-                <w:b/>
-                <w:bCs/>
-                <w:sz w:val="22"/>
-                <w:szCs w:val="22"/>
+              <w:t>}</w:t>
+            </w:r>
+          </w:p>
+        </w:tc>
+        <w:tc>
+          <w:tcPr>
+            <w:tcW w:w="1183" w:type="dxa"/>
+          </w:tcPr>
+          <w:p>
+            <w:pPr>
+              <w:spacing w:after="0"/>
+              <w:jc w:val="center"/>
+            </w:pPr>
+            <w:r>
+              <w:rPr>
+                <w:rFonts w:ascii="Times New Roman"/>
+                <w:b/>
+                <w:bCs/>
+                <w:szCs w:val="28"/>
                 <w:lang w:bidi="ar-EG"/>
               </w:rPr>
-              <w:t>daily</w:t>
-            </w:r>
-            <w:proofErr w:type="spellEnd"/>
-            <w:r>
-              <w:rPr>
-                <w:rFonts w:ascii="Times New Roman"/>
-                <w:b/>
-                <w:bCs/>
-                <w:sz w:val="22"/>
-                <w:szCs w:val="22"/>
+              <w:t>${</w:t>
+            </w:r>
+            <w:proofErr w:type="spellStart"/>
+            <w:r>
+              <w:rPr>
+                <w:rFonts w:ascii="Times New Roman"/>
+                <w:b/>
+                <w:bCs/>
+                <w:szCs w:val="28"/>
                 <w:lang w:bidi="ar-EG"/>
               </w:rPr>
-              <w:t>}</w:t>
-            </w:r>
-          </w:p>
-        </w:tc>
-        <w:tc>
-          <w:tcPr>
-            <w:tcW w:w="1183" w:type="dxa"/>
-          </w:tcPr>
-          <w:p>
-            <w:pPr>
-              <w:spacing w:line="240" w:lineRule="auto"/>
-              <w:jc w:val="center"/>
-              <w:rPr>
-                <w:rFonts w:ascii="Times New Roman"/>
-                <w:b/>
-                <w:bCs/>
-                <w:sz w:val="22"/>
-                <w:szCs w:val="22"/>
+              <w:t>thu_daily</w:t>
+            </w:r>
+            <w:proofErr w:type="spellEnd"/>
+            <w:r>
+              <w:rPr>
+                <w:rFonts w:ascii="Times New Roman"/>
+                <w:b/>
+                <w:bCs/>
+                <w:szCs w:val="28"/>
                 <w:lang w:bidi="ar-EG"/>
               </w:rPr>
-            </w:pPr>
-            <w:r>
-              <w:rPr>
-                <w:rFonts w:ascii="Times New Roman"/>
-                <w:b/>
-                <w:bCs/>
-                <w:sz w:val="22"/>
-                <w:szCs w:val="22"/>
+              <w:t>}</w:t>
+            </w:r>
+          </w:p>
+        </w:tc>
+        <w:tc>
+          <w:tcPr>
+            <w:tcW w:w="1110" w:type="dxa"/>
+          </w:tcPr>
+          <w:p>
+            <w:pPr>
+              <w:spacing w:after="0"/>
+              <w:jc w:val="center"/>
+            </w:pPr>
+            <w:r>
+              <w:rPr>
+                <w:rFonts w:ascii="Times New Roman"/>
+                <w:b/>
+                <w:bCs/>
+                <w:szCs w:val="28"/>
                 <w:lang w:bidi="ar-EG"/>
               </w:rPr>
               <w:t>${</w:t>
@@ -2462,96 +2427,104 @@
                 <w:rFonts w:ascii="Times New Roman"/>
                 <w:b/>
                 <w:bCs/>
-                <w:sz w:val="22"/>
-                <w:szCs w:val="22"/>
+                <w:szCs w:val="28"/>
                 <w:lang w:bidi="ar-EG"/>
               </w:rPr>
-              <w:t>thu_</w:t>
-            </w:r>
-            <w:r>
-              <w:rPr>
-                <w:rFonts w:ascii="Times New Roman"/>
-                <w:b/>
-                <w:bCs/>
-                <w:sz w:val="22"/>
-                <w:szCs w:val="22"/>
+              <w:t>wed_daily</w:t>
+            </w:r>
+            <w:proofErr w:type="spellEnd"/>
+            <w:r>
+              <w:rPr>
+                <w:rFonts w:ascii="Times New Roman"/>
+                <w:b/>
+                <w:bCs/>
+                <w:szCs w:val="28"/>
                 <w:lang w:bidi="ar-EG"/>
               </w:rPr>
-              <w:t>daily</w:t>
-            </w:r>
-            <w:proofErr w:type="spellEnd"/>
-            <w:r>
-              <w:rPr>
-                <w:rFonts w:ascii="Times New Roman"/>
-                <w:b/>
-                <w:bCs/>
-                <w:sz w:val="22"/>
-                <w:szCs w:val="22"/>
+              <w:t>}</w:t>
+            </w:r>
+          </w:p>
+        </w:tc>
+        <w:tc>
+          <w:tcPr>
+            <w:tcW w:w="1112" w:type="dxa"/>
+          </w:tcPr>
+          <w:p>
+            <w:pPr>
+              <w:spacing w:after="0"/>
+              <w:jc w:val="center"/>
+            </w:pPr>
+            <w:r>
+              <w:rPr>
+                <w:rFonts w:ascii="Times New Roman"/>
+                <w:b/>
+                <w:bCs/>
+                <w:szCs w:val="28"/>
                 <w:lang w:bidi="ar-EG"/>
               </w:rPr>
-              <w:t>}</w:t>
-            </w:r>
-          </w:p>
-        </w:tc>
-        <w:tc>
-          <w:tcPr>
-            <w:tcW w:w="1110" w:type="dxa"/>
-          </w:tcPr>
-          <w:p>
-            <w:pPr>
-              <w:spacing w:line="240" w:lineRule="auto"/>
-              <w:jc w:val="center"/>
-              <w:rPr>
-                <w:rFonts w:ascii="Times New Roman"/>
-                <w:b/>
-                <w:bCs/>
-                <w:sz w:val="22"/>
-                <w:szCs w:val="22"/>
+              <w:t>${</w:t>
+            </w:r>
+            <w:proofErr w:type="spellStart"/>
+            <w:r>
+              <w:rPr>
+                <w:rFonts w:ascii="Times New Roman"/>
+                <w:b/>
+                <w:bCs/>
+                <w:szCs w:val="28"/>
                 <w:lang w:bidi="ar-EG"/>
               </w:rPr>
-            </w:pPr>
-            <w:r>
-              <w:rPr>
-                <w:rFonts w:ascii="Times New Roman"/>
-                <w:b/>
-                <w:bCs/>
-                <w:sz w:val="22"/>
-                <w:szCs w:val="22"/>
+              <w:t>tue_daily</w:t>
+            </w:r>
+            <w:proofErr w:type="spellEnd"/>
+            <w:r>
+              <w:rPr>
+                <w:rFonts w:ascii="Times New Roman"/>
+                <w:b/>
+                <w:bCs/>
+                <w:szCs w:val="28"/>
                 <w:lang w:bidi="ar-EG"/>
               </w:rPr>
-              <w:t>${</w:t>
-            </w:r>
-            <w:proofErr w:type="spellStart"/>
-            <w:r>
-              <w:rPr>
-                <w:rFonts w:ascii="Times New Roman"/>
-                <w:b/>
-                <w:bCs/>
-                <w:sz w:val="22"/>
-                <w:szCs w:val="22"/>
+              <w:t>}</w:t>
+            </w:r>
+          </w:p>
+        </w:tc>
+        <w:tc>
+          <w:tcPr>
+            <w:tcW w:w="1065" w:type="dxa"/>
+          </w:tcPr>
+          <w:p>
+            <w:pPr>
+              <w:spacing w:after="0"/>
+              <w:jc w:val="center"/>
+            </w:pPr>
+            <w:r>
+              <w:rPr>
+                <w:rFonts w:ascii="Times New Roman"/>
+                <w:b/>
+                <w:bCs/>
+                <w:szCs w:val="28"/>
                 <w:lang w:bidi="ar-EG"/>
               </w:rPr>
-              <w:t>wed_</w:t>
-            </w:r>
-            <w:r>
-              <w:rPr>
-                <w:rFonts w:ascii="Times New Roman"/>
-                <w:b/>
-                <w:bCs/>
-                <w:sz w:val="22"/>
-                <w:szCs w:val="22"/>
+              <w:t>${</w:t>
+            </w:r>
+            <w:proofErr w:type="spellStart"/>
+            <w:r>
+              <w:rPr>
+                <w:rFonts w:ascii="Times New Roman"/>
+                <w:b/>
+                <w:bCs/>
+                <w:szCs w:val="28"/>
                 <w:lang w:bidi="ar-EG"/>
               </w:rPr>
-              <w:t>daily</w:t>
-            </w:r>
-            <w:proofErr w:type="spellEnd"/>
-            <w:r>
-              <w:rPr>
-                <w:rFonts w:ascii="Times New Roman"/>
-                <w:b/>
-                <w:bCs/>
-                <w:sz w:val="22"/>
-                <w:szCs w:val="22"/>
+              <w:t>mon_daily</w:t>
+            </w:r>
+            <w:proofErr w:type="spellEnd"/>
+            <w:r>
+              <w:rPr>
+                <w:rFonts w:ascii="Times New Roman"/>
+                <w:b/>
+                <w:bCs/>
+                <w:szCs w:val="28"/>
                 <w:lang w:bidi="ar-EG"/>
               </w:rPr>
               <w:t>}</w:t>
@@ -2560,258 +2533,85 @@
         </w:tc>
         <w:tc>
           <w:tcPr>
-            <w:tcW w:w="1112" w:type="dxa"/>
-          </w:tcPr>
-          <w:p>
-            <w:pPr>
-              <w:spacing w:line="240" w:lineRule="auto"/>
-              <w:jc w:val="center"/>
-              <w:rPr>
-                <w:rFonts w:ascii="Times New Roman"/>
-                <w:b/>
-                <w:bCs/>
-                <w:sz w:val="22"/>
-                <w:szCs w:val="22"/>
+            <w:tcW w:w="1126" w:type="dxa"/>
+          </w:tcPr>
+          <w:p>
+            <w:pPr>
+              <w:spacing w:after="0"/>
+              <w:jc w:val="center"/>
+            </w:pPr>
+            <w:r>
+              <w:rPr>
+                <w:rFonts w:ascii="Times New Roman"/>
+                <w:b/>
+                <w:bCs/>
+                <w:szCs w:val="28"/>
                 <w:lang w:bidi="ar-EG"/>
               </w:rPr>
-            </w:pPr>
-            <w:r>
-              <w:rPr>
-                <w:rFonts w:ascii="Times New Roman"/>
-                <w:b/>
-                <w:bCs/>
-                <w:sz w:val="22"/>
-                <w:szCs w:val="22"/>
+              <w:t>${</w:t>
+            </w:r>
+            <w:proofErr w:type="spellStart"/>
+            <w:r>
+              <w:rPr>
+                <w:rFonts w:ascii="Times New Roman"/>
+                <w:b/>
+                <w:bCs/>
+                <w:szCs w:val="28"/>
                 <w:lang w:bidi="ar-EG"/>
               </w:rPr>
-              <w:t>${</w:t>
-            </w:r>
-            <w:proofErr w:type="spellStart"/>
-            <w:r>
-              <w:rPr>
-                <w:rFonts w:ascii="Times New Roman"/>
-                <w:b/>
-                <w:bCs/>
-                <w:sz w:val="22"/>
-                <w:szCs w:val="22"/>
+              <w:t>sun_daily</w:t>
+            </w:r>
+            <w:proofErr w:type="spellEnd"/>
+            <w:r>
+              <w:rPr>
+                <w:rFonts w:ascii="Times New Roman"/>
+                <w:b/>
+                <w:bCs/>
+                <w:szCs w:val="28"/>
                 <w:lang w:bidi="ar-EG"/>
               </w:rPr>
-              <w:t>tue_</w:t>
-            </w:r>
-            <w:r>
-              <w:rPr>
-                <w:rFonts w:ascii="Times New Roman"/>
-                <w:b/>
-                <w:bCs/>
-                <w:sz w:val="22"/>
-                <w:szCs w:val="22"/>
+              <w:t>}</w:t>
+            </w:r>
+          </w:p>
+        </w:tc>
+        <w:tc>
+          <w:tcPr>
+            <w:tcW w:w="1216" w:type="dxa"/>
+            <w:gridSpan w:val="2"/>
+          </w:tcPr>
+          <w:p>
+            <w:pPr>
+              <w:spacing w:after="0"/>
+              <w:jc w:val="center"/>
+            </w:pPr>
+            <w:r>
+              <w:rPr>
+                <w:rFonts w:ascii="Times New Roman"/>
+                <w:b/>
+                <w:bCs/>
+                <w:szCs w:val="28"/>
                 <w:lang w:bidi="ar-EG"/>
               </w:rPr>
-              <w:t>daily</w:t>
-            </w:r>
-            <w:proofErr w:type="spellEnd"/>
-            <w:r>
-              <w:rPr>
-                <w:rFonts w:ascii="Times New Roman"/>
-                <w:b/>
-                <w:bCs/>
-                <w:sz w:val="22"/>
-                <w:szCs w:val="22"/>
+              <w:t>${</w:t>
+            </w:r>
+            <w:proofErr w:type="spellStart"/>
+            <w:r>
+              <w:rPr>
+                <w:rFonts w:ascii="Times New Roman"/>
+                <w:b/>
+                <w:bCs/>
+                <w:szCs w:val="28"/>
                 <w:lang w:bidi="ar-EG"/>
               </w:rPr>
-              <w:t>}</w:t>
-            </w:r>
-          </w:p>
-        </w:tc>
-        <w:tc>
-          <w:tcPr>
-            <w:tcW w:w="1065" w:type="dxa"/>
-          </w:tcPr>
-          <w:p>
-            <w:pPr>
-              <w:spacing w:line="240" w:lineRule="auto"/>
-              <w:jc w:val="center"/>
-              <w:rPr>
-                <w:rFonts w:ascii="Times New Roman"/>
-                <w:b/>
-                <w:bCs/>
-                <w:sz w:val="22"/>
-                <w:szCs w:val="22"/>
-                <w:lang w:bidi="ar-EG"/>
-              </w:rPr>
-            </w:pPr>
-            <w:r>
-              <w:rPr>
-                <w:rFonts w:ascii="Times New Roman"/>
-                <w:b/>
-                <w:bCs/>
-                <w:sz w:val="22"/>
-                <w:szCs w:val="22"/>
-                <w:lang w:bidi="ar-EG"/>
-              </w:rPr>
-              <w:t>${</w:t>
-            </w:r>
-            <w:proofErr w:type="spellStart"/>
-            <w:r>
-              <w:rPr>
-                <w:rFonts w:ascii="Times New Roman"/>
-                <w:b/>
-                <w:bCs/>
-                <w:sz w:val="22"/>
-                <w:szCs w:val="22"/>
-                <w:lang w:bidi="ar-EG"/>
-              </w:rPr>
-              <w:t>mon_</w:t>
-            </w:r>
-            <w:r>
-              <w:rPr>
-                <w:rFonts w:ascii="Times New Roman"/>
-                <w:b/>
-                <w:bCs/>
-                <w:sz w:val="22"/>
-                <w:szCs w:val="22"/>
-                <w:lang w:bidi="ar-EG"/>
-              </w:rPr>
-              <w:t>daily</w:t>
-            </w:r>
-            <w:proofErr w:type="spellEnd"/>
-            <w:r>
-              <w:rPr>
-                <w:rFonts w:ascii="Times New Roman"/>
-                <w:b/>
-                <w:bCs/>
-                <w:sz w:val="22"/>
-                <w:szCs w:val="22"/>
-                <w:lang w:bidi="ar-EG"/>
-              </w:rPr>
-              <w:t>}</w:t>
-            </w:r>
-          </w:p>
-        </w:tc>
-        <w:tc>
-          <w:tcPr>
-            <w:tcW w:w="1126" w:type="dxa"/>
-          </w:tcPr>
-          <w:p>
-            <w:pPr>
-              <w:spacing w:line="240" w:lineRule="auto"/>
-              <w:jc w:val="center"/>
-              <w:rPr>
-                <w:rFonts w:ascii="Times New Roman"/>
-                <w:b/>
-                <w:bCs/>
-                <w:sz w:val="22"/>
-                <w:szCs w:val="22"/>
-                <w:lang w:bidi="ar-EG"/>
-              </w:rPr>
-            </w:pPr>
-            <w:r>
-              <w:rPr>
-                <w:rFonts w:ascii="Times New Roman"/>
-                <w:b/>
-                <w:bCs/>
-                <w:sz w:val="22"/>
-                <w:szCs w:val="22"/>
-                <w:lang w:bidi="ar-EG"/>
-              </w:rPr>
-              <w:t>${</w:t>
-            </w:r>
-            <w:proofErr w:type="spellStart"/>
-            <w:r>
-              <w:rPr>
-                <w:rFonts w:ascii="Times New Roman"/>
-                <w:b/>
-                <w:bCs/>
-                <w:sz w:val="22"/>
-                <w:szCs w:val="22"/>
-                <w:lang w:bidi="ar-EG"/>
-              </w:rPr>
-              <w:t>sun_</w:t>
-            </w:r>
-            <w:r>
-              <w:rPr>
-                <w:rFonts w:ascii="Times New Roman"/>
-                <w:b/>
-                <w:bCs/>
-                <w:sz w:val="22"/>
-                <w:szCs w:val="22"/>
-                <w:lang w:bidi="ar-EG"/>
-              </w:rPr>
-              <w:t>daily</w:t>
-            </w:r>
-            <w:proofErr w:type="spellEnd"/>
-            <w:r>
-              <w:rPr>
-                <w:rFonts w:ascii="Times New Roman"/>
-                <w:b/>
-                <w:bCs/>
-                <w:sz w:val="22"/>
-                <w:szCs w:val="22"/>
-                <w:lang w:bidi="ar-EG"/>
-              </w:rPr>
-              <w:t>}</w:t>
-            </w:r>
-          </w:p>
-        </w:tc>
-        <w:tc>
-          <w:tcPr>
-            <w:tcW w:w="1216" w:type="dxa"/>
-          </w:tcPr>
-          <w:p>
-            <w:pPr>
-              <w:spacing w:line="240" w:lineRule="auto"/>
-              <w:jc w:val="center"/>
-              <w:rPr>
-                <w:rFonts w:ascii="Times New Roman"/>
-                <w:b/>
-                <w:bCs/>
-                <w:sz w:val="22"/>
-                <w:szCs w:val="22"/>
-                <w:lang w:bidi="ar-EG"/>
-              </w:rPr>
-            </w:pPr>
-            <w:r>
-              <w:rPr>
-                <w:rFonts w:ascii="Times New Roman"/>
-                <w:b/>
-                <w:bCs/>
-                <w:sz w:val="22"/>
-                <w:szCs w:val="22"/>
-                <w:lang w:bidi="ar-EG"/>
-              </w:rPr>
-              <w:t>${</w:t>
-            </w:r>
-            <w:proofErr w:type="spellStart"/>
-            <w:r>
-              <w:rPr>
-                <w:rFonts w:ascii="Times New Roman"/>
-                <w:b/>
-                <w:bCs/>
-                <w:sz w:val="22"/>
-                <w:szCs w:val="22"/>
-                <w:lang w:bidi="ar-EG"/>
-              </w:rPr>
-              <w:t>sat_</w:t>
-            </w:r>
-            <w:r>
-              <w:rPr>
-                <w:rFonts w:ascii="Times New Roman"/>
-                <w:b/>
-                <w:bCs/>
-                <w:sz w:val="22"/>
-                <w:szCs w:val="22"/>
-                <w:lang w:bidi="ar-EG"/>
-              </w:rPr>
-              <w:t>daily</w:t>
-            </w:r>
-            <w:proofErr w:type="spellEnd"/>
-            <w:r>
-              <w:rPr>
-                <w:rFonts w:ascii="Times New Roman"/>
-                <w:b/>
-                <w:bCs/>
-                <w:sz w:val="22"/>
-                <w:szCs w:val="22"/>
+              <w:t>sat_daily</w:t>
+            </w:r>
+            <w:proofErr w:type="spellEnd"/>
+            <w:r>
+              <w:rPr>
+                <w:rFonts w:ascii="Times New Roman"/>
+                <w:b/>
+                <w:bCs/>
+                <w:szCs w:val="28"/>
                 <w:lang w:bidi="ar-EG"/>
               </w:rPr>
               <w:t>}</w:t>
@@ -2831,17 +2631,17 @@
               <w:rPr>
                 <w:b/>
                 <w:bCs/>
-                <w:sz w:val="16"/>
-                <w:szCs w:val="16"/>
-                <w:rtl/>
-              </w:rPr>
-            </w:pPr>
-            <w:r>
-              <w:rPr>
-                <w:b/>
-                <w:bCs/>
-                <w:sz w:val="16"/>
-                <w:szCs w:val="16"/>
+                <w:sz w:val="18"/>
+                <w:szCs w:val="18"/>
+                <w:rtl/>
+              </w:rPr>
+            </w:pPr>
+            <w:r>
+              <w:rPr>
+                <w:b/>
+                <w:bCs/>
+                <w:sz w:val="18"/>
+                <w:szCs w:val="18"/>
                 <w:rtl/>
               </w:rPr>
               <w:t>نوع الفحص</w:t>
@@ -2852,16 +2652,16 @@
               <w:spacing w:after="0" w:line="240" w:lineRule="auto"/>
               <w:jc w:val="center"/>
               <w:rPr>
-                <w:sz w:val="16"/>
-                <w:szCs w:val="16"/>
-              </w:rPr>
-            </w:pPr>
-            <w:r>
-              <w:rPr>
-                <w:b/>
-                <w:bCs/>
-                <w:sz w:val="16"/>
-                <w:szCs w:val="16"/>
+                <w:sz w:val="18"/>
+                <w:szCs w:val="18"/>
+              </w:rPr>
+            </w:pPr>
+            <w:r>
+              <w:rPr>
+                <w:b/>
+                <w:bCs/>
+                <w:sz w:val="18"/>
+                <w:szCs w:val="18"/>
               </w:rPr>
               <w:t>Check Point</w:t>
             </w:r>
@@ -3073,6 +2873,7 @@
         <w:tc>
           <w:tcPr>
             <w:tcW w:w="1216" w:type="dxa"/>
+            <w:gridSpan w:val="2"/>
           </w:tcPr>
           <w:p>
             <w:r>
@@ -3116,17 +2917,17 @@
               <w:rPr>
                 <w:b/>
                 <w:bCs/>
-                <w:sz w:val="16"/>
-                <w:szCs w:val="16"/>
-                <w:rtl/>
-              </w:rPr>
-            </w:pPr>
-            <w:r>
-              <w:rPr>
-                <w:b/>
-                <w:bCs/>
-                <w:sz w:val="16"/>
-                <w:szCs w:val="16"/>
+                <w:sz w:val="18"/>
+                <w:szCs w:val="18"/>
+                <w:rtl/>
+              </w:rPr>
+            </w:pPr>
+            <w:r>
+              <w:rPr>
+                <w:b/>
+                <w:bCs/>
+                <w:sz w:val="18"/>
+                <w:szCs w:val="18"/>
                 <w:rtl/>
               </w:rPr>
               <w:t>فحص مستوى زيت المحرك</w:t>
@@ -3139,16 +2940,16 @@
               <w:rPr>
                 <w:b/>
                 <w:bCs/>
-                <w:sz w:val="16"/>
-                <w:szCs w:val="16"/>
-              </w:rPr>
-            </w:pPr>
-            <w:r>
-              <w:rPr>
-                <w:b/>
-                <w:bCs/>
-                <w:sz w:val="16"/>
-                <w:szCs w:val="16"/>
+                <w:sz w:val="18"/>
+                <w:szCs w:val="18"/>
+              </w:rPr>
+            </w:pPr>
+            <w:r>
+              <w:rPr>
+                <w:b/>
+                <w:bCs/>
+                <w:sz w:val="18"/>
+                <w:szCs w:val="18"/>
                 <w:rtl/>
               </w:rPr>
               <w:t xml:space="preserve"> </w:t>
@@ -3157,8 +2958,8 @@
               <w:rPr>
                 <w:b/>
                 <w:bCs/>
-                <w:sz w:val="16"/>
-                <w:szCs w:val="16"/>
+                <w:sz w:val="18"/>
+                <w:szCs w:val="18"/>
               </w:rPr>
               <w:t>Motor Oil Level</w:t>
             </w:r>
@@ -3166,8 +2967,8 @@
               <w:rPr>
                 <w:b/>
                 <w:bCs/>
-                <w:sz w:val="16"/>
-                <w:szCs w:val="16"/>
+                <w:sz w:val="18"/>
+                <w:szCs w:val="18"/>
                 <w:rtl/>
               </w:rPr>
               <w:t xml:space="preserve"> </w:t>
@@ -3380,6 +3181,7 @@
         <w:tc>
           <w:tcPr>
             <w:tcW w:w="1216" w:type="dxa"/>
+            <w:gridSpan w:val="2"/>
           </w:tcPr>
           <w:p>
             <w:r>
@@ -3423,17 +3225,17 @@
               <w:rPr>
                 <w:b/>
                 <w:bCs/>
-                <w:sz w:val="16"/>
-                <w:szCs w:val="16"/>
-                <w:rtl/>
-              </w:rPr>
-            </w:pPr>
-            <w:r>
-              <w:rPr>
-                <w:b/>
-                <w:bCs/>
-                <w:sz w:val="16"/>
-                <w:szCs w:val="16"/>
+                <w:sz w:val="18"/>
+                <w:szCs w:val="18"/>
+                <w:rtl/>
+              </w:rPr>
+            </w:pPr>
+            <w:r>
+              <w:rPr>
+                <w:b/>
+                <w:bCs/>
+                <w:sz w:val="18"/>
+                <w:szCs w:val="18"/>
                 <w:rtl/>
               </w:rPr>
               <w:t xml:space="preserve">فحص أجهزة التنبيه والتأكد من صلاحيتها </w:t>
@@ -3446,16 +3248,16 @@
               <w:rPr>
                 <w:b/>
                 <w:bCs/>
-                <w:sz w:val="16"/>
-                <w:szCs w:val="16"/>
-              </w:rPr>
-            </w:pPr>
-            <w:r>
-              <w:rPr>
-                <w:b/>
-                <w:bCs/>
-                <w:sz w:val="16"/>
-                <w:szCs w:val="16"/>
+                <w:sz w:val="18"/>
+                <w:szCs w:val="18"/>
+              </w:rPr>
+            </w:pPr>
+            <w:r>
+              <w:rPr>
+                <w:b/>
+                <w:bCs/>
+                <w:sz w:val="18"/>
+                <w:szCs w:val="18"/>
                 <w:rtl/>
               </w:rPr>
               <w:t xml:space="preserve"> </w:t>
@@ -3464,8 +3266,8 @@
               <w:rPr>
                 <w:b/>
                 <w:bCs/>
-                <w:sz w:val="16"/>
-                <w:szCs w:val="16"/>
+                <w:sz w:val="18"/>
+                <w:szCs w:val="18"/>
               </w:rPr>
               <w:t>Horn</w:t>
             </w:r>
@@ -3473,8 +3275,8 @@
               <w:rPr>
                 <w:b/>
                 <w:bCs/>
-                <w:sz w:val="16"/>
-                <w:szCs w:val="16"/>
+                <w:sz w:val="18"/>
+                <w:szCs w:val="18"/>
                 <w:rtl/>
               </w:rPr>
               <w:t xml:space="preserve"> &amp; </w:t>
@@ -3483,8 +3285,8 @@
               <w:rPr>
                 <w:b/>
                 <w:bCs/>
-                <w:sz w:val="16"/>
-                <w:szCs w:val="16"/>
+                <w:sz w:val="18"/>
+                <w:szCs w:val="18"/>
               </w:rPr>
               <w:t>Alarm system</w:t>
             </w:r>
@@ -3492,8 +3294,8 @@
               <w:rPr>
                 <w:b/>
                 <w:bCs/>
-                <w:sz w:val="16"/>
-                <w:szCs w:val="16"/>
+                <w:sz w:val="18"/>
+                <w:szCs w:val="18"/>
                 <w:rtl/>
               </w:rPr>
               <w:t xml:space="preserve"> </w:t>
@@ -3706,6 +3508,7 @@
         <w:tc>
           <w:tcPr>
             <w:tcW w:w="1216" w:type="dxa"/>
+            <w:gridSpan w:val="2"/>
           </w:tcPr>
           <w:p>
             <w:r>
@@ -3749,17 +3552,17 @@
               <w:rPr>
                 <w:b/>
                 <w:bCs/>
-                <w:sz w:val="16"/>
-                <w:szCs w:val="16"/>
-                <w:rtl/>
-              </w:rPr>
-            </w:pPr>
-            <w:r>
-              <w:rPr>
-                <w:b/>
-                <w:bCs/>
-                <w:sz w:val="16"/>
-                <w:szCs w:val="16"/>
+                <w:sz w:val="18"/>
+                <w:szCs w:val="18"/>
+                <w:rtl/>
+              </w:rPr>
+            </w:pPr>
+            <w:r>
+              <w:rPr>
+                <w:b/>
+                <w:bCs/>
+                <w:sz w:val="18"/>
+                <w:szCs w:val="18"/>
                 <w:rtl/>
               </w:rPr>
               <w:t>فحص الاطارات والتأكد من صلاحيتها</w:t>
@@ -3772,16 +3575,16 @@
               <w:rPr>
                 <w:b/>
                 <w:bCs/>
-                <w:sz w:val="16"/>
-                <w:szCs w:val="16"/>
-              </w:rPr>
-            </w:pPr>
-            <w:r>
-              <w:rPr>
-                <w:b/>
-                <w:bCs/>
-                <w:sz w:val="16"/>
-                <w:szCs w:val="16"/>
+                <w:sz w:val="18"/>
+                <w:szCs w:val="18"/>
+              </w:rPr>
+            </w:pPr>
+            <w:r>
+              <w:rPr>
+                <w:b/>
+                <w:bCs/>
+                <w:sz w:val="18"/>
+                <w:szCs w:val="18"/>
                 <w:rtl/>
               </w:rPr>
               <w:t xml:space="preserve"> </w:t>
@@ -3790,8 +3593,8 @@
               <w:rPr>
                 <w:b/>
                 <w:bCs/>
-                <w:sz w:val="16"/>
-                <w:szCs w:val="16"/>
+                <w:sz w:val="18"/>
+                <w:szCs w:val="18"/>
               </w:rPr>
               <w:t>Tires Condition</w:t>
             </w:r>
@@ -3799,8 +3602,8 @@
               <w:rPr>
                 <w:b/>
                 <w:bCs/>
-                <w:sz w:val="16"/>
-                <w:szCs w:val="16"/>
+                <w:sz w:val="18"/>
+                <w:szCs w:val="18"/>
                 <w:rtl/>
               </w:rPr>
               <w:t xml:space="preserve"> </w:t>
@@ -4013,6 +3816,7 @@
         <w:tc>
           <w:tcPr>
             <w:tcW w:w="1216" w:type="dxa"/>
+            <w:gridSpan w:val="2"/>
           </w:tcPr>
           <w:p>
             <w:r>
@@ -4056,17 +3860,17 @@
               <w:rPr>
                 <w:b/>
                 <w:bCs/>
-                <w:sz w:val="16"/>
-                <w:szCs w:val="16"/>
-                <w:rtl/>
-              </w:rPr>
-            </w:pPr>
-            <w:r>
-              <w:rPr>
-                <w:b/>
-                <w:bCs/>
-                <w:sz w:val="16"/>
-                <w:szCs w:val="16"/>
+                <w:sz w:val="18"/>
+                <w:szCs w:val="18"/>
+                <w:rtl/>
+              </w:rPr>
+            </w:pPr>
+            <w:r>
+              <w:rPr>
+                <w:b/>
+                <w:bCs/>
+                <w:sz w:val="18"/>
+                <w:szCs w:val="18"/>
                 <w:rtl/>
               </w:rPr>
               <w:t xml:space="preserve">التأكد من صلاحية الإطار الاحتياطي </w:t>
@@ -4079,16 +3883,16 @@
               <w:rPr>
                 <w:b/>
                 <w:bCs/>
-                <w:sz w:val="16"/>
-                <w:szCs w:val="16"/>
-              </w:rPr>
-            </w:pPr>
-            <w:r>
-              <w:rPr>
-                <w:b/>
-                <w:bCs/>
-                <w:sz w:val="16"/>
-                <w:szCs w:val="16"/>
+                <w:sz w:val="18"/>
+                <w:szCs w:val="18"/>
+              </w:rPr>
+            </w:pPr>
+            <w:r>
+              <w:rPr>
+                <w:b/>
+                <w:bCs/>
+                <w:sz w:val="18"/>
+                <w:szCs w:val="18"/>
                 <w:rtl/>
               </w:rPr>
               <w:t xml:space="preserve"> </w:t>
@@ -4097,8 +3901,8 @@
               <w:rPr>
                 <w:b/>
                 <w:bCs/>
-                <w:sz w:val="16"/>
-                <w:szCs w:val="16"/>
+                <w:sz w:val="18"/>
+                <w:szCs w:val="18"/>
               </w:rPr>
               <w:t>Spare Tire</w:t>
             </w:r>
@@ -4106,8 +3910,8 @@
               <w:rPr>
                 <w:b/>
                 <w:bCs/>
-                <w:sz w:val="16"/>
-                <w:szCs w:val="16"/>
+                <w:sz w:val="18"/>
+                <w:szCs w:val="18"/>
                 <w:rtl/>
               </w:rPr>
               <w:t xml:space="preserve"> </w:t>
@@ -4320,6 +4124,7 @@
         <w:tc>
           <w:tcPr>
             <w:tcW w:w="1216" w:type="dxa"/>
+            <w:gridSpan w:val="2"/>
           </w:tcPr>
           <w:p>
             <w:r>
@@ -4363,17 +4168,17 @@
               <w:rPr>
                 <w:b/>
                 <w:bCs/>
-                <w:sz w:val="16"/>
-                <w:szCs w:val="16"/>
-                <w:rtl/>
-              </w:rPr>
-            </w:pPr>
-            <w:r>
-              <w:rPr>
-                <w:b/>
-                <w:bCs/>
-                <w:sz w:val="16"/>
-                <w:szCs w:val="16"/>
+                <w:sz w:val="18"/>
+                <w:szCs w:val="18"/>
+                <w:rtl/>
+              </w:rPr>
+            </w:pPr>
+            <w:r>
+              <w:rPr>
+                <w:b/>
+                <w:bCs/>
+                <w:sz w:val="18"/>
+                <w:szCs w:val="18"/>
                 <w:rtl/>
               </w:rPr>
               <w:t xml:space="preserve">التأكد من عدم وجود أي تسريب </w:t>
@@ -4386,16 +4191,16 @@
               <w:rPr>
                 <w:b/>
                 <w:bCs/>
-                <w:sz w:val="16"/>
-                <w:szCs w:val="16"/>
-              </w:rPr>
-            </w:pPr>
-            <w:r>
-              <w:rPr>
-                <w:b/>
-                <w:bCs/>
-                <w:sz w:val="16"/>
-                <w:szCs w:val="16"/>
+                <w:sz w:val="18"/>
+                <w:szCs w:val="18"/>
+              </w:rPr>
+            </w:pPr>
+            <w:r>
+              <w:rPr>
+                <w:b/>
+                <w:bCs/>
+                <w:sz w:val="18"/>
+                <w:szCs w:val="18"/>
                 <w:rtl/>
               </w:rPr>
               <w:t xml:space="preserve"> </w:t>
@@ -4404,8 +4209,8 @@
               <w:rPr>
                 <w:b/>
                 <w:bCs/>
-                <w:sz w:val="16"/>
-                <w:szCs w:val="16"/>
+                <w:sz w:val="18"/>
+                <w:szCs w:val="18"/>
               </w:rPr>
               <w:t>Inspection all leak</w:t>
             </w:r>
@@ -4413,8 +4218,8 @@
               <w:rPr>
                 <w:b/>
                 <w:bCs/>
-                <w:sz w:val="16"/>
-                <w:szCs w:val="16"/>
+                <w:sz w:val="18"/>
+                <w:szCs w:val="18"/>
                 <w:rtl/>
               </w:rPr>
               <w:t xml:space="preserve"> </w:t>
@@ -4627,6 +4432,7 @@
         <w:tc>
           <w:tcPr>
             <w:tcW w:w="1216" w:type="dxa"/>
+            <w:gridSpan w:val="2"/>
           </w:tcPr>
           <w:p>
             <w:r>
@@ -4670,17 +4476,17 @@
               <w:rPr>
                 <w:b/>
                 <w:bCs/>
-                <w:sz w:val="16"/>
-                <w:szCs w:val="16"/>
-                <w:rtl/>
-              </w:rPr>
-            </w:pPr>
-            <w:r>
-              <w:rPr>
-                <w:b/>
-                <w:bCs/>
-                <w:sz w:val="16"/>
-                <w:szCs w:val="16"/>
+                <w:sz w:val="18"/>
+                <w:szCs w:val="18"/>
+                <w:rtl/>
+              </w:rPr>
+            </w:pPr>
+            <w:r>
+              <w:rPr>
+                <w:b/>
+                <w:bCs/>
+                <w:sz w:val="18"/>
+                <w:szCs w:val="18"/>
                 <w:rtl/>
               </w:rPr>
               <w:t>المرايا الزجاج والمساحات</w:t>
@@ -4693,16 +4499,16 @@
               <w:rPr>
                 <w:b/>
                 <w:bCs/>
-                <w:sz w:val="16"/>
-                <w:szCs w:val="16"/>
-              </w:rPr>
-            </w:pPr>
-            <w:r>
-              <w:rPr>
-                <w:b/>
-                <w:bCs/>
-                <w:sz w:val="16"/>
-                <w:szCs w:val="16"/>
+                <w:sz w:val="18"/>
+                <w:szCs w:val="18"/>
+              </w:rPr>
+            </w:pPr>
+            <w:r>
+              <w:rPr>
+                <w:b/>
+                <w:bCs/>
+                <w:sz w:val="18"/>
+                <w:szCs w:val="18"/>
               </w:rPr>
               <w:t>Cabinet 's glass</w:t>
             </w:r>
@@ -4710,8 +4516,8 @@
               <w:rPr>
                 <w:b/>
                 <w:bCs/>
-                <w:sz w:val="16"/>
-                <w:szCs w:val="16"/>
+                <w:sz w:val="18"/>
+                <w:szCs w:val="18"/>
                 <w:rtl/>
               </w:rPr>
               <w:t xml:space="preserve"> &amp; </w:t>
@@ -4720,8 +4526,8 @@
               <w:rPr>
                 <w:b/>
                 <w:bCs/>
-                <w:sz w:val="16"/>
-                <w:szCs w:val="16"/>
+                <w:sz w:val="18"/>
+                <w:szCs w:val="18"/>
               </w:rPr>
               <w:t>mirrors and wiper</w:t>
             </w:r>
@@ -4729,8 +4535,8 @@
               <w:rPr>
                 <w:b/>
                 <w:bCs/>
-                <w:sz w:val="16"/>
-                <w:szCs w:val="16"/>
+                <w:sz w:val="18"/>
+                <w:szCs w:val="18"/>
                 <w:rtl/>
               </w:rPr>
               <w:t xml:space="preserve"> </w:t>
@@ -4943,6 +4749,7 @@
         <w:tc>
           <w:tcPr>
             <w:tcW w:w="1216" w:type="dxa"/>
+            <w:gridSpan w:val="2"/>
           </w:tcPr>
           <w:p>
             <w:r>
@@ -4986,17 +4793,17 @@
               <w:rPr>
                 <w:b/>
                 <w:bCs/>
-                <w:sz w:val="16"/>
-                <w:szCs w:val="16"/>
-                <w:rtl/>
-              </w:rPr>
-            </w:pPr>
-            <w:r>
-              <w:rPr>
-                <w:b/>
-                <w:bCs/>
-                <w:sz w:val="16"/>
-                <w:szCs w:val="16"/>
+                <w:sz w:val="18"/>
+                <w:szCs w:val="18"/>
+                <w:rtl/>
+              </w:rPr>
+            </w:pPr>
+            <w:r>
+              <w:rPr>
+                <w:b/>
+                <w:bCs/>
+                <w:sz w:val="18"/>
+                <w:szCs w:val="18"/>
                 <w:rtl/>
               </w:rPr>
               <w:t xml:space="preserve">فحص الفرامل والتأكد من صلاحيتها </w:t>
@@ -5009,16 +4816,16 @@
               <w:rPr>
                 <w:b/>
                 <w:bCs/>
-                <w:sz w:val="16"/>
-                <w:szCs w:val="16"/>
-              </w:rPr>
-            </w:pPr>
-            <w:r>
-              <w:rPr>
-                <w:b/>
-                <w:bCs/>
-                <w:sz w:val="16"/>
-                <w:szCs w:val="16"/>
+                <w:sz w:val="18"/>
+                <w:szCs w:val="18"/>
+              </w:rPr>
+            </w:pPr>
+            <w:r>
+              <w:rPr>
+                <w:b/>
+                <w:bCs/>
+                <w:sz w:val="18"/>
+                <w:szCs w:val="18"/>
                 <w:rtl/>
               </w:rPr>
               <w:t xml:space="preserve"> </w:t>
@@ -5027,8 +4834,8 @@
               <w:rPr>
                 <w:b/>
                 <w:bCs/>
-                <w:sz w:val="16"/>
-                <w:szCs w:val="16"/>
+                <w:sz w:val="18"/>
+                <w:szCs w:val="18"/>
               </w:rPr>
               <w:t>Braking Check</w:t>
             </w:r>
@@ -5036,8 +4843,8 @@
               <w:rPr>
                 <w:b/>
                 <w:bCs/>
-                <w:sz w:val="16"/>
-                <w:szCs w:val="16"/>
+                <w:sz w:val="18"/>
+                <w:szCs w:val="18"/>
                 <w:rtl/>
               </w:rPr>
               <w:t xml:space="preserve"> </w:t>
@@ -5250,6 +5057,7 @@
         <w:tc>
           <w:tcPr>
             <w:tcW w:w="1216" w:type="dxa"/>
+            <w:gridSpan w:val="2"/>
           </w:tcPr>
           <w:p>
             <w:r>
@@ -5293,17 +5101,17 @@
               <w:rPr>
                 <w:b/>
                 <w:bCs/>
-                <w:sz w:val="16"/>
-                <w:szCs w:val="16"/>
-                <w:rtl/>
-              </w:rPr>
-            </w:pPr>
-            <w:r>
-              <w:rPr>
-                <w:b/>
-                <w:bCs/>
-                <w:sz w:val="16"/>
-                <w:szCs w:val="16"/>
+                <w:sz w:val="18"/>
+                <w:szCs w:val="18"/>
+                <w:rtl/>
+              </w:rPr>
+            </w:pPr>
+            <w:r>
+              <w:rPr>
+                <w:b/>
+                <w:bCs/>
+                <w:sz w:val="18"/>
+                <w:szCs w:val="18"/>
                 <w:rtl/>
               </w:rPr>
               <w:t xml:space="preserve">فحص الإضاءة والتأكد من صلاحيتها </w:t>
@@ -5316,16 +5124,16 @@
               <w:rPr>
                 <w:b/>
                 <w:bCs/>
-                <w:sz w:val="16"/>
-                <w:szCs w:val="16"/>
-              </w:rPr>
-            </w:pPr>
-            <w:r>
-              <w:rPr>
-                <w:b/>
-                <w:bCs/>
-                <w:sz w:val="16"/>
-                <w:szCs w:val="16"/>
+                <w:sz w:val="18"/>
+                <w:szCs w:val="18"/>
+              </w:rPr>
+            </w:pPr>
+            <w:r>
+              <w:rPr>
+                <w:b/>
+                <w:bCs/>
+                <w:sz w:val="18"/>
+                <w:szCs w:val="18"/>
               </w:rPr>
               <w:t>Light system</w:t>
             </w:r>
@@ -5333,8 +5141,8 @@
               <w:rPr>
                 <w:b/>
                 <w:bCs/>
-                <w:sz w:val="16"/>
-                <w:szCs w:val="16"/>
+                <w:sz w:val="18"/>
+                <w:szCs w:val="18"/>
                 <w:rtl/>
               </w:rPr>
               <w:t xml:space="preserve"> </w:t>
@@ -5547,6 +5355,7 @@
         <w:tc>
           <w:tcPr>
             <w:tcW w:w="1216" w:type="dxa"/>
+            <w:gridSpan w:val="2"/>
           </w:tcPr>
           <w:p>
             <w:r>
@@ -5590,17 +5399,17 @@
               <w:rPr>
                 <w:b/>
                 <w:bCs/>
-                <w:sz w:val="16"/>
-                <w:szCs w:val="16"/>
-                <w:rtl/>
-              </w:rPr>
-            </w:pPr>
-            <w:r>
-              <w:rPr>
-                <w:b/>
-                <w:bCs/>
-                <w:sz w:val="16"/>
-                <w:szCs w:val="16"/>
+                <w:sz w:val="18"/>
+                <w:szCs w:val="18"/>
+                <w:rtl/>
+              </w:rPr>
+            </w:pPr>
+            <w:r>
+              <w:rPr>
+                <w:b/>
+                <w:bCs/>
+                <w:sz w:val="18"/>
+                <w:szCs w:val="18"/>
                 <w:rtl/>
               </w:rPr>
               <w:t xml:space="preserve">حزام الأمان موجودة وبحاله جيده </w:t>
@@ -5613,16 +5422,16 @@
               <w:rPr>
                 <w:b/>
                 <w:bCs/>
-                <w:sz w:val="16"/>
-                <w:szCs w:val="16"/>
-              </w:rPr>
-            </w:pPr>
-            <w:r>
-              <w:rPr>
-                <w:b/>
-                <w:bCs/>
-                <w:sz w:val="16"/>
-                <w:szCs w:val="16"/>
+                <w:sz w:val="18"/>
+                <w:szCs w:val="18"/>
+              </w:rPr>
+            </w:pPr>
+            <w:r>
+              <w:rPr>
+                <w:b/>
+                <w:bCs/>
+                <w:sz w:val="18"/>
+                <w:szCs w:val="18"/>
               </w:rPr>
               <w:t>All Seat Belts Condition</w:t>
             </w:r>
@@ -5630,8 +5439,8 @@
               <w:rPr>
                 <w:b/>
                 <w:bCs/>
-                <w:sz w:val="16"/>
-                <w:szCs w:val="16"/>
+                <w:sz w:val="18"/>
+                <w:szCs w:val="18"/>
                 <w:rtl/>
               </w:rPr>
               <w:t xml:space="preserve"> </w:t>
@@ -5844,6 +5653,7 @@
         <w:tc>
           <w:tcPr>
             <w:tcW w:w="1216" w:type="dxa"/>
+            <w:gridSpan w:val="2"/>
           </w:tcPr>
           <w:p>
             <w:r>
@@ -5887,17 +5697,17 @@
               <w:rPr>
                 <w:b/>
                 <w:bCs/>
-                <w:sz w:val="16"/>
-                <w:szCs w:val="16"/>
-                <w:rtl/>
-              </w:rPr>
-            </w:pPr>
-            <w:r>
-              <w:rPr>
-                <w:b/>
-                <w:bCs/>
-                <w:sz w:val="16"/>
-                <w:szCs w:val="16"/>
+                <w:sz w:val="18"/>
+                <w:szCs w:val="18"/>
+                <w:rtl/>
+              </w:rPr>
+            </w:pPr>
+            <w:r>
+              <w:rPr>
+                <w:b/>
+                <w:bCs/>
+                <w:sz w:val="18"/>
+                <w:szCs w:val="18"/>
                 <w:rtl/>
               </w:rPr>
               <w:t xml:space="preserve">البطارية سليمة وأقطابها سليمة </w:t>
@@ -5910,16 +5720,16 @@
               <w:rPr>
                 <w:b/>
                 <w:bCs/>
-                <w:sz w:val="16"/>
-                <w:szCs w:val="16"/>
-              </w:rPr>
-            </w:pPr>
-            <w:r>
-              <w:rPr>
-                <w:b/>
-                <w:bCs/>
-                <w:sz w:val="16"/>
-                <w:szCs w:val="16"/>
+                <w:sz w:val="18"/>
+                <w:szCs w:val="18"/>
+              </w:rPr>
+            </w:pPr>
+            <w:r>
+              <w:rPr>
+                <w:b/>
+                <w:bCs/>
+                <w:sz w:val="18"/>
+                <w:szCs w:val="18"/>
               </w:rPr>
               <w:t>Battery Condition</w:t>
             </w:r>
@@ -5927,8 +5737,8 @@
               <w:rPr>
                 <w:b/>
                 <w:bCs/>
-                <w:sz w:val="16"/>
-                <w:szCs w:val="16"/>
+                <w:sz w:val="18"/>
+                <w:szCs w:val="18"/>
                 <w:rtl/>
               </w:rPr>
               <w:t xml:space="preserve"> </w:t>
@@ -6141,6 +5951,7 @@
         <w:tc>
           <w:tcPr>
             <w:tcW w:w="1216" w:type="dxa"/>
+            <w:gridSpan w:val="2"/>
           </w:tcPr>
           <w:p>
             <w:r>
@@ -6184,17 +5995,17 @@
               <w:rPr>
                 <w:b/>
                 <w:bCs/>
-                <w:sz w:val="16"/>
-                <w:szCs w:val="16"/>
-                <w:rtl/>
-              </w:rPr>
-            </w:pPr>
-            <w:r>
-              <w:rPr>
-                <w:b/>
-                <w:bCs/>
-                <w:sz w:val="16"/>
-                <w:szCs w:val="16"/>
+                <w:sz w:val="18"/>
+                <w:szCs w:val="18"/>
+                <w:rtl/>
+              </w:rPr>
+            </w:pPr>
+            <w:r>
+              <w:rPr>
+                <w:b/>
+                <w:bCs/>
+                <w:sz w:val="18"/>
+                <w:szCs w:val="18"/>
                 <w:rtl/>
               </w:rPr>
               <w:t xml:space="preserve">سلامة الصندوق المستخدم في النقل </w:t>
@@ -6207,26 +6018,25 @@
               <w:rPr>
                 <w:b/>
                 <w:bCs/>
-                <w:sz w:val="16"/>
-                <w:szCs w:val="16"/>
-              </w:rPr>
-            </w:pPr>
-            <w:r>
-              <w:rPr>
-                <w:b/>
-                <w:bCs/>
-                <w:sz w:val="16"/>
-                <w:szCs w:val="16"/>
-              </w:rPr>
-              <w:lastRenderedPageBreak/>
+                <w:sz w:val="18"/>
+                <w:szCs w:val="18"/>
+              </w:rPr>
+            </w:pPr>
+            <w:r>
+              <w:rPr>
+                <w:b/>
+                <w:bCs/>
+                <w:sz w:val="18"/>
+                <w:szCs w:val="18"/>
+              </w:rPr>
               <w:t>Dumper condition</w:t>
             </w:r>
             <w:r>
               <w:rPr>
                 <w:b/>
                 <w:bCs/>
-                <w:sz w:val="16"/>
-                <w:szCs w:val="16"/>
+                <w:sz w:val="18"/>
+                <w:szCs w:val="18"/>
                 <w:rtl/>
               </w:rPr>
               <w:t xml:space="preserve"> </w:t>
@@ -6249,7 +6059,6 @@
                 <w:sz w:val="6"/>
                 <w:szCs w:val="8"/>
               </w:rPr>
-              <w:lastRenderedPageBreak/>
               <w:t>${</w:t>
             </w:r>
             <w:proofErr w:type="spellStart"/>
@@ -6440,6 +6249,7 @@
         <w:tc>
           <w:tcPr>
             <w:tcW w:w="1216" w:type="dxa"/>
+            <w:gridSpan w:val="2"/>
           </w:tcPr>
           <w:p>
             <w:r>
@@ -6483,17 +6293,17 @@
               <w:rPr>
                 <w:b/>
                 <w:bCs/>
-                <w:sz w:val="16"/>
-                <w:szCs w:val="16"/>
-                <w:rtl/>
-              </w:rPr>
-            </w:pPr>
-            <w:r>
-              <w:rPr>
-                <w:b/>
-                <w:bCs/>
-                <w:sz w:val="16"/>
-                <w:szCs w:val="16"/>
+                <w:sz w:val="18"/>
+                <w:szCs w:val="18"/>
+                <w:rtl/>
+              </w:rPr>
+            </w:pPr>
+            <w:r>
+              <w:rPr>
+                <w:b/>
+                <w:bCs/>
+                <w:sz w:val="18"/>
+                <w:szCs w:val="18"/>
                 <w:rtl/>
               </w:rPr>
               <w:t xml:space="preserve">البستم الخاص بالصندوق القلاب </w:t>
@@ -6506,16 +6316,16 @@
               <w:rPr>
                 <w:b/>
                 <w:bCs/>
-                <w:sz w:val="16"/>
-                <w:szCs w:val="16"/>
-              </w:rPr>
-            </w:pPr>
-            <w:r>
-              <w:rPr>
-                <w:b/>
-                <w:bCs/>
-                <w:sz w:val="16"/>
-                <w:szCs w:val="16"/>
+                <w:sz w:val="18"/>
+                <w:szCs w:val="18"/>
+              </w:rPr>
+            </w:pPr>
+            <w:r>
+              <w:rPr>
+                <w:b/>
+                <w:bCs/>
+                <w:sz w:val="18"/>
+                <w:szCs w:val="18"/>
               </w:rPr>
               <w:t>Dumper box pistons</w:t>
             </w:r>
@@ -6523,8 +6333,8 @@
               <w:rPr>
                 <w:b/>
                 <w:bCs/>
-                <w:sz w:val="16"/>
-                <w:szCs w:val="16"/>
+                <w:sz w:val="18"/>
+                <w:szCs w:val="18"/>
                 <w:rtl/>
               </w:rPr>
               <w:t xml:space="preserve"> </w:t>
@@ -6737,6 +6547,7 @@
         <w:tc>
           <w:tcPr>
             <w:tcW w:w="1216" w:type="dxa"/>
+            <w:gridSpan w:val="2"/>
           </w:tcPr>
           <w:p>
             <w:r>
@@ -6780,17 +6591,17 @@
               <w:rPr>
                 <w:b/>
                 <w:bCs/>
-                <w:sz w:val="16"/>
-                <w:szCs w:val="16"/>
-                <w:rtl/>
-              </w:rPr>
-            </w:pPr>
-            <w:r>
-              <w:rPr>
-                <w:b/>
-                <w:bCs/>
-                <w:sz w:val="16"/>
-                <w:szCs w:val="16"/>
+                <w:sz w:val="18"/>
+                <w:szCs w:val="18"/>
+                <w:rtl/>
+              </w:rPr>
+            </w:pPr>
+            <w:r>
+              <w:rPr>
+                <w:b/>
+                <w:bCs/>
+                <w:sz w:val="18"/>
+                <w:szCs w:val="18"/>
                 <w:rtl/>
               </w:rPr>
               <w:t>يجب التأكد من رافعة الكوريك ومفتاح الربط والإطار الاحتياطي</w:t>
@@ -6803,16 +6614,16 @@
               <w:rPr>
                 <w:b/>
                 <w:bCs/>
-                <w:sz w:val="16"/>
-                <w:szCs w:val="16"/>
-              </w:rPr>
-            </w:pPr>
-            <w:r>
-              <w:rPr>
-                <w:b/>
-                <w:bCs/>
-                <w:sz w:val="16"/>
-                <w:szCs w:val="16"/>
+                <w:sz w:val="18"/>
+                <w:szCs w:val="18"/>
+              </w:rPr>
+            </w:pPr>
+            <w:r>
+              <w:rPr>
+                <w:b/>
+                <w:bCs/>
+                <w:sz w:val="18"/>
+                <w:szCs w:val="18"/>
                 <w:rtl/>
               </w:rPr>
               <w:t xml:space="preserve"> </w:t>
@@ -6821,8 +6632,8 @@
               <w:rPr>
                 <w:b/>
                 <w:bCs/>
-                <w:sz w:val="16"/>
-                <w:szCs w:val="16"/>
+                <w:sz w:val="18"/>
+                <w:szCs w:val="18"/>
               </w:rPr>
               <w:t>Check jack, wheel brace, spare tire</w:t>
             </w:r>
@@ -6830,8 +6641,8 @@
               <w:rPr>
                 <w:b/>
                 <w:bCs/>
-                <w:sz w:val="16"/>
-                <w:szCs w:val="16"/>
+                <w:sz w:val="18"/>
+                <w:szCs w:val="18"/>
                 <w:rtl/>
               </w:rPr>
               <w:t xml:space="preserve"> </w:t>
@@ -7044,6 +6855,7 @@
         <w:tc>
           <w:tcPr>
             <w:tcW w:w="1216" w:type="dxa"/>
+            <w:gridSpan w:val="2"/>
           </w:tcPr>
           <w:p>
             <w:r>
@@ -7087,17 +6899,17 @@
               <w:rPr>
                 <w:b/>
                 <w:bCs/>
-                <w:sz w:val="16"/>
-                <w:szCs w:val="16"/>
-                <w:rtl/>
-              </w:rPr>
-            </w:pPr>
-            <w:r>
-              <w:rPr>
-                <w:b/>
-                <w:bCs/>
-                <w:sz w:val="16"/>
-                <w:szCs w:val="16"/>
+                <w:sz w:val="18"/>
+                <w:szCs w:val="18"/>
+                <w:rtl/>
+              </w:rPr>
+            </w:pPr>
+            <w:r>
+              <w:rPr>
+                <w:b/>
+                <w:bCs/>
+                <w:sz w:val="18"/>
+                <w:szCs w:val="18"/>
                 <w:rtl/>
               </w:rPr>
               <w:t xml:space="preserve">التأكد من صلاحيه طفاية الحريق </w:t>
@@ -7110,16 +6922,16 @@
               <w:rPr>
                 <w:b/>
                 <w:bCs/>
-                <w:sz w:val="16"/>
-                <w:szCs w:val="16"/>
-              </w:rPr>
-            </w:pPr>
-            <w:r>
-              <w:rPr>
-                <w:b/>
-                <w:bCs/>
-                <w:sz w:val="16"/>
-                <w:szCs w:val="16"/>
+                <w:sz w:val="18"/>
+                <w:szCs w:val="18"/>
+              </w:rPr>
+            </w:pPr>
+            <w:r>
+              <w:rPr>
+                <w:b/>
+                <w:bCs/>
+                <w:sz w:val="18"/>
+                <w:szCs w:val="18"/>
                 <w:rtl/>
               </w:rPr>
               <w:t xml:space="preserve"> </w:t>
@@ -7128,8 +6940,8 @@
               <w:rPr>
                 <w:b/>
                 <w:bCs/>
-                <w:sz w:val="16"/>
-                <w:szCs w:val="16"/>
+                <w:sz w:val="18"/>
+                <w:szCs w:val="18"/>
               </w:rPr>
               <w:t>Fire Extinguisher Condition</w:t>
             </w:r>
@@ -7137,8 +6949,8 @@
               <w:rPr>
                 <w:b/>
                 <w:bCs/>
-                <w:sz w:val="16"/>
-                <w:szCs w:val="16"/>
+                <w:sz w:val="18"/>
+                <w:szCs w:val="18"/>
                 <w:rtl/>
               </w:rPr>
               <w:t xml:space="preserve"> </w:t>
@@ -7351,6 +7163,7 @@
         <w:tc>
           <w:tcPr>
             <w:tcW w:w="1216" w:type="dxa"/>
+            <w:gridSpan w:val="2"/>
           </w:tcPr>
           <w:p>
             <w:r>
@@ -7394,17 +7207,17 @@
               <w:rPr>
                 <w:b/>
                 <w:bCs/>
-                <w:sz w:val="16"/>
-                <w:szCs w:val="16"/>
-                <w:rtl/>
-              </w:rPr>
-            </w:pPr>
-            <w:r>
-              <w:rPr>
-                <w:b/>
-                <w:bCs/>
-                <w:sz w:val="16"/>
-                <w:szCs w:val="16"/>
+                <w:sz w:val="18"/>
+                <w:szCs w:val="18"/>
+                <w:rtl/>
+              </w:rPr>
+            </w:pPr>
+            <w:r>
+              <w:rPr>
+                <w:b/>
+                <w:bCs/>
+                <w:sz w:val="18"/>
+                <w:szCs w:val="18"/>
                 <w:rtl/>
               </w:rPr>
               <w:t xml:space="preserve">صندوق الإسعافات الأولية </w:t>
@@ -7417,16 +7230,16 @@
               <w:rPr>
                 <w:b/>
                 <w:bCs/>
-                <w:sz w:val="16"/>
-                <w:szCs w:val="16"/>
-              </w:rPr>
-            </w:pPr>
-            <w:r>
-              <w:rPr>
-                <w:b/>
-                <w:bCs/>
-                <w:sz w:val="16"/>
-                <w:szCs w:val="16"/>
+                <w:sz w:val="18"/>
+                <w:szCs w:val="18"/>
+              </w:rPr>
+            </w:pPr>
+            <w:r>
+              <w:rPr>
+                <w:b/>
+                <w:bCs/>
+                <w:sz w:val="18"/>
+                <w:szCs w:val="18"/>
               </w:rPr>
               <w:t>First aid kit</w:t>
             </w:r>
@@ -7434,8 +7247,8 @@
               <w:rPr>
                 <w:b/>
                 <w:bCs/>
-                <w:sz w:val="16"/>
-                <w:szCs w:val="16"/>
+                <w:sz w:val="18"/>
+                <w:szCs w:val="18"/>
                 <w:rtl/>
               </w:rPr>
               <w:t xml:space="preserve"> </w:t>
@@ -7450,51 +7263,234 @@
         <w:tc>
           <w:tcPr>
             <w:tcW w:w="1297" w:type="dxa"/>
-            <w:shd w:val="clear" w:color="auto" w:fill="FBE4D5" w:themeFill="accent2" w:themeFillTint="33"/>
-          </w:tcPr>
-          <w:p/>
+          </w:tcPr>
+          <w:p>
+            <w:r>
+              <w:rPr>
+                <w:rFonts w:ascii="Times New Roman"/>
+                <w:sz w:val="6"/>
+                <w:szCs w:val="8"/>
+              </w:rPr>
+              <w:t>${</w:t>
+            </w:r>
+            <w:proofErr w:type="spellStart"/>
+            <w:r>
+              <w:rPr>
+                <w:rFonts w:ascii="Times New Roman"/>
+                <w:sz w:val="6"/>
+                <w:szCs w:val="8"/>
+              </w:rPr>
+              <w:t>fri_check_column</w:t>
+            </w:r>
+            <w:proofErr w:type="spellEnd"/>
+            <w:r>
+              <w:rPr>
+                <w:rFonts w:ascii="Times New Roman"/>
+                <w:sz w:val="6"/>
+                <w:szCs w:val="8"/>
+              </w:rPr>
+              <w:t>}</w:t>
+            </w:r>
+          </w:p>
         </w:tc>
         <w:tc>
           <w:tcPr>
             <w:tcW w:w="1183" w:type="dxa"/>
-            <w:shd w:val="clear" w:color="auto" w:fill="FBE4D5" w:themeFill="accent2" w:themeFillTint="33"/>
-          </w:tcPr>
-          <w:p/>
+          </w:tcPr>
+          <w:p>
+            <w:r>
+              <w:rPr>
+                <w:rFonts w:ascii="Times New Roman"/>
+                <w:sz w:val="6"/>
+                <w:szCs w:val="8"/>
+              </w:rPr>
+              <w:t>${</w:t>
+            </w:r>
+            <w:proofErr w:type="spellStart"/>
+            <w:r>
+              <w:rPr>
+                <w:rFonts w:ascii="Times New Roman"/>
+                <w:sz w:val="6"/>
+                <w:szCs w:val="8"/>
+              </w:rPr>
+              <w:t>thu_check_column</w:t>
+            </w:r>
+            <w:proofErr w:type="spellEnd"/>
+            <w:r>
+              <w:rPr>
+                <w:rFonts w:ascii="Times New Roman"/>
+                <w:sz w:val="6"/>
+                <w:szCs w:val="8"/>
+              </w:rPr>
+              <w:t>}</w:t>
+            </w:r>
+          </w:p>
         </w:tc>
         <w:tc>
           <w:tcPr>
             <w:tcW w:w="1110" w:type="dxa"/>
-            <w:shd w:val="clear" w:color="auto" w:fill="FBE4D5" w:themeFill="accent2" w:themeFillTint="33"/>
-          </w:tcPr>
-          <w:p/>
+          </w:tcPr>
+          <w:p>
+            <w:r>
+              <w:rPr>
+                <w:rFonts w:ascii="Times New Roman"/>
+                <w:sz w:val="6"/>
+                <w:szCs w:val="8"/>
+              </w:rPr>
+              <w:t>${</w:t>
+            </w:r>
+            <w:proofErr w:type="spellStart"/>
+            <w:r>
+              <w:rPr>
+                <w:rFonts w:ascii="Times New Roman"/>
+                <w:sz w:val="6"/>
+                <w:szCs w:val="8"/>
+              </w:rPr>
+              <w:t>wed_check_column</w:t>
+            </w:r>
+            <w:proofErr w:type="spellEnd"/>
+            <w:r>
+              <w:rPr>
+                <w:rFonts w:ascii="Times New Roman"/>
+                <w:sz w:val="6"/>
+                <w:szCs w:val="8"/>
+              </w:rPr>
+              <w:t>}</w:t>
+            </w:r>
+          </w:p>
         </w:tc>
         <w:tc>
           <w:tcPr>
             <w:tcW w:w="1112" w:type="dxa"/>
-            <w:shd w:val="clear" w:color="auto" w:fill="FBE4D5" w:themeFill="accent2" w:themeFillTint="33"/>
-          </w:tcPr>
-          <w:p/>
+          </w:tcPr>
+          <w:p>
+            <w:r>
+              <w:rPr>
+                <w:rFonts w:ascii="Times New Roman"/>
+                <w:sz w:val="6"/>
+                <w:szCs w:val="8"/>
+              </w:rPr>
+              <w:t>${</w:t>
+            </w:r>
+            <w:proofErr w:type="spellStart"/>
+            <w:r>
+              <w:rPr>
+                <w:rFonts w:ascii="Times New Roman"/>
+                <w:sz w:val="6"/>
+                <w:szCs w:val="8"/>
+              </w:rPr>
+              <w:t>tue_check_column</w:t>
+            </w:r>
+            <w:proofErr w:type="spellEnd"/>
+            <w:r>
+              <w:rPr>
+                <w:rFonts w:ascii="Times New Roman"/>
+                <w:sz w:val="6"/>
+                <w:szCs w:val="8"/>
+              </w:rPr>
+              <w:t>}</w:t>
+            </w:r>
+          </w:p>
         </w:tc>
         <w:tc>
           <w:tcPr>
             <w:tcW w:w="1065" w:type="dxa"/>
-            <w:shd w:val="clear" w:color="auto" w:fill="FBE4D5" w:themeFill="accent2" w:themeFillTint="33"/>
-          </w:tcPr>
-          <w:p/>
+          </w:tcPr>
+          <w:p>
+            <w:r>
+              <w:rPr>
+                <w:rFonts w:ascii="Times New Roman"/>
+                <w:sz w:val="6"/>
+                <w:szCs w:val="8"/>
+              </w:rPr>
+              <w:t>${</w:t>
+            </w:r>
+            <w:proofErr w:type="spellStart"/>
+            <w:r>
+              <w:rPr>
+                <w:rFonts w:ascii="Times New Roman"/>
+                <w:sz w:val="6"/>
+                <w:szCs w:val="8"/>
+              </w:rPr>
+              <w:t>mon_check_column</w:t>
+            </w:r>
+            <w:proofErr w:type="spellEnd"/>
+            <w:r>
+              <w:rPr>
+                <w:rFonts w:ascii="Times New Roman"/>
+                <w:sz w:val="6"/>
+                <w:szCs w:val="8"/>
+              </w:rPr>
+              <w:t>}</w:t>
+            </w:r>
+          </w:p>
         </w:tc>
         <w:tc>
           <w:tcPr>
             <w:tcW w:w="1126" w:type="dxa"/>
-            <w:shd w:val="clear" w:color="auto" w:fill="FBE4D5" w:themeFill="accent2" w:themeFillTint="33"/>
-          </w:tcPr>
-          <w:p/>
+          </w:tcPr>
+          <w:p>
+            <w:r>
+              <w:rPr>
+                <w:rFonts w:ascii="Times New Roman"/>
+                <w:sz w:val="6"/>
+                <w:szCs w:val="8"/>
+              </w:rPr>
+              <w:t>${</w:t>
+            </w:r>
+            <w:proofErr w:type="spellStart"/>
+            <w:r>
+              <w:rPr>
+                <w:rFonts w:ascii="Times New Roman"/>
+                <w:sz w:val="6"/>
+                <w:szCs w:val="8"/>
+              </w:rPr>
+              <w:t>sun_check_column</w:t>
+            </w:r>
+            <w:proofErr w:type="spellEnd"/>
+            <w:r>
+              <w:rPr>
+                <w:rFonts w:ascii="Times New Roman"/>
+                <w:sz w:val="6"/>
+                <w:szCs w:val="8"/>
+              </w:rPr>
+              <w:t>}</w:t>
+            </w:r>
+          </w:p>
         </w:tc>
         <w:tc>
           <w:tcPr>
             <w:tcW w:w="1216" w:type="dxa"/>
-            <w:shd w:val="clear" w:color="auto" w:fill="FBE4D5" w:themeFill="accent2" w:themeFillTint="33"/>
-          </w:tcPr>
-          <w:p/>
+            <w:gridSpan w:val="2"/>
+          </w:tcPr>
+          <w:p>
+            <w:r>
+              <w:rPr>
+                <w:rFonts w:ascii="Times New Roman"/>
+                <w:sz w:val="6"/>
+                <w:szCs w:val="8"/>
+              </w:rPr>
+              <w:t>${</w:t>
+            </w:r>
+            <w:proofErr w:type="spellStart"/>
+            <w:r>
+              <w:rPr>
+                <w:rFonts w:ascii="Times New Roman"/>
+                <w:sz w:val="6"/>
+                <w:szCs w:val="8"/>
+              </w:rPr>
+              <w:t>sat_check_column</w:t>
+            </w:r>
+            <w:proofErr w:type="spellEnd"/>
+            <w:r>
+              <w:rPr>
+                <w:rFonts w:ascii="Times New Roman"/>
+                <w:sz w:val="6"/>
+                <w:szCs w:val="8"/>
+              </w:rPr>
+              <w:t>}</w:t>
+            </w:r>
+          </w:p>
         </w:tc>
         <w:tc>
           <w:tcPr>

</xml_diff>